<commit_message>
Made an quick edit to CW01 Submit Form.docx
</commit_message>
<xml_diff>
--- a/DOCUMENTATION/CW1 submit form.docx
+++ b/DOCUMENTATION/CW1 submit form.docx
@@ -71,12 +71,11 @@
             <w:cnfStyle w:val="001000000000" w:firstRow="0" w:lastRow="0" w:firstColumn="1" w:lastColumn="0" w:oddVBand="0" w:evenVBand="0" w:oddHBand="0" w:evenHBand="0" w:firstRowFirstColumn="0" w:firstRowLastColumn="0" w:lastRowFirstColumn="0" w:lastRowLastColumn="0"/>
             <w:tcW w:w="2547" w:type="dxa"/>
             <w:tcBorders>
-              <w:top w:val="single" w:color="999999" w:themeTint="" w:sz="4" w:space="0"/>
-              <w:left w:val="single" w:color="999999" w:themeTint="" w:sz="4" w:space="0"/>
-              <w:bottom w:val="single" w:color="999999" w:themeTint="" w:sz="4" w:space="0"/>
-              <w:right w:val="single" w:color="999999" w:themeTint="" w:sz="4" w:space="0"/>
+              <w:top w:val="single" w:sz="4" w:space="0" w:color="999999"/>
+              <w:left w:val="single" w:sz="4" w:space="0" w:color="999999"/>
+              <w:bottom w:val="single" w:sz="4" w:space="0" w:color="999999"/>
+              <w:right w:val="single" w:sz="4" w:space="0" w:color="999999"/>
             </w:tcBorders>
-            <w:tcMar/>
           </w:tcPr>
           <w:p>
             <w:r>
@@ -86,15 +85,13 @@
         </w:tc>
         <w:tc>
           <w:tcPr>
-            <w:cnfStyle w:val="000000000000" w:firstRow="0" w:lastRow="0" w:firstColumn="0" w:lastColumn="0" w:oddVBand="0" w:evenVBand="0" w:oddHBand="0" w:evenHBand="0" w:firstRowFirstColumn="0" w:firstRowLastColumn="0" w:lastRowFirstColumn="0" w:lastRowLastColumn="0"/>
             <w:tcW w:w="6469" w:type="dxa"/>
             <w:tcBorders>
-              <w:top w:val="single" w:color="999999" w:themeTint="" w:sz="4" w:space="0"/>
-              <w:left w:val="single" w:color="999999" w:themeTint="" w:sz="4" w:space="0"/>
-              <w:bottom w:val="single" w:color="999999" w:themeTint="" w:sz="4" w:space="0"/>
-              <w:right w:val="single" w:color="999999" w:themeTint="" w:sz="4" w:space="0"/>
+              <w:top w:val="single" w:sz="4" w:space="0" w:color="999999"/>
+              <w:left w:val="single" w:sz="4" w:space="0" w:color="999999"/>
+              <w:bottom w:val="single" w:sz="4" w:space="0" w:color="999999"/>
+              <w:right w:val="single" w:sz="4" w:space="0" w:color="999999"/>
             </w:tcBorders>
-            <w:tcMar/>
           </w:tcPr>
           <w:p>
             <w:pPr>
@@ -112,12 +109,11 @@
             <w:cnfStyle w:val="001000000000" w:firstRow="0" w:lastRow="0" w:firstColumn="1" w:lastColumn="0" w:oddVBand="0" w:evenVBand="0" w:oddHBand="0" w:evenHBand="0" w:firstRowFirstColumn="0" w:firstRowLastColumn="0" w:lastRowFirstColumn="0" w:lastRowLastColumn="0"/>
             <w:tcW w:w="2547" w:type="dxa"/>
             <w:tcBorders>
-              <w:top w:val="single" w:color="999999" w:themeTint="" w:sz="4" w:space="0"/>
-              <w:left w:val="single" w:color="999999" w:themeTint="" w:sz="4" w:space="0"/>
-              <w:bottom w:val="single" w:color="999999" w:themeTint="" w:sz="4" w:space="0"/>
-              <w:right w:val="single" w:color="999999" w:themeTint="" w:sz="4" w:space="0"/>
+              <w:top w:val="single" w:sz="4" w:space="0" w:color="999999"/>
+              <w:left w:val="single" w:sz="4" w:space="0" w:color="999999"/>
+              <w:bottom w:val="single" w:sz="4" w:space="0" w:color="999999"/>
+              <w:right w:val="single" w:sz="4" w:space="0" w:color="999999"/>
             </w:tcBorders>
-            <w:tcMar/>
           </w:tcPr>
           <w:p>
             <w:r>
@@ -127,15 +123,13 @@
         </w:tc>
         <w:tc>
           <w:tcPr>
-            <w:cnfStyle w:val="000000000000" w:firstRow="0" w:lastRow="0" w:firstColumn="0" w:lastColumn="0" w:oddVBand="0" w:evenVBand="0" w:oddHBand="0" w:evenHBand="0" w:firstRowFirstColumn="0" w:firstRowLastColumn="0" w:lastRowFirstColumn="0" w:lastRowLastColumn="0"/>
             <w:tcW w:w="6469" w:type="dxa"/>
             <w:tcBorders>
-              <w:top w:val="single" w:color="999999" w:themeTint="" w:sz="4" w:space="0"/>
-              <w:left w:val="single" w:color="999999" w:themeTint="" w:sz="4" w:space="0"/>
-              <w:bottom w:val="single" w:color="999999" w:themeTint="" w:sz="4" w:space="0"/>
-              <w:right w:val="single" w:color="999999" w:themeTint="" w:sz="4" w:space="0"/>
+              <w:top w:val="single" w:sz="4" w:space="0" w:color="999999"/>
+              <w:left w:val="single" w:sz="4" w:space="0" w:color="999999"/>
+              <w:bottom w:val="single" w:sz="4" w:space="0" w:color="999999"/>
+              <w:right w:val="single" w:sz="4" w:space="0" w:color="999999"/>
             </w:tcBorders>
-            <w:tcMar/>
           </w:tcPr>
           <w:p>
             <w:pPr>
@@ -158,12 +152,11 @@
             <w:cnfStyle w:val="001000000000" w:firstRow="0" w:lastRow="0" w:firstColumn="1" w:lastColumn="0" w:oddVBand="0" w:evenVBand="0" w:oddHBand="0" w:evenHBand="0" w:firstRowFirstColumn="0" w:firstRowLastColumn="0" w:lastRowFirstColumn="0" w:lastRowLastColumn="0"/>
             <w:tcW w:w="2547" w:type="dxa"/>
             <w:tcBorders>
-              <w:top w:val="single" w:color="999999" w:themeTint="" w:sz="4" w:space="0"/>
-              <w:left w:val="single" w:color="999999" w:themeTint="" w:sz="4" w:space="0"/>
-              <w:bottom w:val="single" w:color="999999" w:themeTint="" w:sz="4" w:space="0"/>
-              <w:right w:val="single" w:color="999999" w:themeTint="" w:sz="4" w:space="0"/>
+              <w:top w:val="single" w:sz="4" w:space="0" w:color="999999"/>
+              <w:left w:val="single" w:sz="4" w:space="0" w:color="999999"/>
+              <w:bottom w:val="single" w:sz="4" w:space="0" w:color="999999"/>
+              <w:right w:val="single" w:sz="4" w:space="0" w:color="999999"/>
             </w:tcBorders>
-            <w:tcMar/>
           </w:tcPr>
           <w:p>
             <w:r>
@@ -176,55 +169,31 @@
         </w:tc>
         <w:tc>
           <w:tcPr>
-            <w:cnfStyle w:val="000000000000" w:firstRow="0" w:lastRow="0" w:firstColumn="0" w:lastColumn="0" w:oddVBand="0" w:evenVBand="0" w:oddHBand="0" w:evenHBand="0" w:firstRowFirstColumn="0" w:firstRowLastColumn="0" w:lastRowFirstColumn="0" w:lastRowLastColumn="0"/>
             <w:tcW w:w="6469" w:type="dxa"/>
             <w:tcBorders>
-              <w:top w:val="single" w:color="999999" w:themeTint="" w:sz="4" w:space="0"/>
-              <w:left w:val="single" w:color="999999" w:themeTint="" w:sz="4" w:space="0"/>
-              <w:bottom w:val="single" w:color="999999" w:themeTint="" w:sz="4" w:space="0"/>
-              <w:right w:val="single" w:color="999999" w:themeTint="" w:sz="4" w:space="0"/>
+              <w:top w:val="single" w:sz="4" w:space="0" w:color="999999"/>
+              <w:left w:val="single" w:sz="4" w:space="0" w:color="999999"/>
+              <w:bottom w:val="single" w:sz="4" w:space="0" w:color="999999"/>
+              <w:right w:val="single" w:sz="4" w:space="0" w:color="999999"/>
             </w:tcBorders>
-            <w:tcMar/>
           </w:tcPr>
           <w:p>
             <w:pPr>
-              <w:pStyle w:val="Normal"/>
               <w:cnfStyle w:val="000000000000" w:firstRow="0" w:lastRow="0" w:firstColumn="0" w:lastColumn="0" w:oddVBand="0" w:evenVBand="0" w:oddHBand="0" w:evenHBand="0" w:firstRowFirstColumn="0" w:firstRowLastColumn="0" w:lastRowFirstColumn="0" w:lastRowLastColumn="0"/>
             </w:pPr>
-            <w:hyperlink r:id="R79bc8121dbf244ec">
+            <w:hyperlink r:id="rId7">
               <w:r>
                 <w:rPr>
                   <w:rStyle w:val="Hyperlink"/>
-                  <w:b w:val="0"/>
-                  <w:bCs w:val="0"/>
-                  <w:i w:val="0"/>
-                  <w:iCs w:val="0"/>
-                  <w:caps w:val="0"/>
-                  <w:smallCaps w:val="0"/>
-                  <w:strike w:val="0"/>
-                  <w:dstrike w:val="0"/>
-                  <w:noProof w:val="0"/>
                   <w:color w:val="478BE6"/>
                   <w:u w:val="none"/>
-                  <w:lang w:val="en-GB"/>
                 </w:rPr>
                 <w:t>https://www.uniqstudio.org/learn/</w:t>
               </w:r>
             </w:hyperlink>
             <w:r>
               <w:rPr>
-                <w:b w:val="0"/>
-                <w:bCs w:val="0"/>
-                <w:i w:val="0"/>
-                <w:iCs w:val="0"/>
-                <w:caps w:val="0"/>
-                <w:smallCaps w:val="0"/>
-                <w:strike w:val="0"/>
-                <w:dstrike w:val="0"/>
-                <w:noProof w:val="0"/>
                 <w:color w:val="478BE6"/>
-                <w:u w:val="none"/>
-                <w:lang w:val="en-GB"/>
               </w:rPr>
               <w:t xml:space="preserve"> </w:t>
             </w:r>
@@ -242,12 +211,11 @@
             <w:cnfStyle w:val="001000000000" w:firstRow="0" w:lastRow="0" w:firstColumn="1" w:lastColumn="0" w:oddVBand="0" w:evenVBand="0" w:oddHBand="0" w:evenHBand="0" w:firstRowFirstColumn="0" w:firstRowLastColumn="0" w:lastRowFirstColumn="0" w:lastRowLastColumn="0"/>
             <w:tcW w:w="2547" w:type="dxa"/>
             <w:tcBorders>
-              <w:top w:val="single" w:color="999999" w:themeTint="" w:sz="4" w:space="0"/>
-              <w:left w:val="single" w:color="999999" w:themeTint="" w:sz="4" w:space="0"/>
-              <w:bottom w:val="single" w:color="999999" w:themeTint="" w:sz="4" w:space="0"/>
-              <w:right w:val="single" w:color="999999" w:themeTint="" w:sz="4" w:space="0"/>
+              <w:top w:val="single" w:sz="4" w:space="0" w:color="999999"/>
+              <w:left w:val="single" w:sz="4" w:space="0" w:color="999999"/>
+              <w:bottom w:val="single" w:sz="4" w:space="0" w:color="999999"/>
+              <w:right w:val="single" w:sz="4" w:space="0" w:color="999999"/>
             </w:tcBorders>
-            <w:tcMar/>
           </w:tcPr>
           <w:p>
             <w:r>
@@ -260,21 +228,19 @@
         </w:tc>
         <w:tc>
           <w:tcPr>
-            <w:cnfStyle w:val="000000000000" w:firstRow="0" w:lastRow="0" w:firstColumn="0" w:lastColumn="0" w:oddVBand="0" w:evenVBand="0" w:oddHBand="0" w:evenHBand="0" w:firstRowFirstColumn="0" w:firstRowLastColumn="0" w:lastRowFirstColumn="0" w:lastRowLastColumn="0"/>
             <w:tcW w:w="6469" w:type="dxa"/>
             <w:tcBorders>
-              <w:top w:val="single" w:color="999999" w:themeTint="" w:sz="4" w:space="0"/>
-              <w:left w:val="single" w:color="999999" w:themeTint="" w:sz="4" w:space="0"/>
-              <w:bottom w:val="single" w:color="999999" w:themeTint="" w:sz="4" w:space="0"/>
-              <w:right w:val="single" w:color="999999" w:themeTint="" w:sz="4" w:space="0"/>
+              <w:top w:val="single" w:sz="4" w:space="0" w:color="999999"/>
+              <w:left w:val="single" w:sz="4" w:space="0" w:color="999999"/>
+              <w:bottom w:val="single" w:sz="4" w:space="0" w:color="999999"/>
+              <w:right w:val="single" w:sz="4" w:space="0" w:color="999999"/>
             </w:tcBorders>
-            <w:tcMar/>
           </w:tcPr>
           <w:p>
             <w:pPr>
               <w:cnfStyle w:val="000000000000" w:firstRow="0" w:lastRow="0" w:firstColumn="0" w:lastColumn="0" w:oddVBand="0" w:evenVBand="0" w:oddHBand="0" w:evenHBand="0" w:firstRowFirstColumn="0" w:firstRowLastColumn="0" w:lastRowFirstColumn="0" w:lastRowLastColumn="0"/>
             </w:pPr>
-            <w:hyperlink w:history="1" r:id="rId7">
+            <w:hyperlink r:id="rId8" w:history="1">
               <w:r>
                 <w:rPr>
                   <w:rStyle w:val="Hyperlink"/>
@@ -295,12 +261,11 @@
             <w:tcW w:w="9016" w:type="dxa"/>
             <w:gridSpan w:val="2"/>
             <w:tcBorders>
-              <w:top w:val="single" w:color="999999" w:themeTint="" w:sz="4" w:space="0"/>
-              <w:left w:val="single" w:color="999999" w:themeTint="" w:sz="4" w:space="0"/>
-              <w:bottom w:val="single" w:color="999999" w:themeTint="" w:sz="4" w:space="0"/>
-              <w:right w:val="single" w:color="999999" w:themeTint="" w:sz="4" w:space="0"/>
+              <w:top w:val="single" w:sz="4" w:space="0" w:color="999999"/>
+              <w:left w:val="single" w:sz="4" w:space="0" w:color="999999"/>
+              <w:bottom w:val="single" w:sz="4" w:space="0" w:color="999999"/>
+              <w:right w:val="single" w:sz="4" w:space="0" w:color="999999"/>
             </w:tcBorders>
-            <w:tcMar/>
           </w:tcPr>
           <w:p>
             <w:pPr>
@@ -318,12 +283,11 @@
             <w:cnfStyle w:val="001000000000" w:firstRow="0" w:lastRow="0" w:firstColumn="1" w:lastColumn="0" w:oddVBand="0" w:evenVBand="0" w:oddHBand="0" w:evenHBand="0" w:firstRowFirstColumn="0" w:firstRowLastColumn="0" w:lastRowFirstColumn="0" w:lastRowLastColumn="0"/>
             <w:tcW w:w="2547" w:type="dxa"/>
             <w:tcBorders>
-              <w:top w:val="single" w:color="999999" w:themeTint="" w:sz="4" w:space="0"/>
-              <w:left w:val="single" w:color="999999" w:themeTint="" w:sz="4" w:space="0"/>
-              <w:bottom w:val="single" w:color="999999" w:themeTint="" w:sz="4" w:space="0"/>
-              <w:right w:val="single" w:color="999999" w:themeTint="" w:sz="4" w:space="0"/>
+              <w:top w:val="single" w:sz="4" w:space="0" w:color="999999"/>
+              <w:left w:val="single" w:sz="4" w:space="0" w:color="999999"/>
+              <w:bottom w:val="single" w:sz="4" w:space="0" w:color="999999"/>
+              <w:right w:val="single" w:sz="4" w:space="0" w:color="999999"/>
             </w:tcBorders>
-            <w:tcMar/>
             <w:hideMark/>
           </w:tcPr>
           <w:p>
@@ -337,15 +301,13 @@
         </w:tc>
         <w:tc>
           <w:tcPr>
-            <w:cnfStyle w:val="000000000000" w:firstRow="0" w:lastRow="0" w:firstColumn="0" w:lastColumn="0" w:oddVBand="0" w:evenVBand="0" w:oddHBand="0" w:evenHBand="0" w:firstRowFirstColumn="0" w:firstRowLastColumn="0" w:lastRowFirstColumn="0" w:lastRowLastColumn="0"/>
             <w:tcW w:w="6469" w:type="dxa"/>
             <w:tcBorders>
-              <w:top w:val="single" w:color="999999" w:themeTint="" w:sz="4" w:space="0"/>
-              <w:left w:val="single" w:color="999999" w:themeTint="" w:sz="4" w:space="0"/>
-              <w:bottom w:val="single" w:color="999999" w:themeTint="" w:sz="4" w:space="0"/>
-              <w:right w:val="single" w:color="999999" w:themeTint="" w:sz="4" w:space="0"/>
+              <w:top w:val="single" w:sz="4" w:space="0" w:color="999999"/>
+              <w:left w:val="single" w:sz="4" w:space="0" w:color="999999"/>
+              <w:bottom w:val="single" w:sz="4" w:space="0" w:color="999999"/>
+              <w:right w:val="single" w:sz="4" w:space="0" w:color="999999"/>
             </w:tcBorders>
-            <w:tcMar/>
             <w:hideMark/>
           </w:tcPr>
           <w:p>
@@ -365,12 +327,11 @@
             <w:cnfStyle w:val="001000000000" w:firstRow="0" w:lastRow="0" w:firstColumn="1" w:lastColumn="0" w:oddVBand="0" w:evenVBand="0" w:oddHBand="0" w:evenHBand="0" w:firstRowFirstColumn="0" w:firstRowLastColumn="0" w:lastRowFirstColumn="0" w:lastRowLastColumn="0"/>
             <w:tcW w:w="2547" w:type="dxa"/>
             <w:tcBorders>
-              <w:top w:val="single" w:color="999999" w:themeTint="" w:sz="4" w:space="0"/>
-              <w:left w:val="single" w:color="999999" w:themeTint="" w:sz="4" w:space="0"/>
-              <w:bottom w:val="single" w:color="999999" w:themeTint="" w:sz="4" w:space="0"/>
-              <w:right w:val="single" w:color="999999" w:themeTint="" w:sz="4" w:space="0"/>
+              <w:top w:val="single" w:sz="4" w:space="0" w:color="999999"/>
+              <w:left w:val="single" w:sz="4" w:space="0" w:color="999999"/>
+              <w:bottom w:val="single" w:sz="4" w:space="0" w:color="999999"/>
+              <w:right w:val="single" w:sz="4" w:space="0" w:color="999999"/>
             </w:tcBorders>
-            <w:tcMar/>
             <w:hideMark/>
           </w:tcPr>
           <w:p>
@@ -387,15 +348,13 @@
         </w:tc>
         <w:tc>
           <w:tcPr>
-            <w:cnfStyle w:val="000000000000" w:firstRow="0" w:lastRow="0" w:firstColumn="0" w:lastColumn="0" w:oddVBand="0" w:evenVBand="0" w:oddHBand="0" w:evenHBand="0" w:firstRowFirstColumn="0" w:firstRowLastColumn="0" w:lastRowFirstColumn="0" w:lastRowLastColumn="0"/>
             <w:tcW w:w="6469" w:type="dxa"/>
             <w:tcBorders>
-              <w:top w:val="single" w:color="999999" w:themeTint="" w:sz="4" w:space="0"/>
-              <w:left w:val="single" w:color="999999" w:themeTint="" w:sz="4" w:space="0"/>
-              <w:bottom w:val="single" w:color="999999" w:themeTint="" w:sz="4" w:space="0"/>
-              <w:right w:val="single" w:color="999999" w:themeTint="" w:sz="4" w:space="0"/>
+              <w:top w:val="single" w:sz="4" w:space="0" w:color="999999"/>
+              <w:left w:val="single" w:sz="4" w:space="0" w:color="999999"/>
+              <w:bottom w:val="single" w:sz="4" w:space="0" w:color="999999"/>
+              <w:right w:val="single" w:sz="4" w:space="0" w:color="999999"/>
             </w:tcBorders>
-            <w:tcMar/>
             <w:hideMark/>
           </w:tcPr>
           <w:p>
@@ -415,12 +374,11 @@
             <w:cnfStyle w:val="001000000000" w:firstRow="0" w:lastRow="0" w:firstColumn="1" w:lastColumn="0" w:oddVBand="0" w:evenVBand="0" w:oddHBand="0" w:evenHBand="0" w:firstRowFirstColumn="0" w:firstRowLastColumn="0" w:lastRowFirstColumn="0" w:lastRowLastColumn="0"/>
             <w:tcW w:w="2547" w:type="dxa"/>
             <w:tcBorders>
-              <w:top w:val="single" w:color="999999" w:themeTint="" w:sz="4" w:space="0"/>
-              <w:left w:val="single" w:color="999999" w:themeTint="" w:sz="4" w:space="0"/>
-              <w:bottom w:val="single" w:color="999999" w:themeTint="" w:sz="4" w:space="0"/>
-              <w:right w:val="single" w:color="999999" w:themeTint="" w:sz="4" w:space="0"/>
+              <w:top w:val="single" w:sz="4" w:space="0" w:color="999999"/>
+              <w:left w:val="single" w:sz="4" w:space="0" w:color="999999"/>
+              <w:bottom w:val="single" w:sz="4" w:space="0" w:color="999999"/>
+              <w:right w:val="single" w:sz="4" w:space="0" w:color="999999"/>
             </w:tcBorders>
-            <w:tcMar/>
           </w:tcPr>
           <w:p>
             <w:pPr>
@@ -436,15 +394,13 @@
         </w:tc>
         <w:tc>
           <w:tcPr>
-            <w:cnfStyle w:val="000000000000" w:firstRow="0" w:lastRow="0" w:firstColumn="0" w:lastColumn="0" w:oddVBand="0" w:evenVBand="0" w:oddHBand="0" w:evenHBand="0" w:firstRowFirstColumn="0" w:firstRowLastColumn="0" w:lastRowFirstColumn="0" w:lastRowLastColumn="0"/>
             <w:tcW w:w="6469" w:type="dxa"/>
             <w:tcBorders>
-              <w:top w:val="single" w:color="999999" w:themeTint="" w:sz="4" w:space="0"/>
-              <w:left w:val="single" w:color="999999" w:themeTint="" w:sz="4" w:space="0"/>
-              <w:bottom w:val="single" w:color="999999" w:themeTint="" w:sz="4" w:space="0"/>
-              <w:right w:val="single" w:color="999999" w:themeTint="" w:sz="4" w:space="0"/>
+              <w:top w:val="single" w:sz="4" w:space="0" w:color="999999"/>
+              <w:left w:val="single" w:sz="4" w:space="0" w:color="999999"/>
+              <w:bottom w:val="single" w:sz="4" w:space="0" w:color="999999"/>
+              <w:right w:val="single" w:sz="4" w:space="0" w:color="999999"/>
             </w:tcBorders>
-            <w:tcMar/>
           </w:tcPr>
           <w:p>
             <w:pPr>
@@ -462,12 +418,11 @@
             <w:cnfStyle w:val="001000000000" w:firstRow="0" w:lastRow="0" w:firstColumn="1" w:lastColumn="0" w:oddVBand="0" w:evenVBand="0" w:oddHBand="0" w:evenHBand="0" w:firstRowFirstColumn="0" w:firstRowLastColumn="0" w:lastRowFirstColumn="0" w:lastRowLastColumn="0"/>
             <w:tcW w:w="2547" w:type="dxa"/>
             <w:tcBorders>
-              <w:top w:val="single" w:color="999999" w:themeTint="" w:sz="4" w:space="0"/>
-              <w:left w:val="single" w:color="999999" w:themeTint="" w:sz="4" w:space="0"/>
-              <w:bottom w:val="single" w:color="999999" w:themeTint="" w:sz="4" w:space="0"/>
-              <w:right w:val="single" w:color="999999" w:themeTint="" w:sz="4" w:space="0"/>
+              <w:top w:val="single" w:sz="4" w:space="0" w:color="999999"/>
+              <w:left w:val="single" w:sz="4" w:space="0" w:color="999999"/>
+              <w:bottom w:val="single" w:sz="4" w:space="0" w:color="999999"/>
+              <w:right w:val="single" w:sz="4" w:space="0" w:color="999999"/>
             </w:tcBorders>
-            <w:tcMar/>
           </w:tcPr>
           <w:p>
             <w:pPr>
@@ -486,15 +441,13 @@
         </w:tc>
         <w:tc>
           <w:tcPr>
-            <w:cnfStyle w:val="000000000000" w:firstRow="0" w:lastRow="0" w:firstColumn="0" w:lastColumn="0" w:oddVBand="0" w:evenVBand="0" w:oddHBand="0" w:evenHBand="0" w:firstRowFirstColumn="0" w:firstRowLastColumn="0" w:lastRowFirstColumn="0" w:lastRowLastColumn="0"/>
             <w:tcW w:w="6469" w:type="dxa"/>
             <w:tcBorders>
-              <w:top w:val="single" w:color="999999" w:themeTint="" w:sz="4" w:space="0"/>
-              <w:left w:val="single" w:color="999999" w:themeTint="" w:sz="4" w:space="0"/>
-              <w:bottom w:val="single" w:color="999999" w:themeTint="" w:sz="4" w:space="0"/>
-              <w:right w:val="single" w:color="999999" w:themeTint="" w:sz="4" w:space="0"/>
+              <w:top w:val="single" w:sz="4" w:space="0" w:color="999999"/>
+              <w:left w:val="single" w:sz="4" w:space="0" w:color="999999"/>
+              <w:bottom w:val="single" w:sz="4" w:space="0" w:color="999999"/>
+              <w:right w:val="single" w:sz="4" w:space="0" w:color="999999"/>
             </w:tcBorders>
-            <w:tcMar/>
           </w:tcPr>
           <w:p>
             <w:pPr>
@@ -512,12 +465,11 @@
             <w:cnfStyle w:val="001000000000" w:firstRow="0" w:lastRow="0" w:firstColumn="1" w:lastColumn="0" w:oddVBand="0" w:evenVBand="0" w:oddHBand="0" w:evenHBand="0" w:firstRowFirstColumn="0" w:firstRowLastColumn="0" w:lastRowFirstColumn="0" w:lastRowLastColumn="0"/>
             <w:tcW w:w="2547" w:type="dxa"/>
             <w:tcBorders>
-              <w:top w:val="single" w:color="999999" w:themeTint="" w:sz="4" w:space="0"/>
-              <w:left w:val="single" w:color="999999" w:themeTint="" w:sz="4" w:space="0"/>
-              <w:bottom w:val="single" w:color="999999" w:themeTint="" w:sz="4" w:space="0"/>
-              <w:right w:val="single" w:color="999999" w:themeTint="" w:sz="4" w:space="0"/>
+              <w:top w:val="single" w:sz="4" w:space="0" w:color="999999"/>
+              <w:left w:val="single" w:sz="4" w:space="0" w:color="999999"/>
+              <w:bottom w:val="single" w:sz="4" w:space="0" w:color="999999"/>
+              <w:right w:val="single" w:sz="4" w:space="0" w:color="999999"/>
             </w:tcBorders>
-            <w:tcMar/>
           </w:tcPr>
           <w:p>
             <w:pPr>
@@ -533,15 +485,13 @@
         </w:tc>
         <w:tc>
           <w:tcPr>
-            <w:cnfStyle w:val="000000000000" w:firstRow="0" w:lastRow="0" w:firstColumn="0" w:lastColumn="0" w:oddVBand="0" w:evenVBand="0" w:oddHBand="0" w:evenHBand="0" w:firstRowFirstColumn="0" w:firstRowLastColumn="0" w:lastRowFirstColumn="0" w:lastRowLastColumn="0"/>
             <w:tcW w:w="6469" w:type="dxa"/>
             <w:tcBorders>
-              <w:top w:val="single" w:color="999999" w:themeTint="" w:sz="4" w:space="0"/>
-              <w:left w:val="single" w:color="999999" w:themeTint="" w:sz="4" w:space="0"/>
-              <w:bottom w:val="single" w:color="999999" w:themeTint="" w:sz="4" w:space="0"/>
-              <w:right w:val="single" w:color="999999" w:themeTint="" w:sz="4" w:space="0"/>
+              <w:top w:val="single" w:sz="4" w:space="0" w:color="999999"/>
+              <w:left w:val="single" w:sz="4" w:space="0" w:color="999999"/>
+              <w:bottom w:val="single" w:sz="4" w:space="0" w:color="999999"/>
+              <w:right w:val="single" w:sz="4" w:space="0" w:color="999999"/>
             </w:tcBorders>
-            <w:tcMar/>
           </w:tcPr>
           <w:p>
             <w:pPr>
@@ -564,12 +514,11 @@
             <w:cnfStyle w:val="001000000000" w:firstRow="0" w:lastRow="0" w:firstColumn="1" w:lastColumn="0" w:oddVBand="0" w:evenVBand="0" w:oddHBand="0" w:evenHBand="0" w:firstRowFirstColumn="0" w:firstRowLastColumn="0" w:lastRowFirstColumn="0" w:lastRowLastColumn="0"/>
             <w:tcW w:w="2547" w:type="dxa"/>
             <w:tcBorders>
-              <w:top w:val="single" w:color="999999" w:themeTint="" w:sz="4" w:space="0"/>
-              <w:left w:val="single" w:color="999999" w:themeTint="" w:sz="4" w:space="0"/>
-              <w:bottom w:val="single" w:color="999999" w:themeTint="" w:sz="4" w:space="0"/>
-              <w:right w:val="single" w:color="999999" w:themeTint="" w:sz="4" w:space="0"/>
+              <w:top w:val="single" w:sz="4" w:space="0" w:color="999999"/>
+              <w:left w:val="single" w:sz="4" w:space="0" w:color="999999"/>
+              <w:bottom w:val="single" w:sz="4" w:space="0" w:color="999999"/>
+              <w:right w:val="single" w:sz="4" w:space="0" w:color="999999"/>
             </w:tcBorders>
-            <w:tcMar/>
           </w:tcPr>
           <w:p>
             <w:pPr>
@@ -588,15 +537,13 @@
         </w:tc>
         <w:tc>
           <w:tcPr>
-            <w:cnfStyle w:val="000000000000" w:firstRow="0" w:lastRow="0" w:firstColumn="0" w:lastColumn="0" w:oddVBand="0" w:evenVBand="0" w:oddHBand="0" w:evenHBand="0" w:firstRowFirstColumn="0" w:firstRowLastColumn="0" w:lastRowFirstColumn="0" w:lastRowLastColumn="0"/>
             <w:tcW w:w="6469" w:type="dxa"/>
             <w:tcBorders>
-              <w:top w:val="single" w:color="999999" w:themeTint="" w:sz="4" w:space="0"/>
-              <w:left w:val="single" w:color="999999" w:themeTint="" w:sz="4" w:space="0"/>
-              <w:bottom w:val="single" w:color="999999" w:themeTint="" w:sz="4" w:space="0"/>
-              <w:right w:val="single" w:color="999999" w:themeTint="" w:sz="4" w:space="0"/>
+              <w:top w:val="single" w:sz="4" w:space="0" w:color="999999"/>
+              <w:left w:val="single" w:sz="4" w:space="0" w:color="999999"/>
+              <w:bottom w:val="single" w:sz="4" w:space="0" w:color="999999"/>
+              <w:right w:val="single" w:sz="4" w:space="0" w:color="999999"/>
             </w:tcBorders>
-            <w:tcMar/>
           </w:tcPr>
           <w:p>
             <w:pPr>
@@ -617,12 +564,11 @@
             <w:cnfStyle w:val="001000000000" w:firstRow="0" w:lastRow="0" w:firstColumn="1" w:lastColumn="0" w:oddVBand="0" w:evenVBand="0" w:oddHBand="0" w:evenHBand="0" w:firstRowFirstColumn="0" w:firstRowLastColumn="0" w:lastRowFirstColumn="0" w:lastRowLastColumn="0"/>
             <w:tcW w:w="2547" w:type="dxa"/>
             <w:tcBorders>
-              <w:top w:val="single" w:color="999999" w:themeTint="" w:sz="4" w:space="0"/>
-              <w:left w:val="single" w:color="999999" w:themeTint="" w:sz="4" w:space="0"/>
-              <w:bottom w:val="single" w:color="999999" w:themeTint="" w:sz="4" w:space="0"/>
-              <w:right w:val="single" w:color="999999" w:themeTint="" w:sz="4" w:space="0"/>
+              <w:top w:val="single" w:sz="4" w:space="0" w:color="999999"/>
+              <w:left w:val="single" w:sz="4" w:space="0" w:color="999999"/>
+              <w:bottom w:val="single" w:sz="4" w:space="0" w:color="999999"/>
+              <w:right w:val="single" w:sz="4" w:space="0" w:color="999999"/>
             </w:tcBorders>
-            <w:tcMar/>
             <w:hideMark/>
           </w:tcPr>
           <w:p>
@@ -636,15 +582,13 @@
         </w:tc>
         <w:tc>
           <w:tcPr>
-            <w:cnfStyle w:val="000000000000" w:firstRow="0" w:lastRow="0" w:firstColumn="0" w:lastColumn="0" w:oddVBand="0" w:evenVBand="0" w:oddHBand="0" w:evenHBand="0" w:firstRowFirstColumn="0" w:firstRowLastColumn="0" w:lastRowFirstColumn="0" w:lastRowLastColumn="0"/>
             <w:tcW w:w="6469" w:type="dxa"/>
             <w:tcBorders>
-              <w:top w:val="single" w:color="999999" w:themeTint="" w:sz="4" w:space="0"/>
-              <w:left w:val="single" w:color="999999" w:themeTint="" w:sz="4" w:space="0"/>
-              <w:bottom w:val="single" w:color="999999" w:themeTint="" w:sz="4" w:space="0"/>
-              <w:right w:val="single" w:color="999999" w:themeTint="" w:sz="4" w:space="0"/>
+              <w:top w:val="single" w:sz="4" w:space="0" w:color="999999"/>
+              <w:left w:val="single" w:sz="4" w:space="0" w:color="999999"/>
+              <w:bottom w:val="single" w:sz="4" w:space="0" w:color="999999"/>
+              <w:right w:val="single" w:sz="4" w:space="0" w:color="999999"/>
             </w:tcBorders>
-            <w:tcMar/>
             <w:hideMark/>
           </w:tcPr>
           <w:p>
@@ -664,12 +608,11 @@
             <w:cnfStyle w:val="001000000000" w:firstRow="0" w:lastRow="0" w:firstColumn="1" w:lastColumn="0" w:oddVBand="0" w:evenVBand="0" w:oddHBand="0" w:evenHBand="0" w:firstRowFirstColumn="0" w:firstRowLastColumn="0" w:lastRowFirstColumn="0" w:lastRowLastColumn="0"/>
             <w:tcW w:w="2547" w:type="dxa"/>
             <w:tcBorders>
-              <w:top w:val="single" w:color="999999" w:themeTint="" w:sz="4" w:space="0"/>
-              <w:left w:val="single" w:color="999999" w:themeTint="" w:sz="4" w:space="0"/>
-              <w:bottom w:val="single" w:color="999999" w:themeTint="" w:sz="4" w:space="0"/>
-              <w:right w:val="single" w:color="999999" w:themeTint="" w:sz="4" w:space="0"/>
+              <w:top w:val="single" w:sz="4" w:space="0" w:color="999999"/>
+              <w:left w:val="single" w:sz="4" w:space="0" w:color="999999"/>
+              <w:bottom w:val="single" w:sz="4" w:space="0" w:color="999999"/>
+              <w:right w:val="single" w:sz="4" w:space="0" w:color="999999"/>
             </w:tcBorders>
-            <w:tcMar/>
           </w:tcPr>
           <w:p>
             <w:pPr>
@@ -688,15 +631,13 @@
         </w:tc>
         <w:tc>
           <w:tcPr>
-            <w:cnfStyle w:val="000000000000" w:firstRow="0" w:lastRow="0" w:firstColumn="0" w:lastColumn="0" w:oddVBand="0" w:evenVBand="0" w:oddHBand="0" w:evenHBand="0" w:firstRowFirstColumn="0" w:firstRowLastColumn="0" w:lastRowFirstColumn="0" w:lastRowLastColumn="0"/>
             <w:tcW w:w="6469" w:type="dxa"/>
             <w:tcBorders>
-              <w:top w:val="single" w:color="999999" w:themeTint="" w:sz="4" w:space="0"/>
-              <w:left w:val="single" w:color="999999" w:themeTint="" w:sz="4" w:space="0"/>
-              <w:bottom w:val="single" w:color="999999" w:themeTint="" w:sz="4" w:space="0"/>
-              <w:right w:val="single" w:color="999999" w:themeTint="" w:sz="4" w:space="0"/>
+              <w:top w:val="single" w:sz="4" w:space="0" w:color="999999"/>
+              <w:left w:val="single" w:sz="4" w:space="0" w:color="999999"/>
+              <w:bottom w:val="single" w:sz="4" w:space="0" w:color="999999"/>
+              <w:right w:val="single" w:sz="4" w:space="0" w:color="999999"/>
             </w:tcBorders>
-            <w:tcMar/>
           </w:tcPr>
           <w:p>
             <w:pPr>
@@ -720,8 +661,8 @@
     <w:p>
       <w:r>
         <w:rPr>
-          <w:b w:val="1"/>
-          <w:bCs w:val="1"/>
+          <w:b/>
+          <w:bCs/>
         </w:rPr>
         <w:t>Additional Notes</w:t>
       </w:r>
@@ -729,96 +670,13 @@
         <w:br/>
       </w:r>
       <w:r>
-        <w:rPr/>
         <w:t>Please use this section to provide any additional notes surrounding your submission.</w:t>
       </w:r>
     </w:p>
     <w:p>
       <w:r>
-        <w:rPr>
-          <w:b w:val="1"/>
-          <w:bCs w:val="1"/>
-        </w:rPr>
-        <w:t xml:space="preserve">We have worked together and have not used </w:t>
+        <w:t>None.</w:t>
       </w:r>
-      <w:r>
-        <w:rPr>
-          <w:b w:val="1"/>
-          <w:bCs w:val="1"/>
-        </w:rPr>
-        <w:t>artificial</w:t>
-      </w:r>
-      <w:r>
-        <w:rPr>
-          <w:b w:val="1"/>
-          <w:bCs w:val="1"/>
-        </w:rPr>
-        <w:t xml:space="preserve"> </w:t>
-      </w:r>
-      <w:r>
-        <w:rPr>
-          <w:b w:val="1"/>
-          <w:bCs w:val="1"/>
-        </w:rPr>
-        <w:t>intelligence</w:t>
-      </w:r>
-      <w:r>
-        <w:rPr>
-          <w:b w:val="1"/>
-          <w:bCs w:val="1"/>
-        </w:rPr>
-        <w:t xml:space="preserve"> in any way for our submission. We have had </w:t>
-      </w:r>
-      <w:r>
-        <w:rPr>
-          <w:b w:val="1"/>
-          <w:bCs w:val="1"/>
-        </w:rPr>
-        <w:t>miscommunication</w:t>
-      </w:r>
-      <w:r>
-        <w:rPr>
-          <w:b w:val="1"/>
-          <w:bCs w:val="1"/>
-        </w:rPr>
-        <w:t xml:space="preserve"> at times with fellow group members</w:t>
-      </w:r>
-      <w:r>
-        <w:rPr>
-          <w:b w:val="1"/>
-          <w:bCs w:val="1"/>
-        </w:rPr>
-        <w:t xml:space="preserve">.  </w:t>
-      </w:r>
-      <w:r>
-        <w:rPr>
-          <w:b w:val="1"/>
-          <w:bCs w:val="1"/>
-        </w:rPr>
-        <w:t>This was because</w:t>
-      </w:r>
-      <w:r>
-        <w:rPr>
-          <w:b w:val="1"/>
-          <w:bCs w:val="1"/>
-        </w:rPr>
-        <w:t xml:space="preserve"> we were focusing on different submissions </w:t>
-      </w:r>
-      <w:r>
-        <w:rPr>
-          <w:b w:val="1"/>
-          <w:bCs w:val="1"/>
-        </w:rPr>
-        <w:t>such as CW01 and CW02.</w:t>
-      </w:r>
-    </w:p>
-    <w:p>
-      <w:pPr>
-        <w:rPr>
-          <w:b w:val="1"/>
-          <w:bCs w:val="1"/>
-        </w:rPr>
-      </w:pPr>
     </w:p>
     <w:p>
       <w:pPr>
@@ -847,7 +705,7 @@
       <w:pPr>
         <w:jc w:val="center"/>
         <w:rPr>
-          <w:rFonts w:ascii="Calibri" w:hAnsi="Calibri" w:eastAsia="Arial" w:cs="Calibri"/>
+          <w:rFonts w:ascii="Calibri" w:eastAsia="Arial" w:hAnsi="Calibri" w:cs="Calibri"/>
           <w:b/>
           <w:bCs/>
           <w:color w:val="000000" w:themeColor="text1"/>
@@ -857,7 +715,7 @@
       </w:pPr>
       <w:r>
         <w:rPr>
-          <w:rFonts w:ascii="Calibri" w:hAnsi="Calibri" w:eastAsia="Arial" w:cs="Calibri"/>
+          <w:rFonts w:ascii="Calibri" w:eastAsia="Arial" w:hAnsi="Calibri" w:cs="Calibri"/>
           <w:b/>
           <w:bCs/>
           <w:color w:val="000000" w:themeColor="text1"/>
@@ -868,7 +726,7 @@
       </w:r>
       <w:r>
         <w:rPr>
-          <w:rFonts w:ascii="Calibri" w:hAnsi="Calibri" w:eastAsia="Arial" w:cs="Calibri"/>
+          <w:rFonts w:ascii="Calibri" w:eastAsia="Arial" w:hAnsi="Calibri" w:cs="Calibri"/>
           <w:b/>
           <w:bCs/>
           <w:color w:val="000000" w:themeColor="text1"/>
@@ -879,7 +737,7 @@
       </w:r>
       <w:r>
         <w:rPr>
-          <w:rFonts w:ascii="Calibri" w:hAnsi="Calibri" w:eastAsia="Arial" w:cs="Calibri"/>
+          <w:rFonts w:ascii="Calibri" w:eastAsia="Arial" w:hAnsi="Calibri" w:cs="Calibri"/>
           <w:b/>
           <w:bCs/>
           <w:color w:val="000000" w:themeColor="text1"/>
@@ -892,12 +750,12 @@
     <w:p>
       <w:pPr>
         <w:rPr>
-          <w:rFonts w:ascii="Calibri" w:hAnsi="Calibri" w:eastAsia="Arial" w:cs="Calibri"/>
+          <w:rFonts w:ascii="Calibri" w:eastAsia="Arial" w:hAnsi="Calibri" w:cs="Calibri"/>
         </w:rPr>
       </w:pPr>
       <w:r>
         <w:rPr>
-          <w:rFonts w:ascii="Calibri" w:hAnsi="Calibri" w:eastAsia="Arial" w:cs="Calibri"/>
+          <w:rFonts w:ascii="Calibri" w:eastAsia="Arial" w:hAnsi="Calibri" w:cs="Calibri"/>
         </w:rPr>
         <w:t>This Declaration must be completed and submitted along with your assessment. Please ensure sections 1 and 2 are completed before submission.</w:t>
       </w:r>
@@ -911,12 +769,12 @@
         </w:numPr>
         <w:spacing w:line="279" w:lineRule="auto"/>
         <w:rPr>
-          <w:rFonts w:ascii="Calibri" w:hAnsi="Calibri" w:eastAsia="Arial" w:cs="Calibri"/>
+          <w:rFonts w:ascii="Calibri" w:eastAsia="Arial" w:hAnsi="Calibri" w:cs="Calibri"/>
         </w:rPr>
       </w:pPr>
       <w:r>
         <w:rPr>
-          <w:rFonts w:ascii="Calibri" w:hAnsi="Calibri" w:eastAsia="Arial" w:cs="Calibri"/>
+          <w:rFonts w:ascii="Calibri" w:eastAsia="Arial" w:hAnsi="Calibri" w:cs="Calibri"/>
         </w:rPr>
         <w:t>For written assessments, insert the Declaration as the first page of your document.</w:t>
       </w:r>
@@ -930,12 +788,12 @@
         </w:numPr>
         <w:spacing w:line="279" w:lineRule="auto"/>
         <w:rPr>
-          <w:rFonts w:ascii="Calibri" w:hAnsi="Calibri" w:eastAsia="Arial" w:cs="Calibri"/>
+          <w:rFonts w:ascii="Calibri" w:eastAsia="Arial" w:hAnsi="Calibri" w:cs="Calibri"/>
         </w:rPr>
       </w:pPr>
       <w:r>
         <w:rPr>
-          <w:rFonts w:ascii="Calibri" w:hAnsi="Calibri" w:eastAsia="Arial" w:cs="Calibri"/>
+          <w:rFonts w:ascii="Calibri" w:eastAsia="Arial" w:hAnsi="Calibri" w:cs="Calibri"/>
         </w:rPr>
         <w:t>For assessments not in the written format (e.g. video, audio, presentation, or practical work), submit the Declaration as a separate file.</w:t>
       </w:r>
@@ -949,12 +807,12 @@
         </w:numPr>
         <w:spacing w:line="279" w:lineRule="auto"/>
         <w:rPr>
-          <w:rFonts w:ascii="Calibri" w:hAnsi="Calibri" w:eastAsia="Arial" w:cs="Calibri"/>
+          <w:rFonts w:ascii="Calibri" w:eastAsia="Arial" w:hAnsi="Calibri" w:cs="Calibri"/>
         </w:rPr>
       </w:pPr>
       <w:r>
         <w:rPr>
-          <w:rFonts w:ascii="Calibri" w:hAnsi="Calibri" w:eastAsia="Arial" w:cs="Calibri"/>
+          <w:rFonts w:ascii="Calibri" w:eastAsia="Arial" w:hAnsi="Calibri" w:cs="Calibri"/>
         </w:rPr>
         <w:lastRenderedPageBreak/>
         <w:t>For group assessments, unless otherwise directed by your lecturer, the group may submit a single shared declaration.</w:t>
@@ -965,10 +823,10 @@
         <w:tblStyle w:val="TableGrid"/>
         <w:tblW w:w="9344" w:type="dxa"/>
         <w:tblBorders>
-          <w:top w:val="single" w:color="auto" w:sz="6" w:space="0"/>
-          <w:left w:val="single" w:color="auto" w:sz="6" w:space="0"/>
-          <w:bottom w:val="single" w:color="auto" w:sz="6" w:space="0"/>
-          <w:right w:val="single" w:color="auto" w:sz="6" w:space="0"/>
+          <w:top w:val="single" w:sz="6" w:space="0" w:color="auto"/>
+          <w:left w:val="single" w:sz="6" w:space="0" w:color="auto"/>
+          <w:bottom w:val="single" w:sz="6" w:space="0" w:color="auto"/>
+          <w:right w:val="single" w:sz="6" w:space="0" w:color="auto"/>
         </w:tblBorders>
         <w:tblLayout w:type="fixed"/>
         <w:tblLook w:val="04A0" w:firstRow="1" w:lastRow="0" w:firstColumn="1" w:lastColumn="0" w:noHBand="0" w:noVBand="1"/>
@@ -986,10 +844,10 @@
             <w:tcW w:w="9344" w:type="dxa"/>
             <w:gridSpan w:val="2"/>
             <w:tcBorders>
-              <w:top w:val="single" w:color="auto" w:sz="6" w:space="0"/>
-              <w:left w:val="single" w:color="auto" w:sz="6" w:space="0"/>
-              <w:bottom w:val="single" w:color="auto" w:sz="6" w:space="0"/>
-              <w:right w:val="single" w:color="auto" w:sz="6" w:space="0"/>
+              <w:top w:val="single" w:sz="6" w:space="0" w:color="auto"/>
+              <w:left w:val="single" w:sz="6" w:space="0" w:color="auto"/>
+              <w:bottom w:val="single" w:sz="6" w:space="0" w:color="auto"/>
+              <w:right w:val="single" w:sz="6" w:space="0" w:color="auto"/>
             </w:tcBorders>
             <w:shd w:val="clear" w:color="auto" w:fill="F2F2F2" w:themeFill="background1" w:themeFillShade="F2"/>
             <w:tcMar>
@@ -1006,7 +864,7 @@
                 <w:numId w:val="2"/>
               </w:numPr>
               <w:rPr>
-                <w:rFonts w:ascii="Calibri" w:hAnsi="Calibri" w:eastAsia="Arial" w:cs="Calibri"/>
+                <w:rFonts w:ascii="Calibri" w:eastAsia="Arial" w:hAnsi="Calibri" w:cs="Calibri"/>
                 <w:b/>
                 <w:bCs/>
                 <w:sz w:val="22"/>
@@ -1016,7 +874,7 @@
             </w:pPr>
             <w:r>
               <w:rPr>
-                <w:rFonts w:ascii="Calibri" w:hAnsi="Calibri" w:eastAsia="Arial" w:cs="Calibri"/>
+                <w:rFonts w:ascii="Calibri" w:eastAsia="Arial" w:hAnsi="Calibri" w:cs="Calibri"/>
                 <w:b/>
                 <w:bCs/>
                 <w:sz w:val="22"/>
@@ -1037,10 +895,10 @@
             <w:tcW w:w="9344" w:type="dxa"/>
             <w:gridSpan w:val="2"/>
             <w:tcBorders>
-              <w:top w:val="single" w:color="auto" w:sz="6" w:space="0"/>
-              <w:left w:val="single" w:color="auto" w:sz="6" w:space="0"/>
-              <w:bottom w:val="single" w:color="auto" w:sz="6" w:space="0"/>
-              <w:right w:val="single" w:color="auto" w:sz="6" w:space="0"/>
+              <w:top w:val="single" w:sz="6" w:space="0" w:color="auto"/>
+              <w:left w:val="single" w:sz="6" w:space="0" w:color="auto"/>
+              <w:bottom w:val="single" w:sz="6" w:space="0" w:color="auto"/>
+              <w:right w:val="single" w:sz="6" w:space="0" w:color="auto"/>
             </w:tcBorders>
             <w:shd w:val="clear" w:color="auto" w:fill="FFFFFF" w:themeFill="background1"/>
             <w:tcMar>
@@ -1053,7 +911,7 @@
             <w:pPr>
               <w:spacing w:before="120"/>
               <w:rPr>
-                <w:rFonts w:ascii="Calibri" w:hAnsi="Calibri" w:eastAsia="Arial" w:cs="Calibri"/>
+                <w:rFonts w:ascii="Calibri" w:eastAsia="Arial" w:hAnsi="Calibri" w:cs="Calibri"/>
                 <w:sz w:val="22"/>
                 <w:szCs w:val="22"/>
                 <w:lang w:val="en-GB"/>
@@ -1061,18 +919,18 @@
             </w:pPr>
             <w:r>
               <w:rPr>
-                <w:rFonts w:ascii="Calibri" w:hAnsi="Calibri" w:eastAsia="Arial" w:cs="Calibri"/>
+                <w:rFonts w:ascii="Calibri" w:eastAsia="Arial" w:hAnsi="Calibri" w:cs="Calibri"/>
                 <w:sz w:val="22"/>
                 <w:szCs w:val="22"/>
                 <w:lang w:val="en-GB"/>
               </w:rPr>
               <w:t xml:space="preserve">All UWS students are expected to uphold the values of academic integrity: </w:t>
             </w:r>
-            <w:hyperlink r:id="rId8">
+            <w:hyperlink r:id="rId9">
               <w:r>
                 <w:rPr>
                   <w:rStyle w:val="Hyperlink"/>
-                  <w:rFonts w:ascii="Calibri" w:hAnsi="Calibri" w:eastAsia="Arial" w:cs="Calibri"/>
+                  <w:rFonts w:ascii="Calibri" w:eastAsia="Arial" w:hAnsi="Calibri" w:cs="Calibri"/>
                   <w:sz w:val="22"/>
                   <w:szCs w:val="22"/>
                   <w:lang w:val="en-GB"/>
@@ -1086,7 +944,7 @@
               <w:pStyle w:val="NoSpacing"/>
               <w:spacing w:before="120"/>
               <w:rPr>
-                <w:rFonts w:ascii="Calibri" w:hAnsi="Calibri" w:eastAsia="Arial" w:cs="Calibri"/>
+                <w:rFonts w:ascii="Calibri" w:eastAsia="Arial" w:hAnsi="Calibri" w:cs="Calibri"/>
                 <w:sz w:val="22"/>
                 <w:szCs w:val="22"/>
                 <w:lang w:val="en-GB"/>
@@ -1094,7 +952,7 @@
             </w:pPr>
             <w:r>
               <w:rPr>
-                <w:rFonts w:ascii="Calibri" w:hAnsi="Calibri" w:eastAsia="Arial" w:cs="Calibri"/>
+                <w:rFonts w:ascii="Calibri" w:eastAsia="Arial" w:hAnsi="Calibri" w:cs="Calibri"/>
                 <w:sz w:val="22"/>
                 <w:szCs w:val="22"/>
                 <w:lang w:val="en-GB"/>
@@ -1106,7 +964,7 @@
             <w:pPr>
               <w:spacing w:before="120" w:after="120"/>
               <w:rPr>
-                <w:rFonts w:ascii="Calibri" w:hAnsi="Calibri" w:eastAsia="Arial" w:cs="Calibri"/>
+                <w:rFonts w:ascii="Calibri" w:eastAsia="Arial" w:hAnsi="Calibri" w:cs="Calibri"/>
                 <w:sz w:val="22"/>
                 <w:szCs w:val="22"/>
                 <w:lang w:val="en-GB"/>
@@ -1114,7 +972,7 @@
             </w:pPr>
             <w:r>
               <w:rPr>
-                <w:rFonts w:ascii="Calibri" w:hAnsi="Calibri" w:eastAsia="Arial" w:cs="Calibri"/>
+                <w:rFonts w:ascii="Calibri" w:eastAsia="Arial" w:hAnsi="Calibri" w:cs="Calibri"/>
                 <w:sz w:val="22"/>
                 <w:szCs w:val="22"/>
                 <w:lang w:val="en-GB"/>
@@ -1132,10 +990,10 @@
           <w:tcPr>
             <w:tcW w:w="4665" w:type="dxa"/>
             <w:tcBorders>
-              <w:top w:val="single" w:color="auto" w:sz="6" w:space="0"/>
-              <w:left w:val="single" w:color="auto" w:sz="6" w:space="0"/>
-              <w:bottom w:val="single" w:color="auto" w:sz="6" w:space="0"/>
-              <w:right w:val="single" w:color="auto" w:sz="6" w:space="0"/>
+              <w:top w:val="single" w:sz="6" w:space="0" w:color="auto"/>
+              <w:left w:val="single" w:sz="6" w:space="0" w:color="auto"/>
+              <w:bottom w:val="single" w:sz="6" w:space="0" w:color="auto"/>
+              <w:right w:val="single" w:sz="6" w:space="0" w:color="auto"/>
             </w:tcBorders>
             <w:tcMar>
               <w:left w:w="90" w:type="dxa"/>
@@ -1147,7 +1005,7 @@
             <w:pPr>
               <w:spacing w:before="120" w:after="120"/>
               <w:rPr>
-                <w:rFonts w:ascii="Calibri" w:hAnsi="Calibri" w:eastAsia="Arial" w:cs="Calibri"/>
+                <w:rFonts w:ascii="Calibri" w:eastAsia="Arial" w:hAnsi="Calibri" w:cs="Calibri"/>
                 <w:sz w:val="22"/>
                 <w:szCs w:val="22"/>
                 <w:lang w:val="en-GB"/>
@@ -1155,7 +1013,7 @@
             </w:pPr>
             <w:r>
               <w:rPr>
-                <w:rFonts w:ascii="Calibri" w:hAnsi="Calibri" w:eastAsia="Arial" w:cs="Calibri"/>
+                <w:rFonts w:ascii="Calibri" w:eastAsia="Arial" w:hAnsi="Calibri" w:cs="Calibri"/>
                 <w:sz w:val="22"/>
                 <w:szCs w:val="22"/>
                 <w:lang w:val="en-GB"/>
@@ -1168,10 +1026,10 @@
           <w:tcPr>
             <w:tcW w:w="4679" w:type="dxa"/>
             <w:tcBorders>
-              <w:top w:val="single" w:color="auto" w:sz="6" w:space="0"/>
-              <w:left w:val="single" w:color="auto" w:sz="6" w:space="0"/>
-              <w:bottom w:val="single" w:color="auto" w:sz="6" w:space="0"/>
-              <w:right w:val="single" w:color="auto" w:sz="6" w:space="0"/>
+              <w:top w:val="single" w:sz="6" w:space="0" w:color="auto"/>
+              <w:left w:val="single" w:sz="6" w:space="0" w:color="auto"/>
+              <w:bottom w:val="single" w:sz="6" w:space="0" w:color="auto"/>
+              <w:right w:val="single" w:sz="6" w:space="0" w:color="auto"/>
             </w:tcBorders>
             <w:tcMar>
               <w:left w:w="90" w:type="dxa"/>
@@ -1183,7 +1041,7 @@
             <w:pPr>
               <w:spacing w:after="120"/>
               <w:rPr>
-                <w:rFonts w:ascii="Calibri" w:hAnsi="Calibri" w:eastAsia="Arial" w:cs="Calibri"/>
+                <w:rFonts w:ascii="Calibri" w:eastAsia="Arial" w:hAnsi="Calibri" w:cs="Calibri"/>
                 <w:sz w:val="22"/>
                 <w:szCs w:val="22"/>
                 <w:lang w:val="en-GB"/>
@@ -1191,7 +1049,7 @@
             </w:pPr>
             <w:r>
               <w:rPr>
-                <w:rFonts w:ascii="Calibri" w:hAnsi="Calibri" w:eastAsia="Arial" w:cs="Calibri"/>
+                <w:rFonts w:ascii="Calibri" w:eastAsia="Arial" w:hAnsi="Calibri" w:cs="Calibri"/>
                 <w:b/>
                 <w:bCs/>
                 <w:sz w:val="22"/>
@@ -1202,7 +1060,7 @@
             </w:r>
             <w:r>
               <w:rPr>
-                <w:rFonts w:ascii="Calibri" w:hAnsi="Calibri" w:eastAsia="Arial" w:cs="Calibri"/>
+                <w:rFonts w:ascii="Calibri" w:eastAsia="Arial" w:hAnsi="Calibri" w:cs="Calibri"/>
                 <w:sz w:val="22"/>
                 <w:szCs w:val="22"/>
                 <w:lang w:val="en-GB"/>
@@ -1221,10 +1079,10 @@
             <w:tcW w:w="9344" w:type="dxa"/>
             <w:gridSpan w:val="2"/>
             <w:tcBorders>
-              <w:top w:val="single" w:color="auto" w:sz="6" w:space="0"/>
-              <w:left w:val="single" w:color="auto" w:sz="6" w:space="0"/>
-              <w:bottom w:val="single" w:color="auto" w:sz="6" w:space="0"/>
-              <w:right w:val="single" w:color="auto" w:sz="6" w:space="0"/>
+              <w:top w:val="single" w:sz="6" w:space="0" w:color="auto"/>
+              <w:left w:val="single" w:sz="6" w:space="0" w:color="auto"/>
+              <w:bottom w:val="single" w:sz="6" w:space="0" w:color="auto"/>
+              <w:right w:val="single" w:sz="6" w:space="0" w:color="auto"/>
             </w:tcBorders>
             <w:shd w:val="clear" w:color="auto" w:fill="F2F2F2" w:themeFill="background1" w:themeFillShade="F2"/>
             <w:tcMar>
@@ -1240,7 +1098,7 @@
                 <w:numId w:val="2"/>
               </w:numPr>
               <w:rPr>
-                <w:rFonts w:ascii="Calibri" w:hAnsi="Calibri" w:eastAsia="Arial" w:cs="Calibri"/>
+                <w:rFonts w:ascii="Calibri" w:eastAsia="Arial" w:hAnsi="Calibri" w:cs="Calibri"/>
                 <w:b/>
                 <w:bCs/>
                 <w:lang w:val="en-GB"/>
@@ -1248,7 +1106,7 @@
             </w:pPr>
             <w:r>
               <w:rPr>
-                <w:rFonts w:ascii="Calibri" w:hAnsi="Calibri" w:eastAsia="Arial" w:cs="Calibri"/>
+                <w:rFonts w:ascii="Calibri" w:eastAsia="Arial" w:hAnsi="Calibri" w:cs="Calibri"/>
                 <w:b/>
                 <w:bCs/>
                 <w:sz w:val="22"/>
@@ -1269,10 +1127,10 @@
             <w:tcW w:w="9344" w:type="dxa"/>
             <w:gridSpan w:val="2"/>
             <w:tcBorders>
-              <w:top w:val="single" w:color="auto" w:sz="6" w:space="0"/>
-              <w:left w:val="single" w:color="auto" w:sz="6" w:space="0"/>
-              <w:bottom w:val="single" w:color="auto" w:sz="6" w:space="0"/>
-              <w:right w:val="single" w:color="auto" w:sz="6" w:space="0"/>
+              <w:top w:val="single" w:sz="6" w:space="0" w:color="auto"/>
+              <w:left w:val="single" w:sz="6" w:space="0" w:color="auto"/>
+              <w:bottom w:val="single" w:sz="6" w:space="0" w:color="auto"/>
+              <w:right w:val="single" w:sz="6" w:space="0" w:color="auto"/>
             </w:tcBorders>
             <w:tcMar>
               <w:left w:w="90" w:type="dxa"/>
@@ -1283,7 +1141,7 @@
             <w:pPr>
               <w:spacing w:before="120" w:after="120"/>
               <w:rPr>
-                <w:rFonts w:ascii="Calibri" w:hAnsi="Calibri" w:eastAsia="Arial" w:cs="Calibri"/>
+                <w:rFonts w:ascii="Calibri" w:eastAsia="Arial" w:hAnsi="Calibri" w:cs="Calibri"/>
                 <w:sz w:val="22"/>
                 <w:szCs w:val="22"/>
                 <w:lang w:val="en-GB"/>
@@ -1291,7 +1149,7 @@
             </w:pPr>
             <w:r>
               <w:rPr>
-                <w:rFonts w:ascii="Calibri" w:hAnsi="Calibri" w:eastAsia="Arial" w:cs="Calibri"/>
+                <w:rFonts w:ascii="Calibri" w:eastAsia="Arial" w:hAnsi="Calibri" w:cs="Calibri"/>
                 <w:sz w:val="22"/>
                 <w:szCs w:val="22"/>
                 <w:lang w:val="en-GB"/>
@@ -1309,10 +1167,10 @@
           <w:tcPr>
             <w:tcW w:w="4665" w:type="dxa"/>
             <w:tcBorders>
-              <w:top w:val="single" w:color="auto" w:sz="6" w:space="0"/>
-              <w:left w:val="single" w:color="auto" w:sz="6" w:space="0"/>
-              <w:bottom w:val="single" w:color="auto" w:sz="6" w:space="0"/>
-              <w:right w:val="single" w:color="auto" w:sz="6" w:space="0"/>
+              <w:top w:val="single" w:sz="6" w:space="0" w:color="auto"/>
+              <w:left w:val="single" w:sz="6" w:space="0" w:color="auto"/>
+              <w:bottom w:val="single" w:sz="6" w:space="0" w:color="auto"/>
+              <w:right w:val="single" w:sz="6" w:space="0" w:color="auto"/>
             </w:tcBorders>
             <w:tcMar>
               <w:left w:w="90" w:type="dxa"/>
@@ -1323,7 +1181,7 @@
             <w:pPr>
               <w:spacing w:before="120" w:after="120" w:line="278" w:lineRule="auto"/>
               <w:rPr>
-                <w:rFonts w:ascii="Calibri" w:hAnsi="Calibri" w:eastAsia="Arial" w:cs="Calibri"/>
+                <w:rFonts w:ascii="Calibri" w:eastAsia="Arial" w:hAnsi="Calibri" w:cs="Calibri"/>
                 <w:sz w:val="22"/>
                 <w:szCs w:val="22"/>
                 <w:lang w:val="en-GB"/>
@@ -1331,7 +1189,7 @@
             </w:pPr>
             <w:r>
               <w:rPr>
-                <w:rFonts w:ascii="Calibri" w:hAnsi="Calibri" w:eastAsia="Arial" w:cs="Calibri"/>
+                <w:rFonts w:ascii="Calibri" w:eastAsia="Arial" w:hAnsi="Calibri" w:cs="Calibri"/>
                 <w:sz w:val="22"/>
                 <w:szCs w:val="22"/>
                 <w:lang w:val="en-GB"/>
@@ -1344,10 +1202,10 @@
           <w:tcPr>
             <w:tcW w:w="4679" w:type="dxa"/>
             <w:tcBorders>
-              <w:top w:val="single" w:color="auto" w:sz="6" w:space="0"/>
-              <w:left w:val="single" w:color="auto" w:sz="6" w:space="0"/>
-              <w:bottom w:val="single" w:color="auto" w:sz="6" w:space="0"/>
-              <w:right w:val="single" w:color="auto" w:sz="6" w:space="0"/>
+              <w:top w:val="single" w:sz="6" w:space="0" w:color="auto"/>
+              <w:left w:val="single" w:sz="6" w:space="0" w:color="auto"/>
+              <w:bottom w:val="single" w:sz="6" w:space="0" w:color="auto"/>
+              <w:right w:val="single" w:sz="6" w:space="0" w:color="auto"/>
             </w:tcBorders>
             <w:tcMar>
               <w:left w:w="90" w:type="dxa"/>
@@ -1360,7 +1218,7 @@
               <w:pStyle w:val="NoSpacing"/>
               <w:spacing w:after="120"/>
               <w:rPr>
-                <w:rFonts w:ascii="Calibri" w:hAnsi="Calibri" w:eastAsia="Arial" w:cs="Calibri"/>
+                <w:rFonts w:ascii="Calibri" w:eastAsia="Arial" w:hAnsi="Calibri" w:cs="Calibri"/>
                 <w:sz w:val="22"/>
                 <w:szCs w:val="22"/>
                 <w:lang w:val="en-GB"/>
@@ -1368,7 +1226,7 @@
             </w:pPr>
             <w:r>
               <w:rPr>
-                <w:rFonts w:ascii="Calibri" w:hAnsi="Calibri" w:eastAsia="Arial" w:cs="Calibri"/>
+                <w:rFonts w:ascii="Calibri" w:eastAsia="Arial" w:hAnsi="Calibri" w:cs="Calibri"/>
                 <w:b/>
                 <w:bCs/>
                 <w:sz w:val="22"/>
@@ -1379,7 +1237,7 @@
             </w:r>
             <w:r>
               <w:rPr>
-                <w:rFonts w:ascii="Calibri" w:hAnsi="Calibri" w:eastAsia="Arial" w:cs="Calibri"/>
+                <w:rFonts w:ascii="Calibri" w:eastAsia="Arial" w:hAnsi="Calibri" w:cs="Calibri"/>
                 <w:sz w:val="22"/>
                 <w:szCs w:val="22"/>
                 <w:lang w:val="en-GB"/>
@@ -1398,10 +1256,10 @@
             <w:tcW w:w="9344" w:type="dxa"/>
             <w:gridSpan w:val="2"/>
             <w:tcBorders>
-              <w:top w:val="single" w:color="auto" w:sz="6" w:space="0"/>
-              <w:left w:val="single" w:color="auto" w:sz="6" w:space="0"/>
-              <w:bottom w:val="single" w:color="auto" w:sz="6" w:space="0"/>
-              <w:right w:val="single" w:color="auto" w:sz="6" w:space="0"/>
+              <w:top w:val="single" w:sz="6" w:space="0" w:color="auto"/>
+              <w:left w:val="single" w:sz="6" w:space="0" w:color="auto"/>
+              <w:bottom w:val="single" w:sz="6" w:space="0" w:color="auto"/>
+              <w:right w:val="single" w:sz="6" w:space="0" w:color="auto"/>
             </w:tcBorders>
             <w:tcMar>
               <w:left w:w="90" w:type="dxa"/>
@@ -1412,7 +1270,7 @@
             <w:pPr>
               <w:spacing w:before="120" w:line="278" w:lineRule="auto"/>
               <w:rPr>
-                <w:rFonts w:ascii="Calibri" w:hAnsi="Calibri" w:eastAsia="Arial" w:cs="Calibri"/>
+                <w:rFonts w:ascii="Calibri" w:eastAsia="Arial" w:hAnsi="Calibri" w:cs="Calibri"/>
                 <w:sz w:val="22"/>
                 <w:szCs w:val="22"/>
                 <w:lang w:val="en-GB"/>
@@ -1420,7 +1278,7 @@
             </w:pPr>
             <w:r>
               <w:rPr>
-                <w:rFonts w:ascii="Calibri" w:hAnsi="Calibri" w:eastAsia="Arial" w:cs="Calibri"/>
+                <w:rFonts w:ascii="Calibri" w:eastAsia="Arial" w:hAnsi="Calibri" w:cs="Calibri"/>
                 <w:sz w:val="22"/>
                 <w:szCs w:val="22"/>
                 <w:lang w:val="en-GB"/>
@@ -1429,7 +1287,7 @@
             </w:r>
             <w:r>
               <w:rPr>
-                <w:rFonts w:ascii="Calibri" w:hAnsi="Calibri" w:eastAsia="Arial" w:cs="Calibri"/>
+                <w:rFonts w:ascii="Calibri" w:eastAsia="Arial" w:hAnsi="Calibri" w:cs="Calibri"/>
                 <w:b/>
                 <w:bCs/>
                 <w:sz w:val="22"/>
@@ -1440,7 +1298,7 @@
             </w:r>
             <w:r>
               <w:rPr>
-                <w:rFonts w:ascii="Calibri" w:hAnsi="Calibri" w:eastAsia="Arial" w:cs="Calibri"/>
+                <w:rFonts w:ascii="Calibri" w:eastAsia="Arial" w:hAnsi="Calibri" w:cs="Calibri"/>
                 <w:sz w:val="22"/>
                 <w:szCs w:val="22"/>
                 <w:lang w:val="en-GB"/>
@@ -1452,7 +1310,7 @@
             <w:pPr>
               <w:spacing w:line="278" w:lineRule="auto"/>
               <w:rPr>
-                <w:rFonts w:ascii="Calibri" w:hAnsi="Calibri" w:eastAsia="Arial" w:cs="Calibri"/>
+                <w:rFonts w:ascii="Calibri" w:eastAsia="Arial" w:hAnsi="Calibri" w:cs="Calibri"/>
                 <w:sz w:val="22"/>
                 <w:szCs w:val="22"/>
                 <w:lang w:val="en-GB"/>
@@ -1463,7 +1321,7 @@
             <w:pPr>
               <w:spacing w:line="278" w:lineRule="auto"/>
               <w:rPr>
-                <w:rFonts w:ascii="Calibri" w:hAnsi="Calibri" w:eastAsia="Arial" w:cs="Calibri"/>
+                <w:rFonts w:ascii="Calibri" w:eastAsia="Arial" w:hAnsi="Calibri" w:cs="Calibri"/>
                 <w:sz w:val="22"/>
                 <w:szCs w:val="22"/>
                 <w:lang w:val="en-GB"/>
@@ -1477,7 +1335,7 @@
       <w:pPr>
         <w:spacing w:before="120" w:after="120"/>
         <w:rPr>
-          <w:rFonts w:ascii="Calibri" w:hAnsi="Calibri" w:eastAsia="Arial" w:cs="Calibri"/>
+          <w:rFonts w:ascii="Calibri" w:eastAsia="Arial" w:hAnsi="Calibri" w:cs="Calibri"/>
           <w:b/>
           <w:bCs/>
           <w:i/>
@@ -1486,7 +1344,7 @@
       </w:pPr>
       <w:r>
         <w:rPr>
-          <w:rFonts w:ascii="Calibri" w:hAnsi="Calibri" w:eastAsia="Arial" w:cs="Calibri"/>
+          <w:rFonts w:ascii="Calibri" w:eastAsia="Arial" w:hAnsi="Calibri" w:cs="Calibri"/>
           <w:b/>
           <w:bCs/>
           <w:i/>
@@ -1498,7 +1356,7 @@
     <w:p>
       <w:r>
         <w:rPr>
-          <w:rFonts w:ascii="Calibri" w:hAnsi="Calibri" w:eastAsia="Arial" w:cs="Calibri"/>
+          <w:rFonts w:ascii="Calibri" w:eastAsia="Arial" w:hAnsi="Calibri" w:cs="Calibri"/>
           <w:i/>
           <w:iCs/>
         </w:rPr>
@@ -1506,7 +1364,7 @@
       </w:r>
       <w:r>
         <w:rPr>
-          <w:rFonts w:ascii="Calibri" w:hAnsi="Calibri" w:eastAsia="Arial" w:cs="Calibri"/>
+          <w:rFonts w:ascii="Calibri" w:eastAsia="Arial" w:hAnsi="Calibri" w:cs="Calibri"/>
           <w:i/>
           <w:iCs/>
         </w:rPr>
@@ -1514,17 +1372,17 @@
       </w:r>
       <w:r>
         <w:rPr>
-          <w:rFonts w:ascii="Calibri" w:hAnsi="Calibri" w:eastAsia="Arial" w:cs="Calibri"/>
+          <w:rFonts w:ascii="Calibri" w:eastAsia="Arial" w:hAnsi="Calibri" w:cs="Calibri"/>
           <w:i/>
           <w:iCs/>
         </w:rPr>
         <w:t xml:space="preserve">In submitting each piece of coursework or completing an examination or class test, you are confirming that you are ‘fit to sit’ the assessment and wish that any mark achieved for that assessment should stand.  You can submit an ECS up to 48 hours after the assessment deadline, including where you have submitted the assessment but believe your academic performance has been affected by extenuating circumstances. The School Assessment Board will know that an ECS has been submitted when recording your module marks. See the </w:t>
       </w:r>
-      <w:hyperlink r:id="rId9">
+      <w:hyperlink r:id="rId10">
         <w:r>
           <w:rPr>
             <w:rStyle w:val="Hyperlink"/>
-            <w:rFonts w:ascii="Calibri" w:hAnsi="Calibri" w:eastAsia="Arial" w:cs="Calibri"/>
+            <w:rFonts w:ascii="Calibri" w:eastAsia="Arial" w:hAnsi="Calibri" w:cs="Calibri"/>
             <w:i/>
             <w:iCs/>
           </w:rPr>
@@ -1533,7 +1391,7 @@
       </w:hyperlink>
       <w:r>
         <w:rPr>
-          <w:rFonts w:ascii="Calibri" w:hAnsi="Calibri" w:eastAsia="Arial" w:cs="Calibri"/>
+          <w:rFonts w:ascii="Calibri" w:eastAsia="Arial" w:hAnsi="Calibri" w:cs="Calibri"/>
           <w:i/>
           <w:iCs/>
         </w:rPr>
@@ -1541,7 +1399,7 @@
       </w:r>
       <w:r>
         <w:rPr>
-          <w:rFonts w:ascii="Calibri" w:hAnsi="Calibri" w:eastAsia="Arial" w:cs="Calibri"/>
+          <w:rFonts w:ascii="Calibri" w:eastAsia="Arial" w:hAnsi="Calibri" w:cs="Calibri"/>
           <w:i/>
           <w:iCs/>
         </w:rPr>
@@ -1550,9 +1408,9 @@
     </w:p>
     <w:p/>
     <w:sectPr>
-      <w:headerReference w:type="default" r:id="rId10"/>
-      <w:footerReference w:type="default" r:id="rId11"/>
-      <w:pgSz w:w="11906" w:h="16838" w:orient="portrait"/>
+      <w:headerReference w:type="default" r:id="rId11"/>
+      <w:footerReference w:type="default" r:id="rId12"/>
+      <w:pgSz w:w="11906" w:h="16838"/>
       <w:pgMar w:top="1440" w:right="1440" w:bottom="1440" w:left="1440" w:header="708" w:footer="708" w:gutter="0"/>
       <w:cols w:space="708"/>
       <w:docGrid w:linePitch="360"/>
@@ -1596,7 +1454,7 @@
       <w:t xml:space="preserve"> </w:t>
     </w:r>
     <w:r>
-      <w:ptab w:alignment="center" w:relativeTo="margin" w:leader="none"/>
+      <w:ptab w:relativeTo="margin" w:alignment="center" w:leader="none"/>
     </w:r>
     <w:r>
       <w:fldChar w:fldCharType="begin"/>
@@ -1614,11 +1472,11 @@
       <w:fldChar w:fldCharType="end"/>
     </w:r>
     <w:r>
-      <w:ptab w:alignment="right" w:relativeTo="margin" w:leader="none"/>
+      <w:ptab w:relativeTo="margin" w:alignment="right" w:leader="none"/>
     </w:r>
     <w:r>
       <w:rPr>
-        <w:rFonts w:ascii="Calibri" w:hAnsi="Calibri" w:eastAsia="Times New Roman" w:cs="Calibri"/>
+        <w:rFonts w:ascii="Calibri" w:eastAsia="Times New Roman" w:hAnsi="Calibri" w:cs="Calibri"/>
         <w:color w:val="000000"/>
         <w:kern w:val="0"/>
         <w:lang w:eastAsia="en-GB"/>
@@ -1628,7 +1486,7 @@
     </w:r>
     <w:r>
       <w:rPr>
-        <w:rFonts w:ascii="Calibri" w:hAnsi="Calibri" w:eastAsia="Times New Roman" w:cs="Calibri"/>
+        <w:rFonts w:ascii="Calibri" w:eastAsia="Times New Roman" w:hAnsi="Calibri" w:cs="Calibri"/>
         <w:color w:val="000000"/>
         <w:kern w:val="0"/>
         <w:lang w:eastAsia="en-GB"/>
@@ -1638,7 +1496,7 @@
     </w:r>
     <w:r>
       <w:rPr>
-        <w:rFonts w:ascii="Calibri" w:hAnsi="Calibri" w:eastAsia="Times New Roman" w:cs="Calibri"/>
+        <w:rFonts w:ascii="Calibri" w:eastAsia="Times New Roman" w:hAnsi="Calibri" w:cs="Calibri"/>
         <w:color w:val="000000"/>
         <w:kern w:val="0"/>
         <w:lang w:eastAsia="en-GB"/>
@@ -1681,7 +1539,7 @@
     <w:pPr>
       <w:spacing w:after="0" w:line="240" w:lineRule="auto"/>
       <w:rPr>
-        <w:rFonts w:ascii="Calibri" w:hAnsi="Calibri" w:eastAsia="Times New Roman" w:cs="Calibri"/>
+        <w:rFonts w:ascii="Calibri" w:eastAsia="Times New Roman" w:hAnsi="Calibri" w:cs="Calibri"/>
         <w:color w:val="000000"/>
         <w:kern w:val="0"/>
         <w:lang w:eastAsia="en-GB"/>
@@ -1690,7 +1548,7 @@
     </w:pPr>
     <w:r>
       <w:rPr>
-        <w:rFonts w:ascii="Calibri" w:hAnsi="Calibri" w:eastAsia="Times New Roman" w:cs="Calibri"/>
+        <w:rFonts w:ascii="Calibri" w:eastAsia="Times New Roman" w:hAnsi="Calibri" w:cs="Calibri"/>
         <w:color w:val="000000"/>
         <w:kern w:val="0"/>
         <w:lang w:eastAsia="en-GB"/>
@@ -1700,7 +1558,7 @@
     </w:r>
     <w:r>
       <w:rPr>
-        <w:rFonts w:ascii="Calibri" w:hAnsi="Calibri" w:eastAsia="Times New Roman" w:cs="Calibri"/>
+        <w:rFonts w:ascii="Calibri" w:eastAsia="Times New Roman" w:hAnsi="Calibri" w:cs="Calibri"/>
         <w:color w:val="000000"/>
         <w:kern w:val="0"/>
         <w:lang w:eastAsia="en-GB"/>
@@ -1710,7 +1568,7 @@
     </w:r>
     <w:r>
       <w:rPr>
-        <w:rFonts w:ascii="Calibri" w:hAnsi="Calibri" w:eastAsia="Times New Roman" w:cs="Calibri"/>
+        <w:rFonts w:ascii="Calibri" w:eastAsia="Times New Roman" w:hAnsi="Calibri" w:cs="Calibri"/>
         <w:color w:val="000000"/>
         <w:kern w:val="0"/>
         <w:lang w:eastAsia="en-GB"/>
@@ -1720,7 +1578,7 @@
     </w:r>
     <w:r>
       <w:rPr>
-        <w:rFonts w:ascii="Calibri" w:hAnsi="Calibri" w:eastAsia="Times New Roman" w:cs="Calibri"/>
+        <w:rFonts w:ascii="Calibri" w:eastAsia="Times New Roman" w:hAnsi="Calibri" w:cs="Calibri"/>
         <w:color w:val="000000"/>
         <w:kern w:val="0"/>
         <w:lang w:eastAsia="en-GB"/>
@@ -1730,7 +1588,7 @@
     </w:r>
     <w:r>
       <w:rPr>
-        <w:rFonts w:ascii="Calibri" w:hAnsi="Calibri" w:eastAsia="Times New Roman" w:cs="Calibri"/>
+        <w:rFonts w:ascii="Calibri" w:eastAsia="Times New Roman" w:hAnsi="Calibri" w:cs="Calibri"/>
         <w:color w:val="000000"/>
         <w:kern w:val="0"/>
         <w:lang w:eastAsia="en-GB"/>
@@ -1740,7 +1598,7 @@
     </w:r>
     <w:r>
       <w:rPr>
-        <w:rFonts w:ascii="Calibri" w:hAnsi="Calibri" w:eastAsia="Times New Roman" w:cs="Calibri"/>
+        <w:rFonts w:ascii="Calibri" w:eastAsia="Times New Roman" w:hAnsi="Calibri" w:cs="Calibri"/>
         <w:color w:val="000000"/>
         <w:kern w:val="0"/>
         <w:lang w:eastAsia="en-GB"/>
@@ -1750,7 +1608,7 @@
     </w:r>
     <w:r>
       <w:rPr>
-        <w:rFonts w:ascii="Calibri" w:hAnsi="Calibri" w:eastAsia="Times New Roman" w:cs="Calibri"/>
+        <w:rFonts w:ascii="Calibri" w:eastAsia="Times New Roman" w:hAnsi="Calibri" w:cs="Calibri"/>
         <w:color w:val="000000"/>
         <w:kern w:val="0"/>
         <w:lang w:eastAsia="en-GB"/>
@@ -1760,7 +1618,7 @@
     </w:r>
     <w:r>
       <w:rPr>
-        <w:rFonts w:ascii="Calibri" w:hAnsi="Calibri" w:eastAsia="Times New Roman" w:cs="Calibri"/>
+        <w:rFonts w:ascii="Calibri" w:eastAsia="Times New Roman" w:hAnsi="Calibri" w:cs="Calibri"/>
         <w:color w:val="000000"/>
         <w:kern w:val="0"/>
         <w:lang w:eastAsia="en-GB"/>
@@ -1770,7 +1628,7 @@
     </w:r>
     <w:r>
       <w:rPr>
-        <w:rFonts w:ascii="Calibri" w:hAnsi="Calibri" w:eastAsia="Times New Roman" w:cs="Calibri"/>
+        <w:rFonts w:ascii="Calibri" w:eastAsia="Times New Roman" w:hAnsi="Calibri" w:cs="Calibri"/>
         <w:color w:val="000000"/>
         <w:kern w:val="0"/>
         <w:lang w:eastAsia="en-GB"/>
@@ -1780,7 +1638,7 @@
     </w:r>
     <w:r>
       <w:rPr>
-        <w:rFonts w:ascii="Calibri" w:hAnsi="Calibri" w:eastAsia="Times New Roman" w:cs="Calibri"/>
+        <w:rFonts w:ascii="Calibri" w:eastAsia="Times New Roman" w:hAnsi="Calibri" w:cs="Calibri"/>
         <w:color w:val="000000"/>
         <w:kern w:val="0"/>
         <w:lang w:eastAsia="en-GB"/>
@@ -1812,7 +1670,7 @@
         <w:ind w:left="720" w:hanging="360"/>
       </w:pPr>
       <w:rPr>
-        <w:rFonts w:hint="default" w:ascii="Symbol" w:hAnsi="Symbol"/>
+        <w:rFonts w:ascii="Symbol" w:hAnsi="Symbol" w:hint="default"/>
       </w:rPr>
     </w:lvl>
     <w:lvl w:ilvl="1" w:tplc="08090003" w:tentative="1">
@@ -1824,7 +1682,7 @@
         <w:ind w:left="1440" w:hanging="360"/>
       </w:pPr>
       <w:rPr>
-        <w:rFonts w:hint="default" w:ascii="Courier New" w:hAnsi="Courier New" w:cs="Courier New"/>
+        <w:rFonts w:ascii="Courier New" w:hAnsi="Courier New" w:cs="Courier New" w:hint="default"/>
       </w:rPr>
     </w:lvl>
     <w:lvl w:ilvl="2" w:tplc="08090005" w:tentative="1">
@@ -1836,7 +1694,7 @@
         <w:ind w:left="2160" w:hanging="360"/>
       </w:pPr>
       <w:rPr>
-        <w:rFonts w:hint="default" w:ascii="Wingdings" w:hAnsi="Wingdings"/>
+        <w:rFonts w:ascii="Wingdings" w:hAnsi="Wingdings" w:hint="default"/>
       </w:rPr>
     </w:lvl>
     <w:lvl w:ilvl="3" w:tplc="08090001" w:tentative="1">
@@ -1848,7 +1706,7 @@
         <w:ind w:left="2880" w:hanging="360"/>
       </w:pPr>
       <w:rPr>
-        <w:rFonts w:hint="default" w:ascii="Symbol" w:hAnsi="Symbol"/>
+        <w:rFonts w:ascii="Symbol" w:hAnsi="Symbol" w:hint="default"/>
       </w:rPr>
     </w:lvl>
     <w:lvl w:ilvl="4" w:tplc="08090003" w:tentative="1">
@@ -1860,7 +1718,7 @@
         <w:ind w:left="3600" w:hanging="360"/>
       </w:pPr>
       <w:rPr>
-        <w:rFonts w:hint="default" w:ascii="Courier New" w:hAnsi="Courier New" w:cs="Courier New"/>
+        <w:rFonts w:ascii="Courier New" w:hAnsi="Courier New" w:cs="Courier New" w:hint="default"/>
       </w:rPr>
     </w:lvl>
     <w:lvl w:ilvl="5" w:tplc="08090005" w:tentative="1">
@@ -1872,7 +1730,7 @@
         <w:ind w:left="4320" w:hanging="360"/>
       </w:pPr>
       <w:rPr>
-        <w:rFonts w:hint="default" w:ascii="Wingdings" w:hAnsi="Wingdings"/>
+        <w:rFonts w:ascii="Wingdings" w:hAnsi="Wingdings" w:hint="default"/>
       </w:rPr>
     </w:lvl>
     <w:lvl w:ilvl="6" w:tplc="08090001" w:tentative="1">
@@ -1884,7 +1742,7 @@
         <w:ind w:left="5040" w:hanging="360"/>
       </w:pPr>
       <w:rPr>
-        <w:rFonts w:hint="default" w:ascii="Symbol" w:hAnsi="Symbol"/>
+        <w:rFonts w:ascii="Symbol" w:hAnsi="Symbol" w:hint="default"/>
       </w:rPr>
     </w:lvl>
     <w:lvl w:ilvl="7" w:tplc="08090003" w:tentative="1">
@@ -1896,7 +1754,7 @@
         <w:ind w:left="5760" w:hanging="360"/>
       </w:pPr>
       <w:rPr>
-        <w:rFonts w:hint="default" w:ascii="Courier New" w:hAnsi="Courier New" w:cs="Courier New"/>
+        <w:rFonts w:ascii="Courier New" w:hAnsi="Courier New" w:cs="Courier New" w:hint="default"/>
       </w:rPr>
     </w:lvl>
     <w:lvl w:ilvl="8" w:tplc="08090005" w:tentative="1">
@@ -1908,7 +1766,7 @@
         <w:ind w:left="6480" w:hanging="360"/>
       </w:pPr>
       <w:rPr>
-        <w:rFonts w:hint="default" w:ascii="Wingdings" w:hAnsi="Wingdings"/>
+        <w:rFonts w:ascii="Wingdings" w:hAnsi="Wingdings" w:hint="default"/>
       </w:rPr>
     </w:lvl>
   </w:abstractNum>
@@ -2011,7 +1869,7 @@
         <w:ind w:left="720" w:hanging="360"/>
       </w:pPr>
       <w:rPr>
-        <w:rFonts w:hint="default" w:ascii="Symbol" w:hAnsi="Symbol"/>
+        <w:rFonts w:ascii="Symbol" w:hAnsi="Symbol" w:hint="default"/>
       </w:rPr>
     </w:lvl>
     <w:lvl w:ilvl="1" w:tplc="B60C8304">
@@ -2023,7 +1881,7 @@
         <w:ind w:left="1440" w:hanging="360"/>
       </w:pPr>
       <w:rPr>
-        <w:rFonts w:hint="default" w:ascii="Courier New" w:hAnsi="Courier New"/>
+        <w:rFonts w:ascii="Courier New" w:hAnsi="Courier New" w:hint="default"/>
       </w:rPr>
     </w:lvl>
     <w:lvl w:ilvl="2" w:tplc="C11A739E">
@@ -2035,7 +1893,7 @@
         <w:ind w:left="2160" w:hanging="360"/>
       </w:pPr>
       <w:rPr>
-        <w:rFonts w:hint="default" w:ascii="Wingdings" w:hAnsi="Wingdings"/>
+        <w:rFonts w:ascii="Wingdings" w:hAnsi="Wingdings" w:hint="default"/>
       </w:rPr>
     </w:lvl>
     <w:lvl w:ilvl="3" w:tplc="E3E69396">
@@ -2047,7 +1905,7 @@
         <w:ind w:left="2880" w:hanging="360"/>
       </w:pPr>
       <w:rPr>
-        <w:rFonts w:hint="default" w:ascii="Symbol" w:hAnsi="Symbol"/>
+        <w:rFonts w:ascii="Symbol" w:hAnsi="Symbol" w:hint="default"/>
       </w:rPr>
     </w:lvl>
     <w:lvl w:ilvl="4" w:tplc="4F946910">
@@ -2059,7 +1917,7 @@
         <w:ind w:left="3600" w:hanging="360"/>
       </w:pPr>
       <w:rPr>
-        <w:rFonts w:hint="default" w:ascii="Courier New" w:hAnsi="Courier New"/>
+        <w:rFonts w:ascii="Courier New" w:hAnsi="Courier New" w:hint="default"/>
       </w:rPr>
     </w:lvl>
     <w:lvl w:ilvl="5" w:tplc="23364462">
@@ -2071,7 +1929,7 @@
         <w:ind w:left="4320" w:hanging="360"/>
       </w:pPr>
       <w:rPr>
-        <w:rFonts w:hint="default" w:ascii="Wingdings" w:hAnsi="Wingdings"/>
+        <w:rFonts w:ascii="Wingdings" w:hAnsi="Wingdings" w:hint="default"/>
       </w:rPr>
     </w:lvl>
     <w:lvl w:ilvl="6" w:tplc="BCCEB26E">
@@ -2083,7 +1941,7 @@
         <w:ind w:left="5040" w:hanging="360"/>
       </w:pPr>
       <w:rPr>
-        <w:rFonts w:hint="default" w:ascii="Symbol" w:hAnsi="Symbol"/>
+        <w:rFonts w:ascii="Symbol" w:hAnsi="Symbol" w:hint="default"/>
       </w:rPr>
     </w:lvl>
     <w:lvl w:ilvl="7" w:tplc="C6206264">
@@ -2095,7 +1953,7 @@
         <w:ind w:left="5760" w:hanging="360"/>
       </w:pPr>
       <w:rPr>
-        <w:rFonts w:hint="default" w:ascii="Courier New" w:hAnsi="Courier New"/>
+        <w:rFonts w:ascii="Courier New" w:hAnsi="Courier New" w:hint="default"/>
       </w:rPr>
     </w:lvl>
     <w:lvl w:ilvl="8" w:tplc="26423764">
@@ -2107,7 +1965,7 @@
         <w:ind w:left="6480" w:hanging="360"/>
       </w:pPr>
       <w:rPr>
-        <w:rFonts w:hint="default" w:ascii="Wingdings" w:hAnsi="Wingdings"/>
+        <w:rFonts w:ascii="Wingdings" w:hAnsi="Wingdings" w:hint="default"/>
       </w:rPr>
     </w:lvl>
   </w:abstractNum>
@@ -2128,7 +1986,7 @@
   <w:docDefaults>
     <w:rPrDefault>
       <w:rPr>
-        <w:rFonts w:asciiTheme="minorHAnsi" w:hAnsiTheme="minorHAnsi" w:eastAsiaTheme="minorHAnsi" w:cstheme="minorBidi"/>
+        <w:rFonts w:asciiTheme="minorHAnsi" w:eastAsiaTheme="minorHAnsi" w:hAnsiTheme="minorHAnsi" w:cstheme="minorBidi"/>
         <w:kern w:val="2"/>
         <w:sz w:val="22"/>
         <w:szCs w:val="22"/>
@@ -2145,14 +2003,14 @@
   <w:latentStyles w:defLockedState="0" w:defUIPriority="99" w:defSemiHidden="0" w:defUnhideWhenUsed="0" w:defQFormat="0" w:count="376">
     <w:lsdException w:name="Normal" w:uiPriority="0" w:qFormat="1"/>
     <w:lsdException w:name="heading 1" w:uiPriority="9" w:qFormat="1"/>
-    <w:lsdException w:name="heading 2" w:uiPriority="9" w:semiHidden="1" w:unhideWhenUsed="1" w:qFormat="1"/>
-    <w:lsdException w:name="heading 3" w:uiPriority="9" w:semiHidden="1" w:unhideWhenUsed="1" w:qFormat="1"/>
-    <w:lsdException w:name="heading 4" w:uiPriority="9" w:semiHidden="1" w:unhideWhenUsed="1" w:qFormat="1"/>
-    <w:lsdException w:name="heading 5" w:uiPriority="9" w:semiHidden="1" w:unhideWhenUsed="1" w:qFormat="1"/>
-    <w:lsdException w:name="heading 6" w:uiPriority="9" w:semiHidden="1" w:unhideWhenUsed="1" w:qFormat="1"/>
-    <w:lsdException w:name="heading 7" w:uiPriority="9" w:semiHidden="1" w:unhideWhenUsed="1" w:qFormat="1"/>
-    <w:lsdException w:name="heading 8" w:uiPriority="9" w:semiHidden="1" w:unhideWhenUsed="1" w:qFormat="1"/>
-    <w:lsdException w:name="heading 9" w:uiPriority="9" w:semiHidden="1" w:unhideWhenUsed="1" w:qFormat="1"/>
+    <w:lsdException w:name="heading 2" w:semiHidden="1" w:uiPriority="9" w:unhideWhenUsed="1" w:qFormat="1"/>
+    <w:lsdException w:name="heading 3" w:semiHidden="1" w:uiPriority="9" w:unhideWhenUsed="1" w:qFormat="1"/>
+    <w:lsdException w:name="heading 4" w:semiHidden="1" w:uiPriority="9" w:unhideWhenUsed="1" w:qFormat="1"/>
+    <w:lsdException w:name="heading 5" w:semiHidden="1" w:uiPriority="9" w:unhideWhenUsed="1" w:qFormat="1"/>
+    <w:lsdException w:name="heading 6" w:semiHidden="1" w:uiPriority="9" w:unhideWhenUsed="1" w:qFormat="1"/>
+    <w:lsdException w:name="heading 7" w:semiHidden="1" w:uiPriority="9" w:unhideWhenUsed="1" w:qFormat="1"/>
+    <w:lsdException w:name="heading 8" w:semiHidden="1" w:uiPriority="9" w:unhideWhenUsed="1" w:qFormat="1"/>
+    <w:lsdException w:name="heading 9" w:semiHidden="1" w:uiPriority="9" w:unhideWhenUsed="1" w:qFormat="1"/>
     <w:lsdException w:name="index 1" w:semiHidden="1" w:unhideWhenUsed="1"/>
     <w:lsdException w:name="index 2" w:semiHidden="1" w:unhideWhenUsed="1"/>
     <w:lsdException w:name="index 3" w:semiHidden="1" w:unhideWhenUsed="1"/>
@@ -2162,22 +2020,22 @@
     <w:lsdException w:name="index 7" w:semiHidden="1" w:unhideWhenUsed="1"/>
     <w:lsdException w:name="index 8" w:semiHidden="1" w:unhideWhenUsed="1"/>
     <w:lsdException w:name="index 9" w:semiHidden="1" w:unhideWhenUsed="1"/>
-    <w:lsdException w:name="toc 1" w:uiPriority="39" w:semiHidden="1" w:unhideWhenUsed="1"/>
-    <w:lsdException w:name="toc 2" w:uiPriority="39" w:semiHidden="1" w:unhideWhenUsed="1"/>
-    <w:lsdException w:name="toc 3" w:uiPriority="39" w:semiHidden="1" w:unhideWhenUsed="1"/>
-    <w:lsdException w:name="toc 4" w:uiPriority="39" w:semiHidden="1" w:unhideWhenUsed="1"/>
-    <w:lsdException w:name="toc 5" w:uiPriority="39" w:semiHidden="1" w:unhideWhenUsed="1"/>
-    <w:lsdException w:name="toc 6" w:uiPriority="39" w:semiHidden="1" w:unhideWhenUsed="1"/>
-    <w:lsdException w:name="toc 7" w:uiPriority="39" w:semiHidden="1" w:unhideWhenUsed="1"/>
-    <w:lsdException w:name="toc 8" w:uiPriority="39" w:semiHidden="1" w:unhideWhenUsed="1"/>
-    <w:lsdException w:name="toc 9" w:uiPriority="39" w:semiHidden="1" w:unhideWhenUsed="1"/>
+    <w:lsdException w:name="toc 1" w:semiHidden="1" w:uiPriority="39" w:unhideWhenUsed="1"/>
+    <w:lsdException w:name="toc 2" w:semiHidden="1" w:uiPriority="39" w:unhideWhenUsed="1"/>
+    <w:lsdException w:name="toc 3" w:semiHidden="1" w:uiPriority="39" w:unhideWhenUsed="1"/>
+    <w:lsdException w:name="toc 4" w:semiHidden="1" w:uiPriority="39" w:unhideWhenUsed="1"/>
+    <w:lsdException w:name="toc 5" w:semiHidden="1" w:uiPriority="39" w:unhideWhenUsed="1"/>
+    <w:lsdException w:name="toc 6" w:semiHidden="1" w:uiPriority="39" w:unhideWhenUsed="1"/>
+    <w:lsdException w:name="toc 7" w:semiHidden="1" w:uiPriority="39" w:unhideWhenUsed="1"/>
+    <w:lsdException w:name="toc 8" w:semiHidden="1" w:uiPriority="39" w:unhideWhenUsed="1"/>
+    <w:lsdException w:name="toc 9" w:semiHidden="1" w:uiPriority="39" w:unhideWhenUsed="1"/>
     <w:lsdException w:name="Normal Indent" w:semiHidden="1" w:unhideWhenUsed="1"/>
     <w:lsdException w:name="footnote text" w:semiHidden="1" w:unhideWhenUsed="1"/>
     <w:lsdException w:name="annotation text" w:semiHidden="1" w:unhideWhenUsed="1"/>
     <w:lsdException w:name="header" w:semiHidden="1" w:unhideWhenUsed="1"/>
     <w:lsdException w:name="footer" w:semiHidden="1" w:unhideWhenUsed="1"/>
     <w:lsdException w:name="index heading" w:semiHidden="1" w:unhideWhenUsed="1"/>
-    <w:lsdException w:name="caption" w:uiPriority="35" w:semiHidden="1" w:unhideWhenUsed="1" w:qFormat="1"/>
+    <w:lsdException w:name="caption" w:semiHidden="1" w:uiPriority="35" w:unhideWhenUsed="1" w:qFormat="1"/>
     <w:lsdException w:name="table of figures" w:semiHidden="1" w:unhideWhenUsed="1"/>
     <w:lsdException w:name="envelope address" w:semiHidden="1" w:unhideWhenUsed="1"/>
     <w:lsdException w:name="envelope return" w:semiHidden="1" w:unhideWhenUsed="1"/>
@@ -2208,7 +2066,7 @@
     <w:lsdException w:name="Title" w:uiPriority="10" w:qFormat="1"/>
     <w:lsdException w:name="Closing" w:semiHidden="1" w:unhideWhenUsed="1"/>
     <w:lsdException w:name="Signature" w:semiHidden="1" w:unhideWhenUsed="1"/>
-    <w:lsdException w:name="Default Paragraph Font" w:uiPriority="1" w:semiHidden="1" w:unhideWhenUsed="1"/>
+    <w:lsdException w:name="Default Paragraph Font" w:semiHidden="1" w:uiPriority="1" w:unhideWhenUsed="1"/>
     <w:lsdException w:name="Body Text" w:semiHidden="1" w:unhideWhenUsed="1"/>
     <w:lsdException w:name="Body Text Indent" w:semiHidden="1" w:unhideWhenUsed="1"/>
     <w:lsdException w:name="List Continue" w:semiHidden="1" w:unhideWhenUsed="1"/>
@@ -2408,8 +2266,8 @@
     <w:lsdException w:name="Subtle Reference" w:uiPriority="31" w:qFormat="1"/>
     <w:lsdException w:name="Intense Reference" w:uiPriority="32" w:qFormat="1"/>
     <w:lsdException w:name="Book Title" w:uiPriority="33" w:qFormat="1"/>
-    <w:lsdException w:name="Bibliography" w:uiPriority="37" w:semiHidden="1" w:unhideWhenUsed="1"/>
-    <w:lsdException w:name="TOC Heading" w:uiPriority="39" w:semiHidden="1" w:unhideWhenUsed="1" w:qFormat="1"/>
+    <w:lsdException w:name="Bibliography" w:semiHidden="1" w:uiPriority="37" w:unhideWhenUsed="1"/>
+    <w:lsdException w:name="TOC Heading" w:semiHidden="1" w:uiPriority="39" w:unhideWhenUsed="1" w:qFormat="1"/>
     <w:lsdException w:name="Plain Table 1" w:uiPriority="41"/>
     <w:lsdException w:name="Plain Table 2" w:uiPriority="42"/>
     <w:lsdException w:name="Plain Table 3" w:uiPriority="43"/>
@@ -2520,7 +2378,7 @@
     <w:lsdException w:name="Unresolved Mention" w:semiHidden="1" w:unhideWhenUsed="1"/>
     <w:lsdException w:name="Smart Link" w:semiHidden="1" w:unhideWhenUsed="1"/>
   </w:latentStyles>
-  <w:style w:type="paragraph" w:styleId="Normal" w:default="1">
+  <w:style w:type="paragraph" w:default="1" w:styleId="Normal">
     <w:name w:val="Normal"/>
     <w:qFormat/>
   </w:style>
@@ -2539,7 +2397,7 @@
       <w:outlineLvl w:val="0"/>
     </w:pPr>
     <w:rPr>
-      <w:rFonts w:asciiTheme="majorHAnsi" w:hAnsiTheme="majorHAnsi" w:eastAsiaTheme="majorEastAsia" w:cstheme="majorBidi"/>
+      <w:rFonts w:asciiTheme="majorHAnsi" w:eastAsiaTheme="majorEastAsia" w:hAnsiTheme="majorHAnsi" w:cstheme="majorBidi"/>
       <w:color w:val="0F4761" w:themeColor="accent1" w:themeShade="BF"/>
       <w:sz w:val="40"/>
       <w:szCs w:val="40"/>
@@ -2561,7 +2419,7 @@
       <w:outlineLvl w:val="1"/>
     </w:pPr>
     <w:rPr>
-      <w:rFonts w:asciiTheme="majorHAnsi" w:hAnsiTheme="majorHAnsi" w:eastAsiaTheme="majorEastAsia" w:cstheme="majorBidi"/>
+      <w:rFonts w:asciiTheme="majorHAnsi" w:eastAsiaTheme="majorEastAsia" w:hAnsiTheme="majorHAnsi" w:cstheme="majorBidi"/>
       <w:color w:val="0F4761" w:themeColor="accent1" w:themeShade="BF"/>
       <w:sz w:val="32"/>
       <w:szCs w:val="32"/>
@@ -2721,13 +2579,13 @@
       <w:color w:val="272727" w:themeColor="text1" w:themeTint="D8"/>
     </w:rPr>
   </w:style>
-  <w:style w:type="character" w:styleId="DefaultParagraphFont" w:default="1">
+  <w:style w:type="character" w:default="1" w:styleId="DefaultParagraphFont">
     <w:name w:val="Default Paragraph Font"/>
     <w:uiPriority w:val="1"/>
     <w:semiHidden/>
     <w:unhideWhenUsed/>
   </w:style>
-  <w:style w:type="table" w:styleId="TableNormal" w:default="1">
+  <w:style w:type="table" w:default="1" w:styleId="TableNormal">
     <w:name w:val="Normal Table"/>
     <w:uiPriority w:val="99"/>
     <w:semiHidden/>
@@ -2742,39 +2600,39 @@
       </w:tblCellMar>
     </w:tblPr>
   </w:style>
-  <w:style w:type="numbering" w:styleId="NoList" w:default="1">
+  <w:style w:type="numbering" w:default="1" w:styleId="NoList">
     <w:name w:val="No List"/>
     <w:uiPriority w:val="99"/>
     <w:semiHidden/>
     <w:unhideWhenUsed/>
   </w:style>
-  <w:style w:type="character" w:styleId="Heading1Char" w:customStyle="1">
+  <w:style w:type="character" w:customStyle="1" w:styleId="Heading1Char">
     <w:name w:val="Heading 1 Char"/>
     <w:basedOn w:val="DefaultParagraphFont"/>
     <w:link w:val="Heading1"/>
     <w:uiPriority w:val="9"/>
     <w:rsid w:val="00B129F4"/>
     <w:rPr>
-      <w:rFonts w:asciiTheme="majorHAnsi" w:hAnsiTheme="majorHAnsi" w:eastAsiaTheme="majorEastAsia" w:cstheme="majorBidi"/>
+      <w:rFonts w:asciiTheme="majorHAnsi" w:eastAsiaTheme="majorEastAsia" w:hAnsiTheme="majorHAnsi" w:cstheme="majorBidi"/>
       <w:color w:val="0F4761" w:themeColor="accent1" w:themeShade="BF"/>
       <w:sz w:val="40"/>
       <w:szCs w:val="40"/>
     </w:rPr>
   </w:style>
-  <w:style w:type="character" w:styleId="Heading2Char" w:customStyle="1">
+  <w:style w:type="character" w:customStyle="1" w:styleId="Heading2Char">
     <w:name w:val="Heading 2 Char"/>
     <w:basedOn w:val="DefaultParagraphFont"/>
     <w:link w:val="Heading2"/>
     <w:uiPriority w:val="9"/>
     <w:rsid w:val="00B129F4"/>
     <w:rPr>
-      <w:rFonts w:asciiTheme="majorHAnsi" w:hAnsiTheme="majorHAnsi" w:eastAsiaTheme="majorEastAsia" w:cstheme="majorBidi"/>
+      <w:rFonts w:asciiTheme="majorHAnsi" w:eastAsiaTheme="majorEastAsia" w:hAnsiTheme="majorHAnsi" w:cstheme="majorBidi"/>
       <w:color w:val="0F4761" w:themeColor="accent1" w:themeShade="BF"/>
       <w:sz w:val="32"/>
       <w:szCs w:val="32"/>
     </w:rPr>
   </w:style>
-  <w:style w:type="character" w:styleId="Heading3Char" w:customStyle="1">
+  <w:style w:type="character" w:customStyle="1" w:styleId="Heading3Char">
     <w:name w:val="Heading 3 Char"/>
     <w:basedOn w:val="DefaultParagraphFont"/>
     <w:link w:val="Heading3"/>
@@ -2787,7 +2645,7 @@
       <w:szCs w:val="28"/>
     </w:rPr>
   </w:style>
-  <w:style w:type="character" w:styleId="Heading4Char" w:customStyle="1">
+  <w:style w:type="character" w:customStyle="1" w:styleId="Heading4Char">
     <w:name w:val="Heading 4 Char"/>
     <w:basedOn w:val="DefaultParagraphFont"/>
     <w:link w:val="Heading4"/>
@@ -2801,7 +2659,7 @@
       <w:color w:val="0F4761" w:themeColor="accent1" w:themeShade="BF"/>
     </w:rPr>
   </w:style>
-  <w:style w:type="character" w:styleId="Heading5Char" w:customStyle="1">
+  <w:style w:type="character" w:customStyle="1" w:styleId="Heading5Char">
     <w:name w:val="Heading 5 Char"/>
     <w:basedOn w:val="DefaultParagraphFont"/>
     <w:link w:val="Heading5"/>
@@ -2813,7 +2671,7 @@
       <w:color w:val="0F4761" w:themeColor="accent1" w:themeShade="BF"/>
     </w:rPr>
   </w:style>
-  <w:style w:type="character" w:styleId="Heading6Char" w:customStyle="1">
+  <w:style w:type="character" w:customStyle="1" w:styleId="Heading6Char">
     <w:name w:val="Heading 6 Char"/>
     <w:basedOn w:val="DefaultParagraphFont"/>
     <w:link w:val="Heading6"/>
@@ -2827,7 +2685,7 @@
       <w:color w:val="595959" w:themeColor="text1" w:themeTint="A6"/>
     </w:rPr>
   </w:style>
-  <w:style w:type="character" w:styleId="Heading7Char" w:customStyle="1">
+  <w:style w:type="character" w:customStyle="1" w:styleId="Heading7Char">
     <w:name w:val="Heading 7 Char"/>
     <w:basedOn w:val="DefaultParagraphFont"/>
     <w:link w:val="Heading7"/>
@@ -2839,7 +2697,7 @@
       <w:color w:val="595959" w:themeColor="text1" w:themeTint="A6"/>
     </w:rPr>
   </w:style>
-  <w:style w:type="character" w:styleId="Heading8Char" w:customStyle="1">
+  <w:style w:type="character" w:customStyle="1" w:styleId="Heading8Char">
     <w:name w:val="Heading 8 Char"/>
     <w:basedOn w:val="DefaultParagraphFont"/>
     <w:link w:val="Heading8"/>
@@ -2853,7 +2711,7 @@
       <w:color w:val="272727" w:themeColor="text1" w:themeTint="D8"/>
     </w:rPr>
   </w:style>
-  <w:style w:type="character" w:styleId="Heading9Char" w:customStyle="1">
+  <w:style w:type="character" w:customStyle="1" w:styleId="Heading9Char">
     <w:name w:val="Heading 9 Char"/>
     <w:basedOn w:val="DefaultParagraphFont"/>
     <w:link w:val="Heading9"/>
@@ -2878,21 +2736,21 @@
       <w:contextualSpacing/>
     </w:pPr>
     <w:rPr>
-      <w:rFonts w:asciiTheme="majorHAnsi" w:hAnsiTheme="majorHAnsi" w:eastAsiaTheme="majorEastAsia" w:cstheme="majorBidi"/>
+      <w:rFonts w:asciiTheme="majorHAnsi" w:eastAsiaTheme="majorEastAsia" w:hAnsiTheme="majorHAnsi" w:cstheme="majorBidi"/>
       <w:spacing w:val="-10"/>
       <w:kern w:val="28"/>
       <w:sz w:val="56"/>
       <w:szCs w:val="56"/>
     </w:rPr>
   </w:style>
-  <w:style w:type="character" w:styleId="TitleChar" w:customStyle="1">
+  <w:style w:type="character" w:customStyle="1" w:styleId="TitleChar">
     <w:name w:val="Title Char"/>
     <w:basedOn w:val="DefaultParagraphFont"/>
     <w:link w:val="Title"/>
     <w:uiPriority w:val="10"/>
     <w:rsid w:val="00B129F4"/>
     <w:rPr>
-      <w:rFonts w:asciiTheme="majorHAnsi" w:hAnsiTheme="majorHAnsi" w:eastAsiaTheme="majorEastAsia" w:cstheme="majorBidi"/>
+      <w:rFonts w:asciiTheme="majorHAnsi" w:eastAsiaTheme="majorEastAsia" w:hAnsiTheme="majorHAnsi" w:cstheme="majorBidi"/>
       <w:spacing w:val="-10"/>
       <w:kern w:val="28"/>
       <w:sz w:val="56"/>
@@ -2920,7 +2778,7 @@
       <w:szCs w:val="28"/>
     </w:rPr>
   </w:style>
-  <w:style w:type="character" w:styleId="SubtitleChar" w:customStyle="1">
+  <w:style w:type="character" w:customStyle="1" w:styleId="SubtitleChar">
     <w:name w:val="Subtitle Char"/>
     <w:basedOn w:val="DefaultParagraphFont"/>
     <w:link w:val="Subtitle"/>
@@ -2952,7 +2810,7 @@
       <w:color w:val="404040" w:themeColor="text1" w:themeTint="BF"/>
     </w:rPr>
   </w:style>
-  <w:style w:type="character" w:styleId="QuoteChar" w:customStyle="1">
+  <w:style w:type="character" w:customStyle="1" w:styleId="QuoteChar">
     <w:name w:val="Quote Char"/>
     <w:basedOn w:val="DefaultParagraphFont"/>
     <w:link w:val="Quote"/>
@@ -2997,8 +2855,8 @@
     <w:rsid w:val="00B129F4"/>
     <w:pPr>
       <w:pBdr>
-        <w:top w:val="single" w:color="0F4761" w:themeColor="accent1" w:themeShade="BF" w:sz="4" w:space="10"/>
-        <w:bottom w:val="single" w:color="0F4761" w:themeColor="accent1" w:themeShade="BF" w:sz="4" w:space="10"/>
+        <w:top w:val="single" w:sz="4" w:space="10" w:color="0F4761" w:themeColor="accent1" w:themeShade="BF"/>
+        <w:bottom w:val="single" w:sz="4" w:space="10" w:color="0F4761" w:themeColor="accent1" w:themeShade="BF"/>
       </w:pBdr>
       <w:spacing w:before="360" w:after="360"/>
       <w:ind w:left="864" w:right="864"/>
@@ -3010,7 +2868,7 @@
       <w:color w:val="0F4761" w:themeColor="accent1" w:themeShade="BF"/>
     </w:rPr>
   </w:style>
-  <w:style w:type="character" w:styleId="IntenseQuoteChar" w:customStyle="1">
+  <w:style w:type="character" w:customStyle="1" w:styleId="IntenseQuoteChar">
     <w:name w:val="Intense Quote Char"/>
     <w:basedOn w:val="DefaultParagraphFont"/>
     <w:link w:val="IntenseQuote"/>
@@ -3051,7 +2909,7 @@
       <w:spacing w:after="0" w:line="240" w:lineRule="auto"/>
     </w:pPr>
   </w:style>
-  <w:style w:type="character" w:styleId="HeaderChar" w:customStyle="1">
+  <w:style w:type="character" w:customStyle="1" w:styleId="HeaderChar">
     <w:name w:val="Header Char"/>
     <w:basedOn w:val="DefaultParagraphFont"/>
     <w:link w:val="Header"/>
@@ -3073,7 +2931,7 @@
       <w:spacing w:after="0" w:line="240" w:lineRule="auto"/>
     </w:pPr>
   </w:style>
-  <w:style w:type="character" w:styleId="FooterChar" w:customStyle="1">
+  <w:style w:type="character" w:customStyle="1" w:styleId="FooterChar">
     <w:name w:val="Footer Char"/>
     <w:basedOn w:val="DefaultParagraphFont"/>
     <w:link w:val="Footer"/>
@@ -3092,12 +2950,12 @@
       <w:tblStyleRowBandSize w:val="1"/>
       <w:tblStyleColBandSize w:val="1"/>
       <w:tblBorders>
-        <w:top w:val="single" w:color="999999" w:themeColor="text1" w:themeTint="66" w:sz="4" w:space="0"/>
-        <w:left w:val="single" w:color="999999" w:themeColor="text1" w:themeTint="66" w:sz="4" w:space="0"/>
-        <w:bottom w:val="single" w:color="999999" w:themeColor="text1" w:themeTint="66" w:sz="4" w:space="0"/>
-        <w:right w:val="single" w:color="999999" w:themeColor="text1" w:themeTint="66" w:sz="4" w:space="0"/>
-        <w:insideH w:val="single" w:color="999999" w:themeColor="text1" w:themeTint="66" w:sz="4" w:space="0"/>
-        <w:insideV w:val="single" w:color="999999" w:themeColor="text1" w:themeTint="66" w:sz="4" w:space="0"/>
+        <w:top w:val="single" w:sz="4" w:space="0" w:color="999999" w:themeColor="text1" w:themeTint="66"/>
+        <w:left w:val="single" w:sz="4" w:space="0" w:color="999999" w:themeColor="text1" w:themeTint="66"/>
+        <w:bottom w:val="single" w:sz="4" w:space="0" w:color="999999" w:themeColor="text1" w:themeTint="66"/>
+        <w:right w:val="single" w:sz="4" w:space="0" w:color="999999" w:themeColor="text1" w:themeTint="66"/>
+        <w:insideH w:val="single" w:sz="4" w:space="0" w:color="999999" w:themeColor="text1" w:themeTint="66"/>
+        <w:insideV w:val="single" w:sz="4" w:space="0" w:color="999999" w:themeColor="text1" w:themeTint="66"/>
       </w:tblBorders>
     </w:tblPr>
     <w:tblStylePr w:type="firstRow">
@@ -3108,7 +2966,7 @@
       <w:tblPr/>
       <w:tcPr>
         <w:tcBorders>
-          <w:bottom w:val="single" w:color="666666" w:themeColor="text1" w:themeTint="99" w:sz="12" w:space="0"/>
+          <w:bottom w:val="single" w:sz="12" w:space="0" w:color="666666" w:themeColor="text1" w:themeTint="99"/>
         </w:tcBorders>
       </w:tcPr>
     </w:tblStylePr>
@@ -3120,7 +2978,7 @@
       <w:tblPr/>
       <w:tcPr>
         <w:tcBorders>
-          <w:top w:val="double" w:color="666666" w:themeColor="text1" w:themeTint="99" w:sz="2" w:space="0"/>
+          <w:top w:val="double" w:sz="2" w:space="0" w:color="666666" w:themeColor="text1" w:themeTint="99"/>
         </w:tcBorders>
       </w:tcPr>
     </w:tblStylePr>
@@ -3195,12 +3053,12 @@
     </w:rPr>
     <w:tblPr>
       <w:tblBorders>
-        <w:top w:val="single" w:color="000000" w:themeColor="text1" w:sz="4" w:space="0"/>
-        <w:left w:val="single" w:color="000000" w:themeColor="text1" w:sz="4" w:space="0"/>
-        <w:bottom w:val="single" w:color="000000" w:themeColor="text1" w:sz="4" w:space="0"/>
-        <w:right w:val="single" w:color="000000" w:themeColor="text1" w:sz="4" w:space="0"/>
-        <w:insideH w:val="single" w:color="000000" w:themeColor="text1" w:sz="4" w:space="0"/>
-        <w:insideV w:val="single" w:color="000000" w:themeColor="text1" w:sz="4" w:space="0"/>
+        <w:top w:val="single" w:sz="4" w:space="0" w:color="000000" w:themeColor="text1"/>
+        <w:left w:val="single" w:sz="4" w:space="0" w:color="000000" w:themeColor="text1"/>
+        <w:bottom w:val="single" w:sz="4" w:space="0" w:color="000000" w:themeColor="text1"/>
+        <w:right w:val="single" w:sz="4" w:space="0" w:color="000000" w:themeColor="text1"/>
+        <w:insideH w:val="single" w:sz="4" w:space="0" w:color="000000" w:themeColor="text1"/>
+        <w:insideV w:val="single" w:sz="4" w:space="0" w:color="000000" w:themeColor="text1"/>
       </w:tblBorders>
     </w:tblPr>
   </w:style>
@@ -3208,7 +3066,7 @@
 </file>
 
 <file path=word/theme/theme1.xml><?xml version="1.0" encoding="utf-8"?>
-<a:theme xmlns:a="http://schemas.openxmlformats.org/drawingml/2006/main" xmlns:thm15="http://schemas.microsoft.com/office/thememl/2012/main" name="Office Theme">
+<a:theme xmlns:a="http://schemas.openxmlformats.org/drawingml/2006/main" name="Office Theme">
   <a:themeElements>
     <a:clrScheme name="Office">
       <a:dk1>

</xml_diff>

<commit_message>
Fixed error with CW1 Submit Form.
</commit_message>
<xml_diff>
--- a/DOCUMENTATION/CW1 submit form.docx
+++ b/DOCUMENTATION/CW1 submit form.docx
@@ -71,11 +71,12 @@
             <w:cnfStyle w:val="001000000000" w:firstRow="0" w:lastRow="0" w:firstColumn="1" w:lastColumn="0" w:oddVBand="0" w:evenVBand="0" w:oddHBand="0" w:evenHBand="0" w:firstRowFirstColumn="0" w:firstRowLastColumn="0" w:lastRowFirstColumn="0" w:lastRowLastColumn="0"/>
             <w:tcW w:w="2547" w:type="dxa"/>
             <w:tcBorders>
-              <w:top w:val="single" w:sz="4" w:space="0" w:color="999999"/>
-              <w:left w:val="single" w:sz="4" w:space="0" w:color="999999"/>
-              <w:bottom w:val="single" w:sz="4" w:space="0" w:color="999999"/>
-              <w:right w:val="single" w:sz="4" w:space="0" w:color="999999"/>
+              <w:top w:val="single" w:color="999999" w:sz="4" w:space="0"/>
+              <w:left w:val="single" w:color="999999" w:sz="4" w:space="0"/>
+              <w:bottom w:val="single" w:color="999999" w:sz="4" w:space="0"/>
+              <w:right w:val="single" w:color="999999" w:sz="4" w:space="0"/>
             </w:tcBorders>
+            <w:tcMar/>
           </w:tcPr>
           <w:p>
             <w:r>
@@ -85,13 +86,15 @@
         </w:tc>
         <w:tc>
           <w:tcPr>
+            <w:cnfStyle w:val="000000000000" w:firstRow="0" w:lastRow="0" w:firstColumn="0" w:lastColumn="0" w:oddVBand="0" w:evenVBand="0" w:oddHBand="0" w:evenHBand="0" w:firstRowFirstColumn="0" w:firstRowLastColumn="0" w:lastRowFirstColumn="0" w:lastRowLastColumn="0"/>
             <w:tcW w:w="6469" w:type="dxa"/>
             <w:tcBorders>
-              <w:top w:val="single" w:sz="4" w:space="0" w:color="999999"/>
-              <w:left w:val="single" w:sz="4" w:space="0" w:color="999999"/>
-              <w:bottom w:val="single" w:sz="4" w:space="0" w:color="999999"/>
-              <w:right w:val="single" w:sz="4" w:space="0" w:color="999999"/>
+              <w:top w:val="single" w:color="999999" w:sz="4" w:space="0"/>
+              <w:left w:val="single" w:color="999999" w:sz="4" w:space="0"/>
+              <w:bottom w:val="single" w:color="999999" w:sz="4" w:space="0"/>
+              <w:right w:val="single" w:color="999999" w:sz="4" w:space="0"/>
             </w:tcBorders>
+            <w:tcMar/>
           </w:tcPr>
           <w:p>
             <w:pPr>
@@ -109,11 +112,12 @@
             <w:cnfStyle w:val="001000000000" w:firstRow="0" w:lastRow="0" w:firstColumn="1" w:lastColumn="0" w:oddVBand="0" w:evenVBand="0" w:oddHBand="0" w:evenHBand="0" w:firstRowFirstColumn="0" w:firstRowLastColumn="0" w:lastRowFirstColumn="0" w:lastRowLastColumn="0"/>
             <w:tcW w:w="2547" w:type="dxa"/>
             <w:tcBorders>
-              <w:top w:val="single" w:sz="4" w:space="0" w:color="999999"/>
-              <w:left w:val="single" w:sz="4" w:space="0" w:color="999999"/>
-              <w:bottom w:val="single" w:sz="4" w:space="0" w:color="999999"/>
-              <w:right w:val="single" w:sz="4" w:space="0" w:color="999999"/>
+              <w:top w:val="single" w:color="999999" w:sz="4" w:space="0"/>
+              <w:left w:val="single" w:color="999999" w:sz="4" w:space="0"/>
+              <w:bottom w:val="single" w:color="999999" w:sz="4" w:space="0"/>
+              <w:right w:val="single" w:color="999999" w:sz="4" w:space="0"/>
             </w:tcBorders>
+            <w:tcMar/>
           </w:tcPr>
           <w:p>
             <w:r>
@@ -123,13 +127,15 @@
         </w:tc>
         <w:tc>
           <w:tcPr>
+            <w:cnfStyle w:val="000000000000" w:firstRow="0" w:lastRow="0" w:firstColumn="0" w:lastColumn="0" w:oddVBand="0" w:evenVBand="0" w:oddHBand="0" w:evenHBand="0" w:firstRowFirstColumn="0" w:firstRowLastColumn="0" w:lastRowFirstColumn="0" w:lastRowLastColumn="0"/>
             <w:tcW w:w="6469" w:type="dxa"/>
             <w:tcBorders>
-              <w:top w:val="single" w:sz="4" w:space="0" w:color="999999"/>
-              <w:left w:val="single" w:sz="4" w:space="0" w:color="999999"/>
-              <w:bottom w:val="single" w:sz="4" w:space="0" w:color="999999"/>
-              <w:right w:val="single" w:sz="4" w:space="0" w:color="999999"/>
+              <w:top w:val="single" w:color="999999" w:sz="4" w:space="0"/>
+              <w:left w:val="single" w:color="999999" w:sz="4" w:space="0"/>
+              <w:bottom w:val="single" w:color="999999" w:sz="4" w:space="0"/>
+              <w:right w:val="single" w:color="999999" w:sz="4" w:space="0"/>
             </w:tcBorders>
+            <w:tcMar/>
           </w:tcPr>
           <w:p>
             <w:pPr>
@@ -152,11 +158,12 @@
             <w:cnfStyle w:val="001000000000" w:firstRow="0" w:lastRow="0" w:firstColumn="1" w:lastColumn="0" w:oddVBand="0" w:evenVBand="0" w:oddHBand="0" w:evenHBand="0" w:firstRowFirstColumn="0" w:firstRowLastColumn="0" w:lastRowFirstColumn="0" w:lastRowLastColumn="0"/>
             <w:tcW w:w="2547" w:type="dxa"/>
             <w:tcBorders>
-              <w:top w:val="single" w:sz="4" w:space="0" w:color="999999"/>
-              <w:left w:val="single" w:sz="4" w:space="0" w:color="999999"/>
-              <w:bottom w:val="single" w:sz="4" w:space="0" w:color="999999"/>
-              <w:right w:val="single" w:sz="4" w:space="0" w:color="999999"/>
+              <w:top w:val="single" w:color="999999" w:sz="4" w:space="0"/>
+              <w:left w:val="single" w:color="999999" w:sz="4" w:space="0"/>
+              <w:bottom w:val="single" w:color="999999" w:sz="4" w:space="0"/>
+              <w:right w:val="single" w:color="999999" w:sz="4" w:space="0"/>
             </w:tcBorders>
+            <w:tcMar/>
           </w:tcPr>
           <w:p>
             <w:r>
@@ -169,13 +176,15 @@
         </w:tc>
         <w:tc>
           <w:tcPr>
+            <w:cnfStyle w:val="000000000000" w:firstRow="0" w:lastRow="0" w:firstColumn="0" w:lastColumn="0" w:oddVBand="0" w:evenVBand="0" w:oddHBand="0" w:evenHBand="0" w:firstRowFirstColumn="0" w:firstRowLastColumn="0" w:lastRowFirstColumn="0" w:lastRowLastColumn="0"/>
             <w:tcW w:w="6469" w:type="dxa"/>
             <w:tcBorders>
-              <w:top w:val="single" w:sz="4" w:space="0" w:color="999999"/>
-              <w:left w:val="single" w:sz="4" w:space="0" w:color="999999"/>
-              <w:bottom w:val="single" w:sz="4" w:space="0" w:color="999999"/>
-              <w:right w:val="single" w:sz="4" w:space="0" w:color="999999"/>
+              <w:top w:val="single" w:color="999999" w:sz="4" w:space="0"/>
+              <w:left w:val="single" w:color="999999" w:sz="4" w:space="0"/>
+              <w:bottom w:val="single" w:color="999999" w:sz="4" w:space="0"/>
+              <w:right w:val="single" w:color="999999" w:sz="4" w:space="0"/>
             </w:tcBorders>
+            <w:tcMar/>
           </w:tcPr>
           <w:p>
             <w:pPr>
@@ -211,11 +220,12 @@
             <w:cnfStyle w:val="001000000000" w:firstRow="0" w:lastRow="0" w:firstColumn="1" w:lastColumn="0" w:oddVBand="0" w:evenVBand="0" w:oddHBand="0" w:evenHBand="0" w:firstRowFirstColumn="0" w:firstRowLastColumn="0" w:lastRowFirstColumn="0" w:lastRowLastColumn="0"/>
             <w:tcW w:w="2547" w:type="dxa"/>
             <w:tcBorders>
-              <w:top w:val="single" w:sz="4" w:space="0" w:color="999999"/>
-              <w:left w:val="single" w:sz="4" w:space="0" w:color="999999"/>
-              <w:bottom w:val="single" w:sz="4" w:space="0" w:color="999999"/>
-              <w:right w:val="single" w:sz="4" w:space="0" w:color="999999"/>
+              <w:top w:val="single" w:color="999999" w:sz="4" w:space="0"/>
+              <w:left w:val="single" w:color="999999" w:sz="4" w:space="0"/>
+              <w:bottom w:val="single" w:color="999999" w:sz="4" w:space="0"/>
+              <w:right w:val="single" w:color="999999" w:sz="4" w:space="0"/>
             </w:tcBorders>
+            <w:tcMar/>
           </w:tcPr>
           <w:p>
             <w:r>
@@ -228,29 +238,44 @@
         </w:tc>
         <w:tc>
           <w:tcPr>
+            <w:cnfStyle w:val="000000000000" w:firstRow="0" w:lastRow="0" w:firstColumn="0" w:lastColumn="0" w:oddVBand="0" w:evenVBand="0" w:oddHBand="0" w:evenHBand="0" w:firstRowFirstColumn="0" w:firstRowLastColumn="0" w:lastRowFirstColumn="0" w:lastRowLastColumn="0"/>
             <w:tcW w:w="6469" w:type="dxa"/>
             <w:tcBorders>
-              <w:top w:val="single" w:sz="4" w:space="0" w:color="999999"/>
-              <w:left w:val="single" w:sz="4" w:space="0" w:color="999999"/>
-              <w:bottom w:val="single" w:sz="4" w:space="0" w:color="999999"/>
-              <w:right w:val="single" w:sz="4" w:space="0" w:color="999999"/>
+              <w:top w:val="single" w:color="999999" w:sz="4" w:space="0"/>
+              <w:left w:val="single" w:color="999999" w:sz="4" w:space="0"/>
+              <w:bottom w:val="single" w:color="999999" w:sz="4" w:space="0"/>
+              <w:right w:val="single" w:color="999999" w:sz="4" w:space="0"/>
             </w:tcBorders>
+            <w:tcMar/>
           </w:tcPr>
           <w:p>
             <w:pPr>
               <w:cnfStyle w:val="000000000000" w:firstRow="0" w:lastRow="0" w:firstColumn="0" w:lastColumn="0" w:oddVBand="0" w:evenVBand="0" w:oddHBand="0" w:evenHBand="0" w:firstRowFirstColumn="0" w:firstRowLastColumn="0" w:lastRowFirstColumn="0" w:lastRowLastColumn="0"/>
             </w:pPr>
-            <w:hyperlink r:id="rId8" w:history="1">
+            <w:hyperlink r:id="Ree352a8bca49408d">
               <w:r>
                 <w:rPr>
                   <w:rStyle w:val="Hyperlink"/>
                 </w:rPr>
-                <w:t>https://github.com/aaron-hamil5/flutter-learn/tree/main/flutter-learn</w:t>
+                <w:t>https://github.com/Uniq-Studio/learn</w:t>
               </w:r>
             </w:hyperlink>
             <w:r>
+              <w:rPr/>
               <w:t xml:space="preserve"> </w:t>
             </w:r>
+          </w:p>
+          <w:p>
+            <w:pPr>
+              <w:cnfStyle w:val="000000000000" w:firstRow="0" w:lastRow="0" w:firstColumn="0" w:lastColumn="0" w:oddVBand="0" w:evenVBand="0" w:oddHBand="0" w:evenHBand="0" w:firstRowFirstColumn="0" w:firstRowLastColumn="0" w:lastRowFirstColumn="0" w:lastRowLastColumn="0"/>
+            </w:pPr>
+          </w:p>
+          <w:p>
+            <w:pPr>
+              <w:pStyle w:val="ListParagraph"/>
+              <w:ind w:left="720"/>
+              <w:cnfStyle w:val="000000000000" w:firstRow="0" w:lastRow="0" w:firstColumn="0" w:lastColumn="0" w:oddVBand="0" w:evenVBand="0" w:oddHBand="0" w:evenHBand="0" w:firstRowFirstColumn="0" w:firstRowLastColumn="0" w:lastRowFirstColumn="0" w:lastRowLastColumn="0"/>
+            </w:pPr>
           </w:p>
         </w:tc>
       </w:tr>
@@ -261,11 +286,12 @@
             <w:tcW w:w="9016" w:type="dxa"/>
             <w:gridSpan w:val="2"/>
             <w:tcBorders>
-              <w:top w:val="single" w:sz="4" w:space="0" w:color="999999"/>
-              <w:left w:val="single" w:sz="4" w:space="0" w:color="999999"/>
-              <w:bottom w:val="single" w:sz="4" w:space="0" w:color="999999"/>
-              <w:right w:val="single" w:sz="4" w:space="0" w:color="999999"/>
+              <w:top w:val="single" w:color="999999" w:sz="4" w:space="0"/>
+              <w:left w:val="single" w:color="999999" w:sz="4" w:space="0"/>
+              <w:bottom w:val="single" w:color="999999" w:sz="4" w:space="0"/>
+              <w:right w:val="single" w:color="999999" w:sz="4" w:space="0"/>
             </w:tcBorders>
+            <w:tcMar/>
           </w:tcPr>
           <w:p>
             <w:pPr>
@@ -283,11 +309,12 @@
             <w:cnfStyle w:val="001000000000" w:firstRow="0" w:lastRow="0" w:firstColumn="1" w:lastColumn="0" w:oddVBand="0" w:evenVBand="0" w:oddHBand="0" w:evenHBand="0" w:firstRowFirstColumn="0" w:firstRowLastColumn="0" w:lastRowFirstColumn="0" w:lastRowLastColumn="0"/>
             <w:tcW w:w="2547" w:type="dxa"/>
             <w:tcBorders>
-              <w:top w:val="single" w:sz="4" w:space="0" w:color="999999"/>
-              <w:left w:val="single" w:sz="4" w:space="0" w:color="999999"/>
-              <w:bottom w:val="single" w:sz="4" w:space="0" w:color="999999"/>
-              <w:right w:val="single" w:sz="4" w:space="0" w:color="999999"/>
+              <w:top w:val="single" w:color="999999" w:sz="4" w:space="0"/>
+              <w:left w:val="single" w:color="999999" w:sz="4" w:space="0"/>
+              <w:bottom w:val="single" w:color="999999" w:sz="4" w:space="0"/>
+              <w:right w:val="single" w:color="999999" w:sz="4" w:space="0"/>
             </w:tcBorders>
+            <w:tcMar/>
             <w:hideMark/>
           </w:tcPr>
           <w:p>
@@ -301,13 +328,15 @@
         </w:tc>
         <w:tc>
           <w:tcPr>
+            <w:cnfStyle w:val="000000000000" w:firstRow="0" w:lastRow="0" w:firstColumn="0" w:lastColumn="0" w:oddVBand="0" w:evenVBand="0" w:oddHBand="0" w:evenHBand="0" w:firstRowFirstColumn="0" w:firstRowLastColumn="0" w:lastRowFirstColumn="0" w:lastRowLastColumn="0"/>
             <w:tcW w:w="6469" w:type="dxa"/>
             <w:tcBorders>
-              <w:top w:val="single" w:sz="4" w:space="0" w:color="999999"/>
-              <w:left w:val="single" w:sz="4" w:space="0" w:color="999999"/>
-              <w:bottom w:val="single" w:sz="4" w:space="0" w:color="999999"/>
-              <w:right w:val="single" w:sz="4" w:space="0" w:color="999999"/>
+              <w:top w:val="single" w:color="999999" w:sz="4" w:space="0"/>
+              <w:left w:val="single" w:color="999999" w:sz="4" w:space="0"/>
+              <w:bottom w:val="single" w:color="999999" w:sz="4" w:space="0"/>
+              <w:right w:val="single" w:color="999999" w:sz="4" w:space="0"/>
             </w:tcBorders>
+            <w:tcMar/>
             <w:hideMark/>
           </w:tcPr>
           <w:p>
@@ -327,11 +356,12 @@
             <w:cnfStyle w:val="001000000000" w:firstRow="0" w:lastRow="0" w:firstColumn="1" w:lastColumn="0" w:oddVBand="0" w:evenVBand="0" w:oddHBand="0" w:evenHBand="0" w:firstRowFirstColumn="0" w:firstRowLastColumn="0" w:lastRowFirstColumn="0" w:lastRowLastColumn="0"/>
             <w:tcW w:w="2547" w:type="dxa"/>
             <w:tcBorders>
-              <w:top w:val="single" w:sz="4" w:space="0" w:color="999999"/>
-              <w:left w:val="single" w:sz="4" w:space="0" w:color="999999"/>
-              <w:bottom w:val="single" w:sz="4" w:space="0" w:color="999999"/>
-              <w:right w:val="single" w:sz="4" w:space="0" w:color="999999"/>
+              <w:top w:val="single" w:color="999999" w:sz="4" w:space="0"/>
+              <w:left w:val="single" w:color="999999" w:sz="4" w:space="0"/>
+              <w:bottom w:val="single" w:color="999999" w:sz="4" w:space="0"/>
+              <w:right w:val="single" w:color="999999" w:sz="4" w:space="0"/>
             </w:tcBorders>
+            <w:tcMar/>
             <w:hideMark/>
           </w:tcPr>
           <w:p>
@@ -348,13 +378,15 @@
         </w:tc>
         <w:tc>
           <w:tcPr>
+            <w:cnfStyle w:val="000000000000" w:firstRow="0" w:lastRow="0" w:firstColumn="0" w:lastColumn="0" w:oddVBand="0" w:evenVBand="0" w:oddHBand="0" w:evenHBand="0" w:firstRowFirstColumn="0" w:firstRowLastColumn="0" w:lastRowFirstColumn="0" w:lastRowLastColumn="0"/>
             <w:tcW w:w="6469" w:type="dxa"/>
             <w:tcBorders>
-              <w:top w:val="single" w:sz="4" w:space="0" w:color="999999"/>
-              <w:left w:val="single" w:sz="4" w:space="0" w:color="999999"/>
-              <w:bottom w:val="single" w:sz="4" w:space="0" w:color="999999"/>
-              <w:right w:val="single" w:sz="4" w:space="0" w:color="999999"/>
+              <w:top w:val="single" w:color="999999" w:sz="4" w:space="0"/>
+              <w:left w:val="single" w:color="999999" w:sz="4" w:space="0"/>
+              <w:bottom w:val="single" w:color="999999" w:sz="4" w:space="0"/>
+              <w:right w:val="single" w:color="999999" w:sz="4" w:space="0"/>
             </w:tcBorders>
+            <w:tcMar/>
             <w:hideMark/>
           </w:tcPr>
           <w:p>
@@ -374,11 +406,12 @@
             <w:cnfStyle w:val="001000000000" w:firstRow="0" w:lastRow="0" w:firstColumn="1" w:lastColumn="0" w:oddVBand="0" w:evenVBand="0" w:oddHBand="0" w:evenHBand="0" w:firstRowFirstColumn="0" w:firstRowLastColumn="0" w:lastRowFirstColumn="0" w:lastRowLastColumn="0"/>
             <w:tcW w:w="2547" w:type="dxa"/>
             <w:tcBorders>
-              <w:top w:val="single" w:sz="4" w:space="0" w:color="999999"/>
-              <w:left w:val="single" w:sz="4" w:space="0" w:color="999999"/>
-              <w:bottom w:val="single" w:sz="4" w:space="0" w:color="999999"/>
-              <w:right w:val="single" w:sz="4" w:space="0" w:color="999999"/>
+              <w:top w:val="single" w:color="999999" w:sz="4" w:space="0"/>
+              <w:left w:val="single" w:color="999999" w:sz="4" w:space="0"/>
+              <w:bottom w:val="single" w:color="999999" w:sz="4" w:space="0"/>
+              <w:right w:val="single" w:color="999999" w:sz="4" w:space="0"/>
             </w:tcBorders>
+            <w:tcMar/>
           </w:tcPr>
           <w:p>
             <w:pPr>
@@ -394,13 +427,15 @@
         </w:tc>
         <w:tc>
           <w:tcPr>
+            <w:cnfStyle w:val="000000000000" w:firstRow="0" w:lastRow="0" w:firstColumn="0" w:lastColumn="0" w:oddVBand="0" w:evenVBand="0" w:oddHBand="0" w:evenHBand="0" w:firstRowFirstColumn="0" w:firstRowLastColumn="0" w:lastRowFirstColumn="0" w:lastRowLastColumn="0"/>
             <w:tcW w:w="6469" w:type="dxa"/>
             <w:tcBorders>
-              <w:top w:val="single" w:sz="4" w:space="0" w:color="999999"/>
-              <w:left w:val="single" w:sz="4" w:space="0" w:color="999999"/>
-              <w:bottom w:val="single" w:sz="4" w:space="0" w:color="999999"/>
-              <w:right w:val="single" w:sz="4" w:space="0" w:color="999999"/>
+              <w:top w:val="single" w:color="999999" w:sz="4" w:space="0"/>
+              <w:left w:val="single" w:color="999999" w:sz="4" w:space="0"/>
+              <w:bottom w:val="single" w:color="999999" w:sz="4" w:space="0"/>
+              <w:right w:val="single" w:color="999999" w:sz="4" w:space="0"/>
             </w:tcBorders>
+            <w:tcMar/>
           </w:tcPr>
           <w:p>
             <w:pPr>
@@ -418,11 +453,12 @@
             <w:cnfStyle w:val="001000000000" w:firstRow="0" w:lastRow="0" w:firstColumn="1" w:lastColumn="0" w:oddVBand="0" w:evenVBand="0" w:oddHBand="0" w:evenHBand="0" w:firstRowFirstColumn="0" w:firstRowLastColumn="0" w:lastRowFirstColumn="0" w:lastRowLastColumn="0"/>
             <w:tcW w:w="2547" w:type="dxa"/>
             <w:tcBorders>
-              <w:top w:val="single" w:sz="4" w:space="0" w:color="999999"/>
-              <w:left w:val="single" w:sz="4" w:space="0" w:color="999999"/>
-              <w:bottom w:val="single" w:sz="4" w:space="0" w:color="999999"/>
-              <w:right w:val="single" w:sz="4" w:space="0" w:color="999999"/>
+              <w:top w:val="single" w:color="999999" w:sz="4" w:space="0"/>
+              <w:left w:val="single" w:color="999999" w:sz="4" w:space="0"/>
+              <w:bottom w:val="single" w:color="999999" w:sz="4" w:space="0"/>
+              <w:right w:val="single" w:color="999999" w:sz="4" w:space="0"/>
             </w:tcBorders>
+            <w:tcMar/>
           </w:tcPr>
           <w:p>
             <w:pPr>
@@ -441,13 +477,15 @@
         </w:tc>
         <w:tc>
           <w:tcPr>
+            <w:cnfStyle w:val="000000000000" w:firstRow="0" w:lastRow="0" w:firstColumn="0" w:lastColumn="0" w:oddVBand="0" w:evenVBand="0" w:oddHBand="0" w:evenHBand="0" w:firstRowFirstColumn="0" w:firstRowLastColumn="0" w:lastRowFirstColumn="0" w:lastRowLastColumn="0"/>
             <w:tcW w:w="6469" w:type="dxa"/>
             <w:tcBorders>
-              <w:top w:val="single" w:sz="4" w:space="0" w:color="999999"/>
-              <w:left w:val="single" w:sz="4" w:space="0" w:color="999999"/>
-              <w:bottom w:val="single" w:sz="4" w:space="0" w:color="999999"/>
-              <w:right w:val="single" w:sz="4" w:space="0" w:color="999999"/>
+              <w:top w:val="single" w:color="999999" w:sz="4" w:space="0"/>
+              <w:left w:val="single" w:color="999999" w:sz="4" w:space="0"/>
+              <w:bottom w:val="single" w:color="999999" w:sz="4" w:space="0"/>
+              <w:right w:val="single" w:color="999999" w:sz="4" w:space="0"/>
             </w:tcBorders>
+            <w:tcMar/>
           </w:tcPr>
           <w:p>
             <w:pPr>
@@ -465,11 +503,12 @@
             <w:cnfStyle w:val="001000000000" w:firstRow="0" w:lastRow="0" w:firstColumn="1" w:lastColumn="0" w:oddVBand="0" w:evenVBand="0" w:oddHBand="0" w:evenHBand="0" w:firstRowFirstColumn="0" w:firstRowLastColumn="0" w:lastRowFirstColumn="0" w:lastRowLastColumn="0"/>
             <w:tcW w:w="2547" w:type="dxa"/>
             <w:tcBorders>
-              <w:top w:val="single" w:sz="4" w:space="0" w:color="999999"/>
-              <w:left w:val="single" w:sz="4" w:space="0" w:color="999999"/>
-              <w:bottom w:val="single" w:sz="4" w:space="0" w:color="999999"/>
-              <w:right w:val="single" w:sz="4" w:space="0" w:color="999999"/>
+              <w:top w:val="single" w:color="999999" w:sz="4" w:space="0"/>
+              <w:left w:val="single" w:color="999999" w:sz="4" w:space="0"/>
+              <w:bottom w:val="single" w:color="999999" w:sz="4" w:space="0"/>
+              <w:right w:val="single" w:color="999999" w:sz="4" w:space="0"/>
             </w:tcBorders>
+            <w:tcMar/>
           </w:tcPr>
           <w:p>
             <w:pPr>
@@ -485,13 +524,15 @@
         </w:tc>
         <w:tc>
           <w:tcPr>
+            <w:cnfStyle w:val="000000000000" w:firstRow="0" w:lastRow="0" w:firstColumn="0" w:lastColumn="0" w:oddVBand="0" w:evenVBand="0" w:oddHBand="0" w:evenHBand="0" w:firstRowFirstColumn="0" w:firstRowLastColumn="0" w:lastRowFirstColumn="0" w:lastRowLastColumn="0"/>
             <w:tcW w:w="6469" w:type="dxa"/>
             <w:tcBorders>
-              <w:top w:val="single" w:sz="4" w:space="0" w:color="999999"/>
-              <w:left w:val="single" w:sz="4" w:space="0" w:color="999999"/>
-              <w:bottom w:val="single" w:sz="4" w:space="0" w:color="999999"/>
-              <w:right w:val="single" w:sz="4" w:space="0" w:color="999999"/>
+              <w:top w:val="single" w:color="999999" w:sz="4" w:space="0"/>
+              <w:left w:val="single" w:color="999999" w:sz="4" w:space="0"/>
+              <w:bottom w:val="single" w:color="999999" w:sz="4" w:space="0"/>
+              <w:right w:val="single" w:color="999999" w:sz="4" w:space="0"/>
             </w:tcBorders>
+            <w:tcMar/>
           </w:tcPr>
           <w:p>
             <w:pPr>
@@ -514,11 +555,12 @@
             <w:cnfStyle w:val="001000000000" w:firstRow="0" w:lastRow="0" w:firstColumn="1" w:lastColumn="0" w:oddVBand="0" w:evenVBand="0" w:oddHBand="0" w:evenHBand="0" w:firstRowFirstColumn="0" w:firstRowLastColumn="0" w:lastRowFirstColumn="0" w:lastRowLastColumn="0"/>
             <w:tcW w:w="2547" w:type="dxa"/>
             <w:tcBorders>
-              <w:top w:val="single" w:sz="4" w:space="0" w:color="999999"/>
-              <w:left w:val="single" w:sz="4" w:space="0" w:color="999999"/>
-              <w:bottom w:val="single" w:sz="4" w:space="0" w:color="999999"/>
-              <w:right w:val="single" w:sz="4" w:space="0" w:color="999999"/>
+              <w:top w:val="single" w:color="999999" w:sz="4" w:space="0"/>
+              <w:left w:val="single" w:color="999999" w:sz="4" w:space="0"/>
+              <w:bottom w:val="single" w:color="999999" w:sz="4" w:space="0"/>
+              <w:right w:val="single" w:color="999999" w:sz="4" w:space="0"/>
             </w:tcBorders>
+            <w:tcMar/>
           </w:tcPr>
           <w:p>
             <w:pPr>
@@ -537,13 +579,15 @@
         </w:tc>
         <w:tc>
           <w:tcPr>
+            <w:cnfStyle w:val="000000000000" w:firstRow="0" w:lastRow="0" w:firstColumn="0" w:lastColumn="0" w:oddVBand="0" w:evenVBand="0" w:oddHBand="0" w:evenHBand="0" w:firstRowFirstColumn="0" w:firstRowLastColumn="0" w:lastRowFirstColumn="0" w:lastRowLastColumn="0"/>
             <w:tcW w:w="6469" w:type="dxa"/>
             <w:tcBorders>
-              <w:top w:val="single" w:sz="4" w:space="0" w:color="999999"/>
-              <w:left w:val="single" w:sz="4" w:space="0" w:color="999999"/>
-              <w:bottom w:val="single" w:sz="4" w:space="0" w:color="999999"/>
-              <w:right w:val="single" w:sz="4" w:space="0" w:color="999999"/>
+              <w:top w:val="single" w:color="999999" w:sz="4" w:space="0"/>
+              <w:left w:val="single" w:color="999999" w:sz="4" w:space="0"/>
+              <w:bottom w:val="single" w:color="999999" w:sz="4" w:space="0"/>
+              <w:right w:val="single" w:color="999999" w:sz="4" w:space="0"/>
             </w:tcBorders>
+            <w:tcMar/>
           </w:tcPr>
           <w:p>
             <w:pPr>
@@ -564,11 +608,12 @@
             <w:cnfStyle w:val="001000000000" w:firstRow="0" w:lastRow="0" w:firstColumn="1" w:lastColumn="0" w:oddVBand="0" w:evenVBand="0" w:oddHBand="0" w:evenHBand="0" w:firstRowFirstColumn="0" w:firstRowLastColumn="0" w:lastRowFirstColumn="0" w:lastRowLastColumn="0"/>
             <w:tcW w:w="2547" w:type="dxa"/>
             <w:tcBorders>
-              <w:top w:val="single" w:sz="4" w:space="0" w:color="999999"/>
-              <w:left w:val="single" w:sz="4" w:space="0" w:color="999999"/>
-              <w:bottom w:val="single" w:sz="4" w:space="0" w:color="999999"/>
-              <w:right w:val="single" w:sz="4" w:space="0" w:color="999999"/>
+              <w:top w:val="single" w:color="999999" w:sz="4" w:space="0"/>
+              <w:left w:val="single" w:color="999999" w:sz="4" w:space="0"/>
+              <w:bottom w:val="single" w:color="999999" w:sz="4" w:space="0"/>
+              <w:right w:val="single" w:color="999999" w:sz="4" w:space="0"/>
             </w:tcBorders>
+            <w:tcMar/>
             <w:hideMark/>
           </w:tcPr>
           <w:p>
@@ -582,13 +627,15 @@
         </w:tc>
         <w:tc>
           <w:tcPr>
+            <w:cnfStyle w:val="000000000000" w:firstRow="0" w:lastRow="0" w:firstColumn="0" w:lastColumn="0" w:oddVBand="0" w:evenVBand="0" w:oddHBand="0" w:evenHBand="0" w:firstRowFirstColumn="0" w:firstRowLastColumn="0" w:lastRowFirstColumn="0" w:lastRowLastColumn="0"/>
             <w:tcW w:w="6469" w:type="dxa"/>
             <w:tcBorders>
-              <w:top w:val="single" w:sz="4" w:space="0" w:color="999999"/>
-              <w:left w:val="single" w:sz="4" w:space="0" w:color="999999"/>
-              <w:bottom w:val="single" w:sz="4" w:space="0" w:color="999999"/>
-              <w:right w:val="single" w:sz="4" w:space="0" w:color="999999"/>
+              <w:top w:val="single" w:color="999999" w:sz="4" w:space="0"/>
+              <w:left w:val="single" w:color="999999" w:sz="4" w:space="0"/>
+              <w:bottom w:val="single" w:color="999999" w:sz="4" w:space="0"/>
+              <w:right w:val="single" w:color="999999" w:sz="4" w:space="0"/>
             </w:tcBorders>
+            <w:tcMar/>
             <w:hideMark/>
           </w:tcPr>
           <w:p>
@@ -608,11 +655,12 @@
             <w:cnfStyle w:val="001000000000" w:firstRow="0" w:lastRow="0" w:firstColumn="1" w:lastColumn="0" w:oddVBand="0" w:evenVBand="0" w:oddHBand="0" w:evenHBand="0" w:firstRowFirstColumn="0" w:firstRowLastColumn="0" w:lastRowFirstColumn="0" w:lastRowLastColumn="0"/>
             <w:tcW w:w="2547" w:type="dxa"/>
             <w:tcBorders>
-              <w:top w:val="single" w:sz="4" w:space="0" w:color="999999"/>
-              <w:left w:val="single" w:sz="4" w:space="0" w:color="999999"/>
-              <w:bottom w:val="single" w:sz="4" w:space="0" w:color="999999"/>
-              <w:right w:val="single" w:sz="4" w:space="0" w:color="999999"/>
+              <w:top w:val="single" w:color="999999" w:sz="4" w:space="0"/>
+              <w:left w:val="single" w:color="999999" w:sz="4" w:space="0"/>
+              <w:bottom w:val="single" w:color="999999" w:sz="4" w:space="0"/>
+              <w:right w:val="single" w:color="999999" w:sz="4" w:space="0"/>
             </w:tcBorders>
+            <w:tcMar/>
           </w:tcPr>
           <w:p>
             <w:pPr>
@@ -631,13 +679,15 @@
         </w:tc>
         <w:tc>
           <w:tcPr>
+            <w:cnfStyle w:val="000000000000" w:firstRow="0" w:lastRow="0" w:firstColumn="0" w:lastColumn="0" w:oddVBand="0" w:evenVBand="0" w:oddHBand="0" w:evenHBand="0" w:firstRowFirstColumn="0" w:firstRowLastColumn="0" w:lastRowFirstColumn="0" w:lastRowLastColumn="0"/>
             <w:tcW w:w="6469" w:type="dxa"/>
             <w:tcBorders>
-              <w:top w:val="single" w:sz="4" w:space="0" w:color="999999"/>
-              <w:left w:val="single" w:sz="4" w:space="0" w:color="999999"/>
-              <w:bottom w:val="single" w:sz="4" w:space="0" w:color="999999"/>
-              <w:right w:val="single" w:sz="4" w:space="0" w:color="999999"/>
+              <w:top w:val="single" w:color="999999" w:sz="4" w:space="0"/>
+              <w:left w:val="single" w:color="999999" w:sz="4" w:space="0"/>
+              <w:bottom w:val="single" w:color="999999" w:sz="4" w:space="0"/>
+              <w:right w:val="single" w:color="999999" w:sz="4" w:space="0"/>
             </w:tcBorders>
+            <w:tcMar/>
           </w:tcPr>
           <w:p>
             <w:pPr>
@@ -674,7 +724,17 @@
       </w:r>
     </w:p>
     <w:p>
+      <w:pPr>
+        <w:rPr>
+          <w:b/>
+          <w:bCs/>
+        </w:rPr>
+      </w:pPr>
       <w:r>
+        <w:rPr>
+          <w:b/>
+          <w:bCs/>
+        </w:rPr>
         <w:t>None.</w:t>
       </w:r>
     </w:p>
@@ -705,7 +765,7 @@
       <w:pPr>
         <w:jc w:val="center"/>
         <w:rPr>
-          <w:rFonts w:ascii="Calibri" w:eastAsia="Arial" w:hAnsi="Calibri" w:cs="Calibri"/>
+          <w:rFonts w:ascii="Calibri" w:hAnsi="Calibri" w:eastAsia="Arial" w:cs="Calibri"/>
           <w:b/>
           <w:bCs/>
           <w:color w:val="000000" w:themeColor="text1"/>
@@ -715,7 +775,7 @@
       </w:pPr>
       <w:r>
         <w:rPr>
-          <w:rFonts w:ascii="Calibri" w:eastAsia="Arial" w:hAnsi="Calibri" w:cs="Calibri"/>
+          <w:rFonts w:ascii="Calibri" w:hAnsi="Calibri" w:eastAsia="Arial" w:cs="Calibri"/>
           <w:b/>
           <w:bCs/>
           <w:color w:val="000000" w:themeColor="text1"/>
@@ -726,7 +786,7 @@
       </w:r>
       <w:r>
         <w:rPr>
-          <w:rFonts w:ascii="Calibri" w:eastAsia="Arial" w:hAnsi="Calibri" w:cs="Calibri"/>
+          <w:rFonts w:ascii="Calibri" w:hAnsi="Calibri" w:eastAsia="Arial" w:cs="Calibri"/>
           <w:b/>
           <w:bCs/>
           <w:color w:val="000000" w:themeColor="text1"/>
@@ -737,7 +797,7 @@
       </w:r>
       <w:r>
         <w:rPr>
-          <w:rFonts w:ascii="Calibri" w:eastAsia="Arial" w:hAnsi="Calibri" w:cs="Calibri"/>
+          <w:rFonts w:ascii="Calibri" w:hAnsi="Calibri" w:eastAsia="Arial" w:cs="Calibri"/>
           <w:b/>
           <w:bCs/>
           <w:color w:val="000000" w:themeColor="text1"/>
@@ -750,12 +810,12 @@
     <w:p>
       <w:pPr>
         <w:rPr>
-          <w:rFonts w:ascii="Calibri" w:eastAsia="Arial" w:hAnsi="Calibri" w:cs="Calibri"/>
+          <w:rFonts w:ascii="Calibri" w:hAnsi="Calibri" w:eastAsia="Arial" w:cs="Calibri"/>
         </w:rPr>
       </w:pPr>
       <w:r>
         <w:rPr>
-          <w:rFonts w:ascii="Calibri" w:eastAsia="Arial" w:hAnsi="Calibri" w:cs="Calibri"/>
+          <w:rFonts w:ascii="Calibri" w:hAnsi="Calibri" w:eastAsia="Arial" w:cs="Calibri"/>
         </w:rPr>
         <w:t>This Declaration must be completed and submitted along with your assessment. Please ensure sections 1 and 2 are completed before submission.</w:t>
       </w:r>
@@ -769,12 +829,12 @@
         </w:numPr>
         <w:spacing w:line="279" w:lineRule="auto"/>
         <w:rPr>
-          <w:rFonts w:ascii="Calibri" w:eastAsia="Arial" w:hAnsi="Calibri" w:cs="Calibri"/>
+          <w:rFonts w:ascii="Calibri" w:hAnsi="Calibri" w:eastAsia="Arial" w:cs="Calibri"/>
         </w:rPr>
       </w:pPr>
       <w:r>
         <w:rPr>
-          <w:rFonts w:ascii="Calibri" w:eastAsia="Arial" w:hAnsi="Calibri" w:cs="Calibri"/>
+          <w:rFonts w:ascii="Calibri" w:hAnsi="Calibri" w:eastAsia="Arial" w:cs="Calibri"/>
         </w:rPr>
         <w:t>For written assessments, insert the Declaration as the first page of your document.</w:t>
       </w:r>
@@ -788,12 +848,12 @@
         </w:numPr>
         <w:spacing w:line="279" w:lineRule="auto"/>
         <w:rPr>
-          <w:rFonts w:ascii="Calibri" w:eastAsia="Arial" w:hAnsi="Calibri" w:cs="Calibri"/>
+          <w:rFonts w:ascii="Calibri" w:hAnsi="Calibri" w:eastAsia="Arial" w:cs="Calibri"/>
         </w:rPr>
       </w:pPr>
       <w:r>
         <w:rPr>
-          <w:rFonts w:ascii="Calibri" w:eastAsia="Arial" w:hAnsi="Calibri" w:cs="Calibri"/>
+          <w:rFonts w:ascii="Calibri" w:hAnsi="Calibri" w:eastAsia="Arial" w:cs="Calibri"/>
         </w:rPr>
         <w:t>For assessments not in the written format (e.g. video, audio, presentation, or practical work), submit the Declaration as a separate file.</w:t>
       </w:r>
@@ -807,12 +867,12 @@
         </w:numPr>
         <w:spacing w:line="279" w:lineRule="auto"/>
         <w:rPr>
-          <w:rFonts w:ascii="Calibri" w:eastAsia="Arial" w:hAnsi="Calibri" w:cs="Calibri"/>
+          <w:rFonts w:ascii="Calibri" w:hAnsi="Calibri" w:eastAsia="Arial" w:cs="Calibri"/>
         </w:rPr>
       </w:pPr>
       <w:r>
         <w:rPr>
-          <w:rFonts w:ascii="Calibri" w:eastAsia="Arial" w:hAnsi="Calibri" w:cs="Calibri"/>
+          <w:rFonts w:ascii="Calibri" w:hAnsi="Calibri" w:eastAsia="Arial" w:cs="Calibri"/>
         </w:rPr>
         <w:lastRenderedPageBreak/>
         <w:t>For group assessments, unless otherwise directed by your lecturer, the group may submit a single shared declaration.</w:t>
@@ -823,10 +883,10 @@
         <w:tblStyle w:val="TableGrid"/>
         <w:tblW w:w="9344" w:type="dxa"/>
         <w:tblBorders>
-          <w:top w:val="single" w:sz="6" w:space="0" w:color="auto"/>
-          <w:left w:val="single" w:sz="6" w:space="0" w:color="auto"/>
-          <w:bottom w:val="single" w:sz="6" w:space="0" w:color="auto"/>
-          <w:right w:val="single" w:sz="6" w:space="0" w:color="auto"/>
+          <w:top w:val="single" w:color="auto" w:sz="6" w:space="0"/>
+          <w:left w:val="single" w:color="auto" w:sz="6" w:space="0"/>
+          <w:bottom w:val="single" w:color="auto" w:sz="6" w:space="0"/>
+          <w:right w:val="single" w:color="auto" w:sz="6" w:space="0"/>
         </w:tblBorders>
         <w:tblLayout w:type="fixed"/>
         <w:tblLook w:val="04A0" w:firstRow="1" w:lastRow="0" w:firstColumn="1" w:lastColumn="0" w:noHBand="0" w:noVBand="1"/>
@@ -844,10 +904,10 @@
             <w:tcW w:w="9344" w:type="dxa"/>
             <w:gridSpan w:val="2"/>
             <w:tcBorders>
-              <w:top w:val="single" w:sz="6" w:space="0" w:color="auto"/>
-              <w:left w:val="single" w:sz="6" w:space="0" w:color="auto"/>
-              <w:bottom w:val="single" w:sz="6" w:space="0" w:color="auto"/>
-              <w:right w:val="single" w:sz="6" w:space="0" w:color="auto"/>
+              <w:top w:val="single" w:color="auto" w:sz="6" w:space="0"/>
+              <w:left w:val="single" w:color="auto" w:sz="6" w:space="0"/>
+              <w:bottom w:val="single" w:color="auto" w:sz="6" w:space="0"/>
+              <w:right w:val="single" w:color="auto" w:sz="6" w:space="0"/>
             </w:tcBorders>
             <w:shd w:val="clear" w:color="auto" w:fill="F2F2F2" w:themeFill="background1" w:themeFillShade="F2"/>
             <w:tcMar>
@@ -864,7 +924,7 @@
                 <w:numId w:val="2"/>
               </w:numPr>
               <w:rPr>
-                <w:rFonts w:ascii="Calibri" w:eastAsia="Arial" w:hAnsi="Calibri" w:cs="Calibri"/>
+                <w:rFonts w:ascii="Calibri" w:hAnsi="Calibri" w:eastAsia="Arial" w:cs="Calibri"/>
                 <w:b/>
                 <w:bCs/>
                 <w:sz w:val="22"/>
@@ -874,7 +934,7 @@
             </w:pPr>
             <w:r>
               <w:rPr>
-                <w:rFonts w:ascii="Calibri" w:eastAsia="Arial" w:hAnsi="Calibri" w:cs="Calibri"/>
+                <w:rFonts w:ascii="Calibri" w:hAnsi="Calibri" w:eastAsia="Arial" w:cs="Calibri"/>
                 <w:b/>
                 <w:bCs/>
                 <w:sz w:val="22"/>
@@ -895,10 +955,10 @@
             <w:tcW w:w="9344" w:type="dxa"/>
             <w:gridSpan w:val="2"/>
             <w:tcBorders>
-              <w:top w:val="single" w:sz="6" w:space="0" w:color="auto"/>
-              <w:left w:val="single" w:sz="6" w:space="0" w:color="auto"/>
-              <w:bottom w:val="single" w:sz="6" w:space="0" w:color="auto"/>
-              <w:right w:val="single" w:sz="6" w:space="0" w:color="auto"/>
+              <w:top w:val="single" w:color="auto" w:sz="6" w:space="0"/>
+              <w:left w:val="single" w:color="auto" w:sz="6" w:space="0"/>
+              <w:bottom w:val="single" w:color="auto" w:sz="6" w:space="0"/>
+              <w:right w:val="single" w:color="auto" w:sz="6" w:space="0"/>
             </w:tcBorders>
             <w:shd w:val="clear" w:color="auto" w:fill="FFFFFF" w:themeFill="background1"/>
             <w:tcMar>
@@ -911,7 +971,7 @@
             <w:pPr>
               <w:spacing w:before="120"/>
               <w:rPr>
-                <w:rFonts w:ascii="Calibri" w:eastAsia="Arial" w:hAnsi="Calibri" w:cs="Calibri"/>
+                <w:rFonts w:ascii="Calibri" w:hAnsi="Calibri" w:eastAsia="Arial" w:cs="Calibri"/>
                 <w:sz w:val="22"/>
                 <w:szCs w:val="22"/>
                 <w:lang w:val="en-GB"/>
@@ -919,7 +979,7 @@
             </w:pPr>
             <w:r>
               <w:rPr>
-                <w:rFonts w:ascii="Calibri" w:eastAsia="Arial" w:hAnsi="Calibri" w:cs="Calibri"/>
+                <w:rFonts w:ascii="Calibri" w:hAnsi="Calibri" w:eastAsia="Arial" w:cs="Calibri"/>
                 <w:sz w:val="22"/>
                 <w:szCs w:val="22"/>
                 <w:lang w:val="en-GB"/>
@@ -930,7 +990,7 @@
               <w:r>
                 <w:rPr>
                   <w:rStyle w:val="Hyperlink"/>
-                  <w:rFonts w:ascii="Calibri" w:eastAsia="Arial" w:hAnsi="Calibri" w:cs="Calibri"/>
+                  <w:rFonts w:ascii="Calibri" w:hAnsi="Calibri" w:eastAsia="Arial" w:cs="Calibri"/>
                   <w:sz w:val="22"/>
                   <w:szCs w:val="22"/>
                   <w:lang w:val="en-GB"/>
@@ -944,7 +1004,7 @@
               <w:pStyle w:val="NoSpacing"/>
               <w:spacing w:before="120"/>
               <w:rPr>
-                <w:rFonts w:ascii="Calibri" w:eastAsia="Arial" w:hAnsi="Calibri" w:cs="Calibri"/>
+                <w:rFonts w:ascii="Calibri" w:hAnsi="Calibri" w:eastAsia="Arial" w:cs="Calibri"/>
                 <w:sz w:val="22"/>
                 <w:szCs w:val="22"/>
                 <w:lang w:val="en-GB"/>
@@ -952,7 +1012,7 @@
             </w:pPr>
             <w:r>
               <w:rPr>
-                <w:rFonts w:ascii="Calibri" w:eastAsia="Arial" w:hAnsi="Calibri" w:cs="Calibri"/>
+                <w:rFonts w:ascii="Calibri" w:hAnsi="Calibri" w:eastAsia="Arial" w:cs="Calibri"/>
                 <w:sz w:val="22"/>
                 <w:szCs w:val="22"/>
                 <w:lang w:val="en-GB"/>
@@ -964,7 +1024,7 @@
             <w:pPr>
               <w:spacing w:before="120" w:after="120"/>
               <w:rPr>
-                <w:rFonts w:ascii="Calibri" w:eastAsia="Arial" w:hAnsi="Calibri" w:cs="Calibri"/>
+                <w:rFonts w:ascii="Calibri" w:hAnsi="Calibri" w:eastAsia="Arial" w:cs="Calibri"/>
                 <w:sz w:val="22"/>
                 <w:szCs w:val="22"/>
                 <w:lang w:val="en-GB"/>
@@ -972,7 +1032,7 @@
             </w:pPr>
             <w:r>
               <w:rPr>
-                <w:rFonts w:ascii="Calibri" w:eastAsia="Arial" w:hAnsi="Calibri" w:cs="Calibri"/>
+                <w:rFonts w:ascii="Calibri" w:hAnsi="Calibri" w:eastAsia="Arial" w:cs="Calibri"/>
                 <w:sz w:val="22"/>
                 <w:szCs w:val="22"/>
                 <w:lang w:val="en-GB"/>
@@ -990,10 +1050,10 @@
           <w:tcPr>
             <w:tcW w:w="4665" w:type="dxa"/>
             <w:tcBorders>
-              <w:top w:val="single" w:sz="6" w:space="0" w:color="auto"/>
-              <w:left w:val="single" w:sz="6" w:space="0" w:color="auto"/>
-              <w:bottom w:val="single" w:sz="6" w:space="0" w:color="auto"/>
-              <w:right w:val="single" w:sz="6" w:space="0" w:color="auto"/>
+              <w:top w:val="single" w:color="auto" w:sz="6" w:space="0"/>
+              <w:left w:val="single" w:color="auto" w:sz="6" w:space="0"/>
+              <w:bottom w:val="single" w:color="auto" w:sz="6" w:space="0"/>
+              <w:right w:val="single" w:color="auto" w:sz="6" w:space="0"/>
             </w:tcBorders>
             <w:tcMar>
               <w:left w:w="90" w:type="dxa"/>
@@ -1005,7 +1065,7 @@
             <w:pPr>
               <w:spacing w:before="120" w:after="120"/>
               <w:rPr>
-                <w:rFonts w:ascii="Calibri" w:eastAsia="Arial" w:hAnsi="Calibri" w:cs="Calibri"/>
+                <w:rFonts w:ascii="Calibri" w:hAnsi="Calibri" w:eastAsia="Arial" w:cs="Calibri"/>
                 <w:sz w:val="22"/>
                 <w:szCs w:val="22"/>
                 <w:lang w:val="en-GB"/>
@@ -1013,7 +1073,7 @@
             </w:pPr>
             <w:r>
               <w:rPr>
-                <w:rFonts w:ascii="Calibri" w:eastAsia="Arial" w:hAnsi="Calibri" w:cs="Calibri"/>
+                <w:rFonts w:ascii="Calibri" w:hAnsi="Calibri" w:eastAsia="Arial" w:cs="Calibri"/>
                 <w:sz w:val="22"/>
                 <w:szCs w:val="22"/>
                 <w:lang w:val="en-GB"/>
@@ -1026,10 +1086,10 @@
           <w:tcPr>
             <w:tcW w:w="4679" w:type="dxa"/>
             <w:tcBorders>
-              <w:top w:val="single" w:sz="6" w:space="0" w:color="auto"/>
-              <w:left w:val="single" w:sz="6" w:space="0" w:color="auto"/>
-              <w:bottom w:val="single" w:sz="6" w:space="0" w:color="auto"/>
-              <w:right w:val="single" w:sz="6" w:space="0" w:color="auto"/>
+              <w:top w:val="single" w:color="auto" w:sz="6" w:space="0"/>
+              <w:left w:val="single" w:color="auto" w:sz="6" w:space="0"/>
+              <w:bottom w:val="single" w:color="auto" w:sz="6" w:space="0"/>
+              <w:right w:val="single" w:color="auto" w:sz="6" w:space="0"/>
             </w:tcBorders>
             <w:tcMar>
               <w:left w:w="90" w:type="dxa"/>
@@ -1041,7 +1101,7 @@
             <w:pPr>
               <w:spacing w:after="120"/>
               <w:rPr>
-                <w:rFonts w:ascii="Calibri" w:eastAsia="Arial" w:hAnsi="Calibri" w:cs="Calibri"/>
+                <w:rFonts w:ascii="Calibri" w:hAnsi="Calibri" w:eastAsia="Arial" w:cs="Calibri"/>
                 <w:sz w:val="22"/>
                 <w:szCs w:val="22"/>
                 <w:lang w:val="en-GB"/>
@@ -1049,7 +1109,7 @@
             </w:pPr>
             <w:r>
               <w:rPr>
-                <w:rFonts w:ascii="Calibri" w:eastAsia="Arial" w:hAnsi="Calibri" w:cs="Calibri"/>
+                <w:rFonts w:ascii="Calibri" w:hAnsi="Calibri" w:eastAsia="Arial" w:cs="Calibri"/>
                 <w:b/>
                 <w:bCs/>
                 <w:sz w:val="22"/>
@@ -1060,7 +1120,7 @@
             </w:r>
             <w:r>
               <w:rPr>
-                <w:rFonts w:ascii="Calibri" w:eastAsia="Arial" w:hAnsi="Calibri" w:cs="Calibri"/>
+                <w:rFonts w:ascii="Calibri" w:hAnsi="Calibri" w:eastAsia="Arial" w:cs="Calibri"/>
                 <w:sz w:val="22"/>
                 <w:szCs w:val="22"/>
                 <w:lang w:val="en-GB"/>
@@ -1079,10 +1139,10 @@
             <w:tcW w:w="9344" w:type="dxa"/>
             <w:gridSpan w:val="2"/>
             <w:tcBorders>
-              <w:top w:val="single" w:sz="6" w:space="0" w:color="auto"/>
-              <w:left w:val="single" w:sz="6" w:space="0" w:color="auto"/>
-              <w:bottom w:val="single" w:sz="6" w:space="0" w:color="auto"/>
-              <w:right w:val="single" w:sz="6" w:space="0" w:color="auto"/>
+              <w:top w:val="single" w:color="auto" w:sz="6" w:space="0"/>
+              <w:left w:val="single" w:color="auto" w:sz="6" w:space="0"/>
+              <w:bottom w:val="single" w:color="auto" w:sz="6" w:space="0"/>
+              <w:right w:val="single" w:color="auto" w:sz="6" w:space="0"/>
             </w:tcBorders>
             <w:shd w:val="clear" w:color="auto" w:fill="F2F2F2" w:themeFill="background1" w:themeFillShade="F2"/>
             <w:tcMar>
@@ -1098,7 +1158,7 @@
                 <w:numId w:val="2"/>
               </w:numPr>
               <w:rPr>
-                <w:rFonts w:ascii="Calibri" w:eastAsia="Arial" w:hAnsi="Calibri" w:cs="Calibri"/>
+                <w:rFonts w:ascii="Calibri" w:hAnsi="Calibri" w:eastAsia="Arial" w:cs="Calibri"/>
                 <w:b/>
                 <w:bCs/>
                 <w:lang w:val="en-GB"/>
@@ -1106,7 +1166,7 @@
             </w:pPr>
             <w:r>
               <w:rPr>
-                <w:rFonts w:ascii="Calibri" w:eastAsia="Arial" w:hAnsi="Calibri" w:cs="Calibri"/>
+                <w:rFonts w:ascii="Calibri" w:hAnsi="Calibri" w:eastAsia="Arial" w:cs="Calibri"/>
                 <w:b/>
                 <w:bCs/>
                 <w:sz w:val="22"/>
@@ -1127,10 +1187,10 @@
             <w:tcW w:w="9344" w:type="dxa"/>
             <w:gridSpan w:val="2"/>
             <w:tcBorders>
-              <w:top w:val="single" w:sz="6" w:space="0" w:color="auto"/>
-              <w:left w:val="single" w:sz="6" w:space="0" w:color="auto"/>
-              <w:bottom w:val="single" w:sz="6" w:space="0" w:color="auto"/>
-              <w:right w:val="single" w:sz="6" w:space="0" w:color="auto"/>
+              <w:top w:val="single" w:color="auto" w:sz="6" w:space="0"/>
+              <w:left w:val="single" w:color="auto" w:sz="6" w:space="0"/>
+              <w:bottom w:val="single" w:color="auto" w:sz="6" w:space="0"/>
+              <w:right w:val="single" w:color="auto" w:sz="6" w:space="0"/>
             </w:tcBorders>
             <w:tcMar>
               <w:left w:w="90" w:type="dxa"/>
@@ -1141,7 +1201,7 @@
             <w:pPr>
               <w:spacing w:before="120" w:after="120"/>
               <w:rPr>
-                <w:rFonts w:ascii="Calibri" w:eastAsia="Arial" w:hAnsi="Calibri" w:cs="Calibri"/>
+                <w:rFonts w:ascii="Calibri" w:hAnsi="Calibri" w:eastAsia="Arial" w:cs="Calibri"/>
                 <w:sz w:val="22"/>
                 <w:szCs w:val="22"/>
                 <w:lang w:val="en-GB"/>
@@ -1149,7 +1209,7 @@
             </w:pPr>
             <w:r>
               <w:rPr>
-                <w:rFonts w:ascii="Calibri" w:eastAsia="Arial" w:hAnsi="Calibri" w:cs="Calibri"/>
+                <w:rFonts w:ascii="Calibri" w:hAnsi="Calibri" w:eastAsia="Arial" w:cs="Calibri"/>
                 <w:sz w:val="22"/>
                 <w:szCs w:val="22"/>
                 <w:lang w:val="en-GB"/>
@@ -1167,10 +1227,10 @@
           <w:tcPr>
             <w:tcW w:w="4665" w:type="dxa"/>
             <w:tcBorders>
-              <w:top w:val="single" w:sz="6" w:space="0" w:color="auto"/>
-              <w:left w:val="single" w:sz="6" w:space="0" w:color="auto"/>
-              <w:bottom w:val="single" w:sz="6" w:space="0" w:color="auto"/>
-              <w:right w:val="single" w:sz="6" w:space="0" w:color="auto"/>
+              <w:top w:val="single" w:color="auto" w:sz="6" w:space="0"/>
+              <w:left w:val="single" w:color="auto" w:sz="6" w:space="0"/>
+              <w:bottom w:val="single" w:color="auto" w:sz="6" w:space="0"/>
+              <w:right w:val="single" w:color="auto" w:sz="6" w:space="0"/>
             </w:tcBorders>
             <w:tcMar>
               <w:left w:w="90" w:type="dxa"/>
@@ -1181,7 +1241,7 @@
             <w:pPr>
               <w:spacing w:before="120" w:after="120" w:line="278" w:lineRule="auto"/>
               <w:rPr>
-                <w:rFonts w:ascii="Calibri" w:eastAsia="Arial" w:hAnsi="Calibri" w:cs="Calibri"/>
+                <w:rFonts w:ascii="Calibri" w:hAnsi="Calibri" w:eastAsia="Arial" w:cs="Calibri"/>
                 <w:sz w:val="22"/>
                 <w:szCs w:val="22"/>
                 <w:lang w:val="en-GB"/>
@@ -1189,7 +1249,7 @@
             </w:pPr>
             <w:r>
               <w:rPr>
-                <w:rFonts w:ascii="Calibri" w:eastAsia="Arial" w:hAnsi="Calibri" w:cs="Calibri"/>
+                <w:rFonts w:ascii="Calibri" w:hAnsi="Calibri" w:eastAsia="Arial" w:cs="Calibri"/>
                 <w:sz w:val="22"/>
                 <w:szCs w:val="22"/>
                 <w:lang w:val="en-GB"/>
@@ -1202,10 +1262,10 @@
           <w:tcPr>
             <w:tcW w:w="4679" w:type="dxa"/>
             <w:tcBorders>
-              <w:top w:val="single" w:sz="6" w:space="0" w:color="auto"/>
-              <w:left w:val="single" w:sz="6" w:space="0" w:color="auto"/>
-              <w:bottom w:val="single" w:sz="6" w:space="0" w:color="auto"/>
-              <w:right w:val="single" w:sz="6" w:space="0" w:color="auto"/>
+              <w:top w:val="single" w:color="auto" w:sz="6" w:space="0"/>
+              <w:left w:val="single" w:color="auto" w:sz="6" w:space="0"/>
+              <w:bottom w:val="single" w:color="auto" w:sz="6" w:space="0"/>
+              <w:right w:val="single" w:color="auto" w:sz="6" w:space="0"/>
             </w:tcBorders>
             <w:tcMar>
               <w:left w:w="90" w:type="dxa"/>
@@ -1218,7 +1278,7 @@
               <w:pStyle w:val="NoSpacing"/>
               <w:spacing w:after="120"/>
               <w:rPr>
-                <w:rFonts w:ascii="Calibri" w:eastAsia="Arial" w:hAnsi="Calibri" w:cs="Calibri"/>
+                <w:rFonts w:ascii="Calibri" w:hAnsi="Calibri" w:eastAsia="Arial" w:cs="Calibri"/>
                 <w:sz w:val="22"/>
                 <w:szCs w:val="22"/>
                 <w:lang w:val="en-GB"/>
@@ -1226,7 +1286,7 @@
             </w:pPr>
             <w:r>
               <w:rPr>
-                <w:rFonts w:ascii="Calibri" w:eastAsia="Arial" w:hAnsi="Calibri" w:cs="Calibri"/>
+                <w:rFonts w:ascii="Calibri" w:hAnsi="Calibri" w:eastAsia="Arial" w:cs="Calibri"/>
                 <w:b/>
                 <w:bCs/>
                 <w:sz w:val="22"/>
@@ -1237,7 +1297,7 @@
             </w:r>
             <w:r>
               <w:rPr>
-                <w:rFonts w:ascii="Calibri" w:eastAsia="Arial" w:hAnsi="Calibri" w:cs="Calibri"/>
+                <w:rFonts w:ascii="Calibri" w:hAnsi="Calibri" w:eastAsia="Arial" w:cs="Calibri"/>
                 <w:sz w:val="22"/>
                 <w:szCs w:val="22"/>
                 <w:lang w:val="en-GB"/>
@@ -1256,10 +1316,10 @@
             <w:tcW w:w="9344" w:type="dxa"/>
             <w:gridSpan w:val="2"/>
             <w:tcBorders>
-              <w:top w:val="single" w:sz="6" w:space="0" w:color="auto"/>
-              <w:left w:val="single" w:sz="6" w:space="0" w:color="auto"/>
-              <w:bottom w:val="single" w:sz="6" w:space="0" w:color="auto"/>
-              <w:right w:val="single" w:sz="6" w:space="0" w:color="auto"/>
+              <w:top w:val="single" w:color="auto" w:sz="6" w:space="0"/>
+              <w:left w:val="single" w:color="auto" w:sz="6" w:space="0"/>
+              <w:bottom w:val="single" w:color="auto" w:sz="6" w:space="0"/>
+              <w:right w:val="single" w:color="auto" w:sz="6" w:space="0"/>
             </w:tcBorders>
             <w:tcMar>
               <w:left w:w="90" w:type="dxa"/>
@@ -1270,7 +1330,7 @@
             <w:pPr>
               <w:spacing w:before="120" w:line="278" w:lineRule="auto"/>
               <w:rPr>
-                <w:rFonts w:ascii="Calibri" w:eastAsia="Arial" w:hAnsi="Calibri" w:cs="Calibri"/>
+                <w:rFonts w:ascii="Calibri" w:hAnsi="Calibri" w:eastAsia="Arial" w:cs="Calibri"/>
                 <w:sz w:val="22"/>
                 <w:szCs w:val="22"/>
                 <w:lang w:val="en-GB"/>
@@ -1278,7 +1338,7 @@
             </w:pPr>
             <w:r>
               <w:rPr>
-                <w:rFonts w:ascii="Calibri" w:eastAsia="Arial" w:hAnsi="Calibri" w:cs="Calibri"/>
+                <w:rFonts w:ascii="Calibri" w:hAnsi="Calibri" w:eastAsia="Arial" w:cs="Calibri"/>
                 <w:sz w:val="22"/>
                 <w:szCs w:val="22"/>
                 <w:lang w:val="en-GB"/>
@@ -1287,7 +1347,7 @@
             </w:r>
             <w:r>
               <w:rPr>
-                <w:rFonts w:ascii="Calibri" w:eastAsia="Arial" w:hAnsi="Calibri" w:cs="Calibri"/>
+                <w:rFonts w:ascii="Calibri" w:hAnsi="Calibri" w:eastAsia="Arial" w:cs="Calibri"/>
                 <w:b/>
                 <w:bCs/>
                 <w:sz w:val="22"/>
@@ -1298,7 +1358,7 @@
             </w:r>
             <w:r>
               <w:rPr>
-                <w:rFonts w:ascii="Calibri" w:eastAsia="Arial" w:hAnsi="Calibri" w:cs="Calibri"/>
+                <w:rFonts w:ascii="Calibri" w:hAnsi="Calibri" w:eastAsia="Arial" w:cs="Calibri"/>
                 <w:sz w:val="22"/>
                 <w:szCs w:val="22"/>
                 <w:lang w:val="en-GB"/>
@@ -1310,7 +1370,7 @@
             <w:pPr>
               <w:spacing w:line="278" w:lineRule="auto"/>
               <w:rPr>
-                <w:rFonts w:ascii="Calibri" w:eastAsia="Arial" w:hAnsi="Calibri" w:cs="Calibri"/>
+                <w:rFonts w:ascii="Calibri" w:hAnsi="Calibri" w:eastAsia="Arial" w:cs="Calibri"/>
                 <w:sz w:val="22"/>
                 <w:szCs w:val="22"/>
                 <w:lang w:val="en-GB"/>
@@ -1321,7 +1381,7 @@
             <w:pPr>
               <w:spacing w:line="278" w:lineRule="auto"/>
               <w:rPr>
-                <w:rFonts w:ascii="Calibri" w:eastAsia="Arial" w:hAnsi="Calibri" w:cs="Calibri"/>
+                <w:rFonts w:ascii="Calibri" w:hAnsi="Calibri" w:eastAsia="Arial" w:cs="Calibri"/>
                 <w:sz w:val="22"/>
                 <w:szCs w:val="22"/>
                 <w:lang w:val="en-GB"/>
@@ -1335,7 +1395,7 @@
       <w:pPr>
         <w:spacing w:before="120" w:after="120"/>
         <w:rPr>
-          <w:rFonts w:ascii="Calibri" w:eastAsia="Arial" w:hAnsi="Calibri" w:cs="Calibri"/>
+          <w:rFonts w:ascii="Calibri" w:hAnsi="Calibri" w:eastAsia="Arial" w:cs="Calibri"/>
           <w:b/>
           <w:bCs/>
           <w:i/>
@@ -1344,7 +1404,7 @@
       </w:pPr>
       <w:r>
         <w:rPr>
-          <w:rFonts w:ascii="Calibri" w:eastAsia="Arial" w:hAnsi="Calibri" w:cs="Calibri"/>
+          <w:rFonts w:ascii="Calibri" w:hAnsi="Calibri" w:eastAsia="Arial" w:cs="Calibri"/>
           <w:b/>
           <w:bCs/>
           <w:i/>
@@ -1356,7 +1416,7 @@
     <w:p>
       <w:r>
         <w:rPr>
-          <w:rFonts w:ascii="Calibri" w:eastAsia="Arial" w:hAnsi="Calibri" w:cs="Calibri"/>
+          <w:rFonts w:ascii="Calibri" w:hAnsi="Calibri" w:eastAsia="Arial" w:cs="Calibri"/>
           <w:i/>
           <w:iCs/>
         </w:rPr>
@@ -1364,7 +1424,7 @@
       </w:r>
       <w:r>
         <w:rPr>
-          <w:rFonts w:ascii="Calibri" w:eastAsia="Arial" w:hAnsi="Calibri" w:cs="Calibri"/>
+          <w:rFonts w:ascii="Calibri" w:hAnsi="Calibri" w:eastAsia="Arial" w:cs="Calibri"/>
           <w:i/>
           <w:iCs/>
         </w:rPr>
@@ -1372,7 +1432,7 @@
       </w:r>
       <w:r>
         <w:rPr>
-          <w:rFonts w:ascii="Calibri" w:eastAsia="Arial" w:hAnsi="Calibri" w:cs="Calibri"/>
+          <w:rFonts w:ascii="Calibri" w:hAnsi="Calibri" w:eastAsia="Arial" w:cs="Calibri"/>
           <w:i/>
           <w:iCs/>
         </w:rPr>
@@ -1382,7 +1442,7 @@
         <w:r>
           <w:rPr>
             <w:rStyle w:val="Hyperlink"/>
-            <w:rFonts w:ascii="Calibri" w:eastAsia="Arial" w:hAnsi="Calibri" w:cs="Calibri"/>
+            <w:rFonts w:ascii="Calibri" w:hAnsi="Calibri" w:eastAsia="Arial" w:cs="Calibri"/>
             <w:i/>
             <w:iCs/>
           </w:rPr>
@@ -1391,7 +1451,7 @@
       </w:hyperlink>
       <w:r>
         <w:rPr>
-          <w:rFonts w:ascii="Calibri" w:eastAsia="Arial" w:hAnsi="Calibri" w:cs="Calibri"/>
+          <w:rFonts w:ascii="Calibri" w:hAnsi="Calibri" w:eastAsia="Arial" w:cs="Calibri"/>
           <w:i/>
           <w:iCs/>
         </w:rPr>
@@ -1399,7 +1459,7 @@
       </w:r>
       <w:r>
         <w:rPr>
-          <w:rFonts w:ascii="Calibri" w:eastAsia="Arial" w:hAnsi="Calibri" w:cs="Calibri"/>
+          <w:rFonts w:ascii="Calibri" w:hAnsi="Calibri" w:eastAsia="Arial" w:cs="Calibri"/>
           <w:i/>
           <w:iCs/>
         </w:rPr>
@@ -1410,7 +1470,7 @@
     <w:sectPr>
       <w:headerReference w:type="default" r:id="rId11"/>
       <w:footerReference w:type="default" r:id="rId12"/>
-      <w:pgSz w:w="11906" w:h="16838"/>
+      <w:pgSz w:w="11906" w:h="16838" w:orient="portrait"/>
       <w:pgMar w:top="1440" w:right="1440" w:bottom="1440" w:left="1440" w:header="708" w:footer="708" w:gutter="0"/>
       <w:cols w:space="708"/>
       <w:docGrid w:linePitch="360"/>
@@ -1454,7 +1514,7 @@
       <w:t xml:space="preserve"> </w:t>
     </w:r>
     <w:r>
-      <w:ptab w:relativeTo="margin" w:alignment="center" w:leader="none"/>
+      <w:ptab w:alignment="center" w:relativeTo="margin" w:leader="none"/>
     </w:r>
     <w:r>
       <w:fldChar w:fldCharType="begin"/>
@@ -1472,11 +1532,11 @@
       <w:fldChar w:fldCharType="end"/>
     </w:r>
     <w:r>
-      <w:ptab w:relativeTo="margin" w:alignment="right" w:leader="none"/>
+      <w:ptab w:alignment="right" w:relativeTo="margin" w:leader="none"/>
     </w:r>
     <w:r>
       <w:rPr>
-        <w:rFonts w:ascii="Calibri" w:eastAsia="Times New Roman" w:hAnsi="Calibri" w:cs="Calibri"/>
+        <w:rFonts w:ascii="Calibri" w:hAnsi="Calibri" w:eastAsia="Times New Roman" w:cs="Calibri"/>
         <w:color w:val="000000"/>
         <w:kern w:val="0"/>
         <w:lang w:eastAsia="en-GB"/>
@@ -1486,7 +1546,7 @@
     </w:r>
     <w:r>
       <w:rPr>
-        <w:rFonts w:ascii="Calibri" w:eastAsia="Times New Roman" w:hAnsi="Calibri" w:cs="Calibri"/>
+        <w:rFonts w:ascii="Calibri" w:hAnsi="Calibri" w:eastAsia="Times New Roman" w:cs="Calibri"/>
         <w:color w:val="000000"/>
         <w:kern w:val="0"/>
         <w:lang w:eastAsia="en-GB"/>
@@ -1496,7 +1556,7 @@
     </w:r>
     <w:r>
       <w:rPr>
-        <w:rFonts w:ascii="Calibri" w:eastAsia="Times New Roman" w:hAnsi="Calibri" w:cs="Calibri"/>
+        <w:rFonts w:ascii="Calibri" w:hAnsi="Calibri" w:eastAsia="Times New Roman" w:cs="Calibri"/>
         <w:color w:val="000000"/>
         <w:kern w:val="0"/>
         <w:lang w:eastAsia="en-GB"/>
@@ -1539,7 +1599,7 @@
     <w:pPr>
       <w:spacing w:after="0" w:line="240" w:lineRule="auto"/>
       <w:rPr>
-        <w:rFonts w:ascii="Calibri" w:eastAsia="Times New Roman" w:hAnsi="Calibri" w:cs="Calibri"/>
+        <w:rFonts w:ascii="Calibri" w:hAnsi="Calibri" w:eastAsia="Times New Roman" w:cs="Calibri"/>
         <w:color w:val="000000"/>
         <w:kern w:val="0"/>
         <w:lang w:eastAsia="en-GB"/>
@@ -1548,7 +1608,7 @@
     </w:pPr>
     <w:r>
       <w:rPr>
-        <w:rFonts w:ascii="Calibri" w:eastAsia="Times New Roman" w:hAnsi="Calibri" w:cs="Calibri"/>
+        <w:rFonts w:ascii="Calibri" w:hAnsi="Calibri" w:eastAsia="Times New Roman" w:cs="Calibri"/>
         <w:color w:val="000000"/>
         <w:kern w:val="0"/>
         <w:lang w:eastAsia="en-GB"/>
@@ -1558,7 +1618,7 @@
     </w:r>
     <w:r>
       <w:rPr>
-        <w:rFonts w:ascii="Calibri" w:eastAsia="Times New Roman" w:hAnsi="Calibri" w:cs="Calibri"/>
+        <w:rFonts w:ascii="Calibri" w:hAnsi="Calibri" w:eastAsia="Times New Roman" w:cs="Calibri"/>
         <w:color w:val="000000"/>
         <w:kern w:val="0"/>
         <w:lang w:eastAsia="en-GB"/>
@@ -1568,7 +1628,7 @@
     </w:r>
     <w:r>
       <w:rPr>
-        <w:rFonts w:ascii="Calibri" w:eastAsia="Times New Roman" w:hAnsi="Calibri" w:cs="Calibri"/>
+        <w:rFonts w:ascii="Calibri" w:hAnsi="Calibri" w:eastAsia="Times New Roman" w:cs="Calibri"/>
         <w:color w:val="000000"/>
         <w:kern w:val="0"/>
         <w:lang w:eastAsia="en-GB"/>
@@ -1578,7 +1638,7 @@
     </w:r>
     <w:r>
       <w:rPr>
-        <w:rFonts w:ascii="Calibri" w:eastAsia="Times New Roman" w:hAnsi="Calibri" w:cs="Calibri"/>
+        <w:rFonts w:ascii="Calibri" w:hAnsi="Calibri" w:eastAsia="Times New Roman" w:cs="Calibri"/>
         <w:color w:val="000000"/>
         <w:kern w:val="0"/>
         <w:lang w:eastAsia="en-GB"/>
@@ -1588,7 +1648,7 @@
     </w:r>
     <w:r>
       <w:rPr>
-        <w:rFonts w:ascii="Calibri" w:eastAsia="Times New Roman" w:hAnsi="Calibri" w:cs="Calibri"/>
+        <w:rFonts w:ascii="Calibri" w:hAnsi="Calibri" w:eastAsia="Times New Roman" w:cs="Calibri"/>
         <w:color w:val="000000"/>
         <w:kern w:val="0"/>
         <w:lang w:eastAsia="en-GB"/>
@@ -1598,7 +1658,7 @@
     </w:r>
     <w:r>
       <w:rPr>
-        <w:rFonts w:ascii="Calibri" w:eastAsia="Times New Roman" w:hAnsi="Calibri" w:cs="Calibri"/>
+        <w:rFonts w:ascii="Calibri" w:hAnsi="Calibri" w:eastAsia="Times New Roman" w:cs="Calibri"/>
         <w:color w:val="000000"/>
         <w:kern w:val="0"/>
         <w:lang w:eastAsia="en-GB"/>
@@ -1608,7 +1668,7 @@
     </w:r>
     <w:r>
       <w:rPr>
-        <w:rFonts w:ascii="Calibri" w:eastAsia="Times New Roman" w:hAnsi="Calibri" w:cs="Calibri"/>
+        <w:rFonts w:ascii="Calibri" w:hAnsi="Calibri" w:eastAsia="Times New Roman" w:cs="Calibri"/>
         <w:color w:val="000000"/>
         <w:kern w:val="0"/>
         <w:lang w:eastAsia="en-GB"/>
@@ -1618,7 +1678,7 @@
     </w:r>
     <w:r>
       <w:rPr>
-        <w:rFonts w:ascii="Calibri" w:eastAsia="Times New Roman" w:hAnsi="Calibri" w:cs="Calibri"/>
+        <w:rFonts w:ascii="Calibri" w:hAnsi="Calibri" w:eastAsia="Times New Roman" w:cs="Calibri"/>
         <w:color w:val="000000"/>
         <w:kern w:val="0"/>
         <w:lang w:eastAsia="en-GB"/>
@@ -1628,7 +1688,7 @@
     </w:r>
     <w:r>
       <w:rPr>
-        <w:rFonts w:ascii="Calibri" w:eastAsia="Times New Roman" w:hAnsi="Calibri" w:cs="Calibri"/>
+        <w:rFonts w:ascii="Calibri" w:hAnsi="Calibri" w:eastAsia="Times New Roman" w:cs="Calibri"/>
         <w:color w:val="000000"/>
         <w:kern w:val="0"/>
         <w:lang w:eastAsia="en-GB"/>
@@ -1638,7 +1698,7 @@
     </w:r>
     <w:r>
       <w:rPr>
-        <w:rFonts w:ascii="Calibri" w:eastAsia="Times New Roman" w:hAnsi="Calibri" w:cs="Calibri"/>
+        <w:rFonts w:ascii="Calibri" w:hAnsi="Calibri" w:eastAsia="Times New Roman" w:cs="Calibri"/>
         <w:color w:val="000000"/>
         <w:kern w:val="0"/>
         <w:lang w:eastAsia="en-GB"/>
@@ -1657,6 +1717,118 @@
 
 <file path=word/numbering.xml><?xml version="1.0" encoding="utf-8"?>
 <w:numbering xmlns:wpc="http://schemas.microsoft.com/office/word/2010/wordprocessingCanvas" xmlns:cx="http://schemas.microsoft.com/office/drawing/2014/chartex" xmlns:cx1="http://schemas.microsoft.com/office/drawing/2015/9/8/chartex" xmlns:cx2="http://schemas.microsoft.com/office/drawing/2015/10/21/chartex" xmlns:cx3="http://schemas.microsoft.com/office/drawing/2016/5/9/chartex" xmlns:cx4="http://schemas.microsoft.com/office/drawing/2016/5/10/chartex" xmlns:cx5="http://schemas.microsoft.com/office/drawing/2016/5/11/chartex" xmlns:cx6="http://schemas.microsoft.com/office/drawing/2016/5/12/chartex" xmlns:cx7="http://schemas.microsoft.com/office/drawing/2016/5/13/chartex" xmlns:cx8="http://schemas.microsoft.com/office/drawing/2016/5/14/chartex" xmlns:mc="http://schemas.openxmlformats.org/markup-compatibility/2006" xmlns:aink="http://schemas.microsoft.com/office/drawing/2016/ink" xmlns:am3d="http://schemas.microsoft.com/office/drawing/2017/model3d" xmlns:o="urn:schemas-microsoft-com:office:office" xmlns:oel="http://schemas.microsoft.com/office/2019/extlst" xmlns:r="http://schemas.openxmlformats.org/officeDocument/2006/relationships" xmlns:m="http://schemas.openxmlformats.org/officeDocument/2006/math" xmlns:v="urn:schemas-microsoft-com:vml" xmlns:wp14="http://schemas.microsoft.com/office/word/2010/wordprocessingDrawing" xmlns:wp="http://schemas.openxmlformats.org/drawingml/2006/wordprocessingDrawing" xmlns:w10="urn:schemas-microsoft-com:office:word" xmlns:w="http://schemas.openxmlformats.org/wordprocessingml/2006/main" xmlns:w14="http://schemas.microsoft.com/office/word/2010/wordml" xmlns:w15="http://schemas.microsoft.com/office/word/2012/wordml" xmlns:w16cex="http://schemas.microsoft.com/office/word/2018/wordml/cex" xmlns:w16cid="http://schemas.microsoft.com/office/word/2016/wordml/cid" xmlns:w16="http://schemas.microsoft.com/office/word/2018/wordml" xmlns:w16du="http://schemas.microsoft.com/office/word/2023/wordml/word16du" xmlns:w16sdtdh="http://schemas.microsoft.com/office/word/2020/wordml/sdtdatahash" xmlns:w16sdtfl="http://schemas.microsoft.com/office/word/2024/wordml/sdtformatlock" xmlns:w16se="http://schemas.microsoft.com/office/word/2015/wordml/symex" xmlns:wpg="http://schemas.microsoft.com/office/word/2010/wordprocessingGroup" xmlns:wpi="http://schemas.microsoft.com/office/word/2010/wordprocessingInk" xmlns:wne="http://schemas.microsoft.com/office/word/2006/wordml" xmlns:wps="http://schemas.microsoft.com/office/word/2010/wordprocessingShape" mc:Ignorable="w14 w15 w16se w16cid w16 w16cex w16sdtdh w16sdtfl w16du wp14">
+  <w:abstractNum xmlns:w="http://schemas.openxmlformats.org/wordprocessingml/2006/main" w:abstractNumId="3">
+    <w:nsid w:val="50c0a9d9"/>
+    <w:multiLevelType xmlns:w="http://schemas.openxmlformats.org/wordprocessingml/2006/main" w:val="hybridMultilevel"/>
+    <w:lvl xmlns:w="http://schemas.openxmlformats.org/wordprocessingml/2006/main" w:ilvl="0">
+      <w:start w:val="1"/>
+      <w:numFmt w:val="bullet"/>
+      <w:lvlText w:val="-"/>
+      <w:lvlJc w:val="left"/>
+      <w:pPr>
+        <w:ind w:left="720" w:hanging="360"/>
+      </w:pPr>
+      <w:rPr>
+        <w:rFonts w:hint="default" w:ascii="Aptos" w:hAnsi="Aptos"/>
+      </w:rPr>
+    </w:lvl>
+    <w:lvl xmlns:w="http://schemas.openxmlformats.org/wordprocessingml/2006/main" w:ilvl="1">
+      <w:start w:val="1"/>
+      <w:numFmt w:val="bullet"/>
+      <w:lvlText w:val="o"/>
+      <w:lvlJc w:val="left"/>
+      <w:pPr>
+        <w:ind w:left="1440" w:hanging="360"/>
+      </w:pPr>
+      <w:rPr>
+        <w:rFonts w:hint="default" w:ascii="Courier New" w:hAnsi="Courier New"/>
+      </w:rPr>
+    </w:lvl>
+    <w:lvl xmlns:w="http://schemas.openxmlformats.org/wordprocessingml/2006/main" w:ilvl="2">
+      <w:start w:val="1"/>
+      <w:numFmt w:val="bullet"/>
+      <w:lvlText w:val=""/>
+      <w:lvlJc w:val="left"/>
+      <w:pPr>
+        <w:ind w:left="2160" w:hanging="360"/>
+      </w:pPr>
+      <w:rPr>
+        <w:rFonts w:hint="default" w:ascii="Wingdings" w:hAnsi="Wingdings"/>
+      </w:rPr>
+    </w:lvl>
+    <w:lvl xmlns:w="http://schemas.openxmlformats.org/wordprocessingml/2006/main" w:ilvl="3">
+      <w:start w:val="1"/>
+      <w:numFmt w:val="bullet"/>
+      <w:lvlText w:val=""/>
+      <w:lvlJc w:val="left"/>
+      <w:pPr>
+        <w:ind w:left="2880" w:hanging="360"/>
+      </w:pPr>
+      <w:rPr>
+        <w:rFonts w:hint="default" w:ascii="Symbol" w:hAnsi="Symbol"/>
+      </w:rPr>
+    </w:lvl>
+    <w:lvl xmlns:w="http://schemas.openxmlformats.org/wordprocessingml/2006/main" w:ilvl="4">
+      <w:start w:val="1"/>
+      <w:numFmt w:val="bullet"/>
+      <w:lvlText w:val="o"/>
+      <w:lvlJc w:val="left"/>
+      <w:pPr>
+        <w:ind w:left="3600" w:hanging="360"/>
+      </w:pPr>
+      <w:rPr>
+        <w:rFonts w:hint="default" w:ascii="Courier New" w:hAnsi="Courier New"/>
+      </w:rPr>
+    </w:lvl>
+    <w:lvl xmlns:w="http://schemas.openxmlformats.org/wordprocessingml/2006/main" w:ilvl="5">
+      <w:start w:val="1"/>
+      <w:numFmt w:val="bullet"/>
+      <w:lvlText w:val=""/>
+      <w:lvlJc w:val="left"/>
+      <w:pPr>
+        <w:ind w:left="4320" w:hanging="360"/>
+      </w:pPr>
+      <w:rPr>
+        <w:rFonts w:hint="default" w:ascii="Wingdings" w:hAnsi="Wingdings"/>
+      </w:rPr>
+    </w:lvl>
+    <w:lvl xmlns:w="http://schemas.openxmlformats.org/wordprocessingml/2006/main" w:ilvl="6">
+      <w:start w:val="1"/>
+      <w:numFmt w:val="bullet"/>
+      <w:lvlText w:val=""/>
+      <w:lvlJc w:val="left"/>
+      <w:pPr>
+        <w:ind w:left="5040" w:hanging="360"/>
+      </w:pPr>
+      <w:rPr>
+        <w:rFonts w:hint="default" w:ascii="Symbol" w:hAnsi="Symbol"/>
+      </w:rPr>
+    </w:lvl>
+    <w:lvl xmlns:w="http://schemas.openxmlformats.org/wordprocessingml/2006/main" w:ilvl="7">
+      <w:start w:val="1"/>
+      <w:numFmt w:val="bullet"/>
+      <w:lvlText w:val="o"/>
+      <w:lvlJc w:val="left"/>
+      <w:pPr>
+        <w:ind w:left="5760" w:hanging="360"/>
+      </w:pPr>
+      <w:rPr>
+        <w:rFonts w:hint="default" w:ascii="Courier New" w:hAnsi="Courier New"/>
+      </w:rPr>
+    </w:lvl>
+    <w:lvl xmlns:w="http://schemas.openxmlformats.org/wordprocessingml/2006/main" w:ilvl="8">
+      <w:start w:val="1"/>
+      <w:numFmt w:val="bullet"/>
+      <w:lvlText w:val=""/>
+      <w:lvlJc w:val="left"/>
+      <w:pPr>
+        <w:ind w:left="6480" w:hanging="360"/>
+      </w:pPr>
+      <w:rPr>
+        <w:rFonts w:hint="default" w:ascii="Wingdings" w:hAnsi="Wingdings"/>
+      </w:rPr>
+    </w:lvl>
+  </w:abstractNum>
   <w:abstractNum w:abstractNumId="0" w15:restartNumberingAfterBreak="0">
     <w:nsid w:val="1F04227C"/>
     <w:multiLevelType w:val="hybridMultilevel"/>
@@ -1670,7 +1842,7 @@
         <w:ind w:left="720" w:hanging="360"/>
       </w:pPr>
       <w:rPr>
-        <w:rFonts w:ascii="Symbol" w:hAnsi="Symbol" w:hint="default"/>
+        <w:rFonts w:hint="default" w:ascii="Symbol" w:hAnsi="Symbol"/>
       </w:rPr>
     </w:lvl>
     <w:lvl w:ilvl="1" w:tplc="08090003" w:tentative="1">
@@ -1682,7 +1854,7 @@
         <w:ind w:left="1440" w:hanging="360"/>
       </w:pPr>
       <w:rPr>
-        <w:rFonts w:ascii="Courier New" w:hAnsi="Courier New" w:cs="Courier New" w:hint="default"/>
+        <w:rFonts w:hint="default" w:ascii="Courier New" w:hAnsi="Courier New" w:cs="Courier New"/>
       </w:rPr>
     </w:lvl>
     <w:lvl w:ilvl="2" w:tplc="08090005" w:tentative="1">
@@ -1694,7 +1866,7 @@
         <w:ind w:left="2160" w:hanging="360"/>
       </w:pPr>
       <w:rPr>
-        <w:rFonts w:ascii="Wingdings" w:hAnsi="Wingdings" w:hint="default"/>
+        <w:rFonts w:hint="default" w:ascii="Wingdings" w:hAnsi="Wingdings"/>
       </w:rPr>
     </w:lvl>
     <w:lvl w:ilvl="3" w:tplc="08090001" w:tentative="1">
@@ -1706,7 +1878,7 @@
         <w:ind w:left="2880" w:hanging="360"/>
       </w:pPr>
       <w:rPr>
-        <w:rFonts w:ascii="Symbol" w:hAnsi="Symbol" w:hint="default"/>
+        <w:rFonts w:hint="default" w:ascii="Symbol" w:hAnsi="Symbol"/>
       </w:rPr>
     </w:lvl>
     <w:lvl w:ilvl="4" w:tplc="08090003" w:tentative="1">
@@ -1718,7 +1890,7 @@
         <w:ind w:left="3600" w:hanging="360"/>
       </w:pPr>
       <w:rPr>
-        <w:rFonts w:ascii="Courier New" w:hAnsi="Courier New" w:cs="Courier New" w:hint="default"/>
+        <w:rFonts w:hint="default" w:ascii="Courier New" w:hAnsi="Courier New" w:cs="Courier New"/>
       </w:rPr>
     </w:lvl>
     <w:lvl w:ilvl="5" w:tplc="08090005" w:tentative="1">
@@ -1730,7 +1902,7 @@
         <w:ind w:left="4320" w:hanging="360"/>
       </w:pPr>
       <w:rPr>
-        <w:rFonts w:ascii="Wingdings" w:hAnsi="Wingdings" w:hint="default"/>
+        <w:rFonts w:hint="default" w:ascii="Wingdings" w:hAnsi="Wingdings"/>
       </w:rPr>
     </w:lvl>
     <w:lvl w:ilvl="6" w:tplc="08090001" w:tentative="1">
@@ -1742,7 +1914,7 @@
         <w:ind w:left="5040" w:hanging="360"/>
       </w:pPr>
       <w:rPr>
-        <w:rFonts w:ascii="Symbol" w:hAnsi="Symbol" w:hint="default"/>
+        <w:rFonts w:hint="default" w:ascii="Symbol" w:hAnsi="Symbol"/>
       </w:rPr>
     </w:lvl>
     <w:lvl w:ilvl="7" w:tplc="08090003" w:tentative="1">
@@ -1754,7 +1926,7 @@
         <w:ind w:left="5760" w:hanging="360"/>
       </w:pPr>
       <w:rPr>
-        <w:rFonts w:ascii="Courier New" w:hAnsi="Courier New" w:cs="Courier New" w:hint="default"/>
+        <w:rFonts w:hint="default" w:ascii="Courier New" w:hAnsi="Courier New" w:cs="Courier New"/>
       </w:rPr>
     </w:lvl>
     <w:lvl w:ilvl="8" w:tplc="08090005" w:tentative="1">
@@ -1766,7 +1938,7 @@
         <w:ind w:left="6480" w:hanging="360"/>
       </w:pPr>
       <w:rPr>
-        <w:rFonts w:ascii="Wingdings" w:hAnsi="Wingdings" w:hint="default"/>
+        <w:rFonts w:hint="default" w:ascii="Wingdings" w:hAnsi="Wingdings"/>
       </w:rPr>
     </w:lvl>
   </w:abstractNum>
@@ -1869,7 +2041,7 @@
         <w:ind w:left="720" w:hanging="360"/>
       </w:pPr>
       <w:rPr>
-        <w:rFonts w:ascii="Symbol" w:hAnsi="Symbol" w:hint="default"/>
+        <w:rFonts w:hint="default" w:ascii="Symbol" w:hAnsi="Symbol"/>
       </w:rPr>
     </w:lvl>
     <w:lvl w:ilvl="1" w:tplc="B60C8304">
@@ -1881,7 +2053,7 @@
         <w:ind w:left="1440" w:hanging="360"/>
       </w:pPr>
       <w:rPr>
-        <w:rFonts w:ascii="Courier New" w:hAnsi="Courier New" w:hint="default"/>
+        <w:rFonts w:hint="default" w:ascii="Courier New" w:hAnsi="Courier New"/>
       </w:rPr>
     </w:lvl>
     <w:lvl w:ilvl="2" w:tplc="C11A739E">
@@ -1893,7 +2065,7 @@
         <w:ind w:left="2160" w:hanging="360"/>
       </w:pPr>
       <w:rPr>
-        <w:rFonts w:ascii="Wingdings" w:hAnsi="Wingdings" w:hint="default"/>
+        <w:rFonts w:hint="default" w:ascii="Wingdings" w:hAnsi="Wingdings"/>
       </w:rPr>
     </w:lvl>
     <w:lvl w:ilvl="3" w:tplc="E3E69396">
@@ -1905,7 +2077,7 @@
         <w:ind w:left="2880" w:hanging="360"/>
       </w:pPr>
       <w:rPr>
-        <w:rFonts w:ascii="Symbol" w:hAnsi="Symbol" w:hint="default"/>
+        <w:rFonts w:hint="default" w:ascii="Symbol" w:hAnsi="Symbol"/>
       </w:rPr>
     </w:lvl>
     <w:lvl w:ilvl="4" w:tplc="4F946910">
@@ -1917,7 +2089,7 @@
         <w:ind w:left="3600" w:hanging="360"/>
       </w:pPr>
       <w:rPr>
-        <w:rFonts w:ascii="Courier New" w:hAnsi="Courier New" w:hint="default"/>
+        <w:rFonts w:hint="default" w:ascii="Courier New" w:hAnsi="Courier New"/>
       </w:rPr>
     </w:lvl>
     <w:lvl w:ilvl="5" w:tplc="23364462">
@@ -1929,7 +2101,7 @@
         <w:ind w:left="4320" w:hanging="360"/>
       </w:pPr>
       <w:rPr>
-        <w:rFonts w:ascii="Wingdings" w:hAnsi="Wingdings" w:hint="default"/>
+        <w:rFonts w:hint="default" w:ascii="Wingdings" w:hAnsi="Wingdings"/>
       </w:rPr>
     </w:lvl>
     <w:lvl w:ilvl="6" w:tplc="BCCEB26E">
@@ -1941,7 +2113,7 @@
         <w:ind w:left="5040" w:hanging="360"/>
       </w:pPr>
       <w:rPr>
-        <w:rFonts w:ascii="Symbol" w:hAnsi="Symbol" w:hint="default"/>
+        <w:rFonts w:hint="default" w:ascii="Symbol" w:hAnsi="Symbol"/>
       </w:rPr>
     </w:lvl>
     <w:lvl w:ilvl="7" w:tplc="C6206264">
@@ -1953,7 +2125,7 @@
         <w:ind w:left="5760" w:hanging="360"/>
       </w:pPr>
       <w:rPr>
-        <w:rFonts w:ascii="Courier New" w:hAnsi="Courier New" w:hint="default"/>
+        <w:rFonts w:hint="default" w:ascii="Courier New" w:hAnsi="Courier New"/>
       </w:rPr>
     </w:lvl>
     <w:lvl w:ilvl="8" w:tplc="26423764">
@@ -1965,10 +2137,13 @@
         <w:ind w:left="6480" w:hanging="360"/>
       </w:pPr>
       <w:rPr>
-        <w:rFonts w:ascii="Wingdings" w:hAnsi="Wingdings" w:hint="default"/>
+        <w:rFonts w:hint="default" w:ascii="Wingdings" w:hAnsi="Wingdings"/>
       </w:rPr>
     </w:lvl>
   </w:abstractNum>
+  <w:num w:numId="4">
+    <w:abstractNumId w:val="3"/>
+  </w:num>
   <w:num w:numId="1" w16cid:durableId="1572232302">
     <w:abstractNumId w:val="0"/>
   </w:num>
@@ -1986,7 +2161,7 @@
   <w:docDefaults>
     <w:rPrDefault>
       <w:rPr>
-        <w:rFonts w:asciiTheme="minorHAnsi" w:eastAsiaTheme="minorHAnsi" w:hAnsiTheme="minorHAnsi" w:cstheme="minorBidi"/>
+        <w:rFonts w:asciiTheme="minorHAnsi" w:hAnsiTheme="minorHAnsi" w:eastAsiaTheme="minorHAnsi" w:cstheme="minorBidi"/>
         <w:kern w:val="2"/>
         <w:sz w:val="22"/>
         <w:szCs w:val="22"/>
@@ -2003,14 +2178,14 @@
   <w:latentStyles w:defLockedState="0" w:defUIPriority="99" w:defSemiHidden="0" w:defUnhideWhenUsed="0" w:defQFormat="0" w:count="376">
     <w:lsdException w:name="Normal" w:uiPriority="0" w:qFormat="1"/>
     <w:lsdException w:name="heading 1" w:uiPriority="9" w:qFormat="1"/>
-    <w:lsdException w:name="heading 2" w:semiHidden="1" w:uiPriority="9" w:unhideWhenUsed="1" w:qFormat="1"/>
-    <w:lsdException w:name="heading 3" w:semiHidden="1" w:uiPriority="9" w:unhideWhenUsed="1" w:qFormat="1"/>
-    <w:lsdException w:name="heading 4" w:semiHidden="1" w:uiPriority="9" w:unhideWhenUsed="1" w:qFormat="1"/>
-    <w:lsdException w:name="heading 5" w:semiHidden="1" w:uiPriority="9" w:unhideWhenUsed="1" w:qFormat="1"/>
-    <w:lsdException w:name="heading 6" w:semiHidden="1" w:uiPriority="9" w:unhideWhenUsed="1" w:qFormat="1"/>
-    <w:lsdException w:name="heading 7" w:semiHidden="1" w:uiPriority="9" w:unhideWhenUsed="1" w:qFormat="1"/>
-    <w:lsdException w:name="heading 8" w:semiHidden="1" w:uiPriority="9" w:unhideWhenUsed="1" w:qFormat="1"/>
-    <w:lsdException w:name="heading 9" w:semiHidden="1" w:uiPriority="9" w:unhideWhenUsed="1" w:qFormat="1"/>
+    <w:lsdException w:name="heading 2" w:uiPriority="9" w:semiHidden="1" w:unhideWhenUsed="1" w:qFormat="1"/>
+    <w:lsdException w:name="heading 3" w:uiPriority="9" w:semiHidden="1" w:unhideWhenUsed="1" w:qFormat="1"/>
+    <w:lsdException w:name="heading 4" w:uiPriority="9" w:semiHidden="1" w:unhideWhenUsed="1" w:qFormat="1"/>
+    <w:lsdException w:name="heading 5" w:uiPriority="9" w:semiHidden="1" w:unhideWhenUsed="1" w:qFormat="1"/>
+    <w:lsdException w:name="heading 6" w:uiPriority="9" w:semiHidden="1" w:unhideWhenUsed="1" w:qFormat="1"/>
+    <w:lsdException w:name="heading 7" w:uiPriority="9" w:semiHidden="1" w:unhideWhenUsed="1" w:qFormat="1"/>
+    <w:lsdException w:name="heading 8" w:uiPriority="9" w:semiHidden="1" w:unhideWhenUsed="1" w:qFormat="1"/>
+    <w:lsdException w:name="heading 9" w:uiPriority="9" w:semiHidden="1" w:unhideWhenUsed="1" w:qFormat="1"/>
     <w:lsdException w:name="index 1" w:semiHidden="1" w:unhideWhenUsed="1"/>
     <w:lsdException w:name="index 2" w:semiHidden="1" w:unhideWhenUsed="1"/>
     <w:lsdException w:name="index 3" w:semiHidden="1" w:unhideWhenUsed="1"/>
@@ -2020,22 +2195,22 @@
     <w:lsdException w:name="index 7" w:semiHidden="1" w:unhideWhenUsed="1"/>
     <w:lsdException w:name="index 8" w:semiHidden="1" w:unhideWhenUsed="1"/>
     <w:lsdException w:name="index 9" w:semiHidden="1" w:unhideWhenUsed="1"/>
-    <w:lsdException w:name="toc 1" w:semiHidden="1" w:uiPriority="39" w:unhideWhenUsed="1"/>
-    <w:lsdException w:name="toc 2" w:semiHidden="1" w:uiPriority="39" w:unhideWhenUsed="1"/>
-    <w:lsdException w:name="toc 3" w:semiHidden="1" w:uiPriority="39" w:unhideWhenUsed="1"/>
-    <w:lsdException w:name="toc 4" w:semiHidden="1" w:uiPriority="39" w:unhideWhenUsed="1"/>
-    <w:lsdException w:name="toc 5" w:semiHidden="1" w:uiPriority="39" w:unhideWhenUsed="1"/>
-    <w:lsdException w:name="toc 6" w:semiHidden="1" w:uiPriority="39" w:unhideWhenUsed="1"/>
-    <w:lsdException w:name="toc 7" w:semiHidden="1" w:uiPriority="39" w:unhideWhenUsed="1"/>
-    <w:lsdException w:name="toc 8" w:semiHidden="1" w:uiPriority="39" w:unhideWhenUsed="1"/>
-    <w:lsdException w:name="toc 9" w:semiHidden="1" w:uiPriority="39" w:unhideWhenUsed="1"/>
+    <w:lsdException w:name="toc 1" w:uiPriority="39" w:semiHidden="1" w:unhideWhenUsed="1"/>
+    <w:lsdException w:name="toc 2" w:uiPriority="39" w:semiHidden="1" w:unhideWhenUsed="1"/>
+    <w:lsdException w:name="toc 3" w:uiPriority="39" w:semiHidden="1" w:unhideWhenUsed="1"/>
+    <w:lsdException w:name="toc 4" w:uiPriority="39" w:semiHidden="1" w:unhideWhenUsed="1"/>
+    <w:lsdException w:name="toc 5" w:uiPriority="39" w:semiHidden="1" w:unhideWhenUsed="1"/>
+    <w:lsdException w:name="toc 6" w:uiPriority="39" w:semiHidden="1" w:unhideWhenUsed="1"/>
+    <w:lsdException w:name="toc 7" w:uiPriority="39" w:semiHidden="1" w:unhideWhenUsed="1"/>
+    <w:lsdException w:name="toc 8" w:uiPriority="39" w:semiHidden="1" w:unhideWhenUsed="1"/>
+    <w:lsdException w:name="toc 9" w:uiPriority="39" w:semiHidden="1" w:unhideWhenUsed="1"/>
     <w:lsdException w:name="Normal Indent" w:semiHidden="1" w:unhideWhenUsed="1"/>
     <w:lsdException w:name="footnote text" w:semiHidden="1" w:unhideWhenUsed="1"/>
     <w:lsdException w:name="annotation text" w:semiHidden="1" w:unhideWhenUsed="1"/>
     <w:lsdException w:name="header" w:semiHidden="1" w:unhideWhenUsed="1"/>
     <w:lsdException w:name="footer" w:semiHidden="1" w:unhideWhenUsed="1"/>
     <w:lsdException w:name="index heading" w:semiHidden="1" w:unhideWhenUsed="1"/>
-    <w:lsdException w:name="caption" w:semiHidden="1" w:uiPriority="35" w:unhideWhenUsed="1" w:qFormat="1"/>
+    <w:lsdException w:name="caption" w:uiPriority="35" w:semiHidden="1" w:unhideWhenUsed="1" w:qFormat="1"/>
     <w:lsdException w:name="table of figures" w:semiHidden="1" w:unhideWhenUsed="1"/>
     <w:lsdException w:name="envelope address" w:semiHidden="1" w:unhideWhenUsed="1"/>
     <w:lsdException w:name="envelope return" w:semiHidden="1" w:unhideWhenUsed="1"/>
@@ -2066,7 +2241,7 @@
     <w:lsdException w:name="Title" w:uiPriority="10" w:qFormat="1"/>
     <w:lsdException w:name="Closing" w:semiHidden="1" w:unhideWhenUsed="1"/>
     <w:lsdException w:name="Signature" w:semiHidden="1" w:unhideWhenUsed="1"/>
-    <w:lsdException w:name="Default Paragraph Font" w:semiHidden="1" w:uiPriority="1" w:unhideWhenUsed="1"/>
+    <w:lsdException w:name="Default Paragraph Font" w:uiPriority="1" w:semiHidden="1" w:unhideWhenUsed="1"/>
     <w:lsdException w:name="Body Text" w:semiHidden="1" w:unhideWhenUsed="1"/>
     <w:lsdException w:name="Body Text Indent" w:semiHidden="1" w:unhideWhenUsed="1"/>
     <w:lsdException w:name="List Continue" w:semiHidden="1" w:unhideWhenUsed="1"/>
@@ -2266,8 +2441,8 @@
     <w:lsdException w:name="Subtle Reference" w:uiPriority="31" w:qFormat="1"/>
     <w:lsdException w:name="Intense Reference" w:uiPriority="32" w:qFormat="1"/>
     <w:lsdException w:name="Book Title" w:uiPriority="33" w:qFormat="1"/>
-    <w:lsdException w:name="Bibliography" w:semiHidden="1" w:uiPriority="37" w:unhideWhenUsed="1"/>
-    <w:lsdException w:name="TOC Heading" w:semiHidden="1" w:uiPriority="39" w:unhideWhenUsed="1" w:qFormat="1"/>
+    <w:lsdException w:name="Bibliography" w:uiPriority="37" w:semiHidden="1" w:unhideWhenUsed="1"/>
+    <w:lsdException w:name="TOC Heading" w:uiPriority="39" w:semiHidden="1" w:unhideWhenUsed="1" w:qFormat="1"/>
     <w:lsdException w:name="Plain Table 1" w:uiPriority="41"/>
     <w:lsdException w:name="Plain Table 2" w:uiPriority="42"/>
     <w:lsdException w:name="Plain Table 3" w:uiPriority="43"/>
@@ -2378,7 +2553,7 @@
     <w:lsdException w:name="Unresolved Mention" w:semiHidden="1" w:unhideWhenUsed="1"/>
     <w:lsdException w:name="Smart Link" w:semiHidden="1" w:unhideWhenUsed="1"/>
   </w:latentStyles>
-  <w:style w:type="paragraph" w:default="1" w:styleId="Normal">
+  <w:style w:type="paragraph" w:styleId="Normal" w:default="1">
     <w:name w:val="Normal"/>
     <w:qFormat/>
   </w:style>
@@ -2397,7 +2572,7 @@
       <w:outlineLvl w:val="0"/>
     </w:pPr>
     <w:rPr>
-      <w:rFonts w:asciiTheme="majorHAnsi" w:eastAsiaTheme="majorEastAsia" w:hAnsiTheme="majorHAnsi" w:cstheme="majorBidi"/>
+      <w:rFonts w:asciiTheme="majorHAnsi" w:hAnsiTheme="majorHAnsi" w:eastAsiaTheme="majorEastAsia" w:cstheme="majorBidi"/>
       <w:color w:val="0F4761" w:themeColor="accent1" w:themeShade="BF"/>
       <w:sz w:val="40"/>
       <w:szCs w:val="40"/>
@@ -2419,7 +2594,7 @@
       <w:outlineLvl w:val="1"/>
     </w:pPr>
     <w:rPr>
-      <w:rFonts w:asciiTheme="majorHAnsi" w:eastAsiaTheme="majorEastAsia" w:hAnsiTheme="majorHAnsi" w:cstheme="majorBidi"/>
+      <w:rFonts w:asciiTheme="majorHAnsi" w:hAnsiTheme="majorHAnsi" w:eastAsiaTheme="majorEastAsia" w:cstheme="majorBidi"/>
       <w:color w:val="0F4761" w:themeColor="accent1" w:themeShade="BF"/>
       <w:sz w:val="32"/>
       <w:szCs w:val="32"/>
@@ -2579,13 +2754,13 @@
       <w:color w:val="272727" w:themeColor="text1" w:themeTint="D8"/>
     </w:rPr>
   </w:style>
-  <w:style w:type="character" w:default="1" w:styleId="DefaultParagraphFont">
+  <w:style w:type="character" w:styleId="DefaultParagraphFont" w:default="1">
     <w:name w:val="Default Paragraph Font"/>
     <w:uiPriority w:val="1"/>
     <w:semiHidden/>
     <w:unhideWhenUsed/>
   </w:style>
-  <w:style w:type="table" w:default="1" w:styleId="TableNormal">
+  <w:style w:type="table" w:styleId="TableNormal" w:default="1">
     <w:name w:val="Normal Table"/>
     <w:uiPriority w:val="99"/>
     <w:semiHidden/>
@@ -2600,39 +2775,39 @@
       </w:tblCellMar>
     </w:tblPr>
   </w:style>
-  <w:style w:type="numbering" w:default="1" w:styleId="NoList">
+  <w:style w:type="numbering" w:styleId="NoList" w:default="1">
     <w:name w:val="No List"/>
     <w:uiPriority w:val="99"/>
     <w:semiHidden/>
     <w:unhideWhenUsed/>
   </w:style>
-  <w:style w:type="character" w:customStyle="1" w:styleId="Heading1Char">
+  <w:style w:type="character" w:styleId="Heading1Char" w:customStyle="1">
     <w:name w:val="Heading 1 Char"/>
     <w:basedOn w:val="DefaultParagraphFont"/>
     <w:link w:val="Heading1"/>
     <w:uiPriority w:val="9"/>
     <w:rsid w:val="00B129F4"/>
     <w:rPr>
-      <w:rFonts w:asciiTheme="majorHAnsi" w:eastAsiaTheme="majorEastAsia" w:hAnsiTheme="majorHAnsi" w:cstheme="majorBidi"/>
+      <w:rFonts w:asciiTheme="majorHAnsi" w:hAnsiTheme="majorHAnsi" w:eastAsiaTheme="majorEastAsia" w:cstheme="majorBidi"/>
       <w:color w:val="0F4761" w:themeColor="accent1" w:themeShade="BF"/>
       <w:sz w:val="40"/>
       <w:szCs w:val="40"/>
     </w:rPr>
   </w:style>
-  <w:style w:type="character" w:customStyle="1" w:styleId="Heading2Char">
+  <w:style w:type="character" w:styleId="Heading2Char" w:customStyle="1">
     <w:name w:val="Heading 2 Char"/>
     <w:basedOn w:val="DefaultParagraphFont"/>
     <w:link w:val="Heading2"/>
     <w:uiPriority w:val="9"/>
     <w:rsid w:val="00B129F4"/>
     <w:rPr>
-      <w:rFonts w:asciiTheme="majorHAnsi" w:eastAsiaTheme="majorEastAsia" w:hAnsiTheme="majorHAnsi" w:cstheme="majorBidi"/>
+      <w:rFonts w:asciiTheme="majorHAnsi" w:hAnsiTheme="majorHAnsi" w:eastAsiaTheme="majorEastAsia" w:cstheme="majorBidi"/>
       <w:color w:val="0F4761" w:themeColor="accent1" w:themeShade="BF"/>
       <w:sz w:val="32"/>
       <w:szCs w:val="32"/>
     </w:rPr>
   </w:style>
-  <w:style w:type="character" w:customStyle="1" w:styleId="Heading3Char">
+  <w:style w:type="character" w:styleId="Heading3Char" w:customStyle="1">
     <w:name w:val="Heading 3 Char"/>
     <w:basedOn w:val="DefaultParagraphFont"/>
     <w:link w:val="Heading3"/>
@@ -2645,7 +2820,7 @@
       <w:szCs w:val="28"/>
     </w:rPr>
   </w:style>
-  <w:style w:type="character" w:customStyle="1" w:styleId="Heading4Char">
+  <w:style w:type="character" w:styleId="Heading4Char" w:customStyle="1">
     <w:name w:val="Heading 4 Char"/>
     <w:basedOn w:val="DefaultParagraphFont"/>
     <w:link w:val="Heading4"/>
@@ -2659,7 +2834,7 @@
       <w:color w:val="0F4761" w:themeColor="accent1" w:themeShade="BF"/>
     </w:rPr>
   </w:style>
-  <w:style w:type="character" w:customStyle="1" w:styleId="Heading5Char">
+  <w:style w:type="character" w:styleId="Heading5Char" w:customStyle="1">
     <w:name w:val="Heading 5 Char"/>
     <w:basedOn w:val="DefaultParagraphFont"/>
     <w:link w:val="Heading5"/>
@@ -2671,7 +2846,7 @@
       <w:color w:val="0F4761" w:themeColor="accent1" w:themeShade="BF"/>
     </w:rPr>
   </w:style>
-  <w:style w:type="character" w:customStyle="1" w:styleId="Heading6Char">
+  <w:style w:type="character" w:styleId="Heading6Char" w:customStyle="1">
     <w:name w:val="Heading 6 Char"/>
     <w:basedOn w:val="DefaultParagraphFont"/>
     <w:link w:val="Heading6"/>
@@ -2685,7 +2860,7 @@
       <w:color w:val="595959" w:themeColor="text1" w:themeTint="A6"/>
     </w:rPr>
   </w:style>
-  <w:style w:type="character" w:customStyle="1" w:styleId="Heading7Char">
+  <w:style w:type="character" w:styleId="Heading7Char" w:customStyle="1">
     <w:name w:val="Heading 7 Char"/>
     <w:basedOn w:val="DefaultParagraphFont"/>
     <w:link w:val="Heading7"/>
@@ -2697,7 +2872,7 @@
       <w:color w:val="595959" w:themeColor="text1" w:themeTint="A6"/>
     </w:rPr>
   </w:style>
-  <w:style w:type="character" w:customStyle="1" w:styleId="Heading8Char">
+  <w:style w:type="character" w:styleId="Heading8Char" w:customStyle="1">
     <w:name w:val="Heading 8 Char"/>
     <w:basedOn w:val="DefaultParagraphFont"/>
     <w:link w:val="Heading8"/>
@@ -2711,7 +2886,7 @@
       <w:color w:val="272727" w:themeColor="text1" w:themeTint="D8"/>
     </w:rPr>
   </w:style>
-  <w:style w:type="character" w:customStyle="1" w:styleId="Heading9Char">
+  <w:style w:type="character" w:styleId="Heading9Char" w:customStyle="1">
     <w:name w:val="Heading 9 Char"/>
     <w:basedOn w:val="DefaultParagraphFont"/>
     <w:link w:val="Heading9"/>
@@ -2736,21 +2911,21 @@
       <w:contextualSpacing/>
     </w:pPr>
     <w:rPr>
-      <w:rFonts w:asciiTheme="majorHAnsi" w:eastAsiaTheme="majorEastAsia" w:hAnsiTheme="majorHAnsi" w:cstheme="majorBidi"/>
+      <w:rFonts w:asciiTheme="majorHAnsi" w:hAnsiTheme="majorHAnsi" w:eastAsiaTheme="majorEastAsia" w:cstheme="majorBidi"/>
       <w:spacing w:val="-10"/>
       <w:kern w:val="28"/>
       <w:sz w:val="56"/>
       <w:szCs w:val="56"/>
     </w:rPr>
   </w:style>
-  <w:style w:type="character" w:customStyle="1" w:styleId="TitleChar">
+  <w:style w:type="character" w:styleId="TitleChar" w:customStyle="1">
     <w:name w:val="Title Char"/>
     <w:basedOn w:val="DefaultParagraphFont"/>
     <w:link w:val="Title"/>
     <w:uiPriority w:val="10"/>
     <w:rsid w:val="00B129F4"/>
     <w:rPr>
-      <w:rFonts w:asciiTheme="majorHAnsi" w:eastAsiaTheme="majorEastAsia" w:hAnsiTheme="majorHAnsi" w:cstheme="majorBidi"/>
+      <w:rFonts w:asciiTheme="majorHAnsi" w:hAnsiTheme="majorHAnsi" w:eastAsiaTheme="majorEastAsia" w:cstheme="majorBidi"/>
       <w:spacing w:val="-10"/>
       <w:kern w:val="28"/>
       <w:sz w:val="56"/>
@@ -2778,7 +2953,7 @@
       <w:szCs w:val="28"/>
     </w:rPr>
   </w:style>
-  <w:style w:type="character" w:customStyle="1" w:styleId="SubtitleChar">
+  <w:style w:type="character" w:styleId="SubtitleChar" w:customStyle="1">
     <w:name w:val="Subtitle Char"/>
     <w:basedOn w:val="DefaultParagraphFont"/>
     <w:link w:val="Subtitle"/>
@@ -2810,7 +2985,7 @@
       <w:color w:val="404040" w:themeColor="text1" w:themeTint="BF"/>
     </w:rPr>
   </w:style>
-  <w:style w:type="character" w:customStyle="1" w:styleId="QuoteChar">
+  <w:style w:type="character" w:styleId="QuoteChar" w:customStyle="1">
     <w:name w:val="Quote Char"/>
     <w:basedOn w:val="DefaultParagraphFont"/>
     <w:link w:val="Quote"/>
@@ -2855,8 +3030,8 @@
     <w:rsid w:val="00B129F4"/>
     <w:pPr>
       <w:pBdr>
-        <w:top w:val="single" w:sz="4" w:space="10" w:color="0F4761" w:themeColor="accent1" w:themeShade="BF"/>
-        <w:bottom w:val="single" w:sz="4" w:space="10" w:color="0F4761" w:themeColor="accent1" w:themeShade="BF"/>
+        <w:top w:val="single" w:color="0F4761" w:themeColor="accent1" w:themeShade="BF" w:sz="4" w:space="10"/>
+        <w:bottom w:val="single" w:color="0F4761" w:themeColor="accent1" w:themeShade="BF" w:sz="4" w:space="10"/>
       </w:pBdr>
       <w:spacing w:before="360" w:after="360"/>
       <w:ind w:left="864" w:right="864"/>
@@ -2868,7 +3043,7 @@
       <w:color w:val="0F4761" w:themeColor="accent1" w:themeShade="BF"/>
     </w:rPr>
   </w:style>
-  <w:style w:type="character" w:customStyle="1" w:styleId="IntenseQuoteChar">
+  <w:style w:type="character" w:styleId="IntenseQuoteChar" w:customStyle="1">
     <w:name w:val="Intense Quote Char"/>
     <w:basedOn w:val="DefaultParagraphFont"/>
     <w:link w:val="IntenseQuote"/>
@@ -2909,7 +3084,7 @@
       <w:spacing w:after="0" w:line="240" w:lineRule="auto"/>
     </w:pPr>
   </w:style>
-  <w:style w:type="character" w:customStyle="1" w:styleId="HeaderChar">
+  <w:style w:type="character" w:styleId="HeaderChar" w:customStyle="1">
     <w:name w:val="Header Char"/>
     <w:basedOn w:val="DefaultParagraphFont"/>
     <w:link w:val="Header"/>
@@ -2931,7 +3106,7 @@
       <w:spacing w:after="0" w:line="240" w:lineRule="auto"/>
     </w:pPr>
   </w:style>
-  <w:style w:type="character" w:customStyle="1" w:styleId="FooterChar">
+  <w:style w:type="character" w:styleId="FooterChar" w:customStyle="1">
     <w:name w:val="Footer Char"/>
     <w:basedOn w:val="DefaultParagraphFont"/>
     <w:link w:val="Footer"/>
@@ -2950,12 +3125,12 @@
       <w:tblStyleRowBandSize w:val="1"/>
       <w:tblStyleColBandSize w:val="1"/>
       <w:tblBorders>
-        <w:top w:val="single" w:sz="4" w:space="0" w:color="999999" w:themeColor="text1" w:themeTint="66"/>
-        <w:left w:val="single" w:sz="4" w:space="0" w:color="999999" w:themeColor="text1" w:themeTint="66"/>
-        <w:bottom w:val="single" w:sz="4" w:space="0" w:color="999999" w:themeColor="text1" w:themeTint="66"/>
-        <w:right w:val="single" w:sz="4" w:space="0" w:color="999999" w:themeColor="text1" w:themeTint="66"/>
-        <w:insideH w:val="single" w:sz="4" w:space="0" w:color="999999" w:themeColor="text1" w:themeTint="66"/>
-        <w:insideV w:val="single" w:sz="4" w:space="0" w:color="999999" w:themeColor="text1" w:themeTint="66"/>
+        <w:top w:val="single" w:color="999999" w:themeColor="text1" w:themeTint="66" w:sz="4" w:space="0"/>
+        <w:left w:val="single" w:color="999999" w:themeColor="text1" w:themeTint="66" w:sz="4" w:space="0"/>
+        <w:bottom w:val="single" w:color="999999" w:themeColor="text1" w:themeTint="66" w:sz="4" w:space="0"/>
+        <w:right w:val="single" w:color="999999" w:themeColor="text1" w:themeTint="66" w:sz="4" w:space="0"/>
+        <w:insideH w:val="single" w:color="999999" w:themeColor="text1" w:themeTint="66" w:sz="4" w:space="0"/>
+        <w:insideV w:val="single" w:color="999999" w:themeColor="text1" w:themeTint="66" w:sz="4" w:space="0"/>
       </w:tblBorders>
     </w:tblPr>
     <w:tblStylePr w:type="firstRow">
@@ -2966,7 +3141,7 @@
       <w:tblPr/>
       <w:tcPr>
         <w:tcBorders>
-          <w:bottom w:val="single" w:sz="12" w:space="0" w:color="666666" w:themeColor="text1" w:themeTint="99"/>
+          <w:bottom w:val="single" w:color="666666" w:themeColor="text1" w:themeTint="99" w:sz="12" w:space="0"/>
         </w:tcBorders>
       </w:tcPr>
     </w:tblStylePr>
@@ -2978,7 +3153,7 @@
       <w:tblPr/>
       <w:tcPr>
         <w:tcBorders>
-          <w:top w:val="double" w:sz="2" w:space="0" w:color="666666" w:themeColor="text1" w:themeTint="99"/>
+          <w:top w:val="double" w:color="666666" w:themeColor="text1" w:themeTint="99" w:sz="2" w:space="0"/>
         </w:tcBorders>
       </w:tcPr>
     </w:tblStylePr>
@@ -3053,12 +3228,12 @@
     </w:rPr>
     <w:tblPr>
       <w:tblBorders>
-        <w:top w:val="single" w:sz="4" w:space="0" w:color="000000" w:themeColor="text1"/>
-        <w:left w:val="single" w:sz="4" w:space="0" w:color="000000" w:themeColor="text1"/>
-        <w:bottom w:val="single" w:sz="4" w:space="0" w:color="000000" w:themeColor="text1"/>
-        <w:right w:val="single" w:sz="4" w:space="0" w:color="000000" w:themeColor="text1"/>
-        <w:insideH w:val="single" w:sz="4" w:space="0" w:color="000000" w:themeColor="text1"/>
-        <w:insideV w:val="single" w:sz="4" w:space="0" w:color="000000" w:themeColor="text1"/>
+        <w:top w:val="single" w:color="000000" w:themeColor="text1" w:sz="4" w:space="0"/>
+        <w:left w:val="single" w:color="000000" w:themeColor="text1" w:sz="4" w:space="0"/>
+        <w:bottom w:val="single" w:color="000000" w:themeColor="text1" w:sz="4" w:space="0"/>
+        <w:right w:val="single" w:color="000000" w:themeColor="text1" w:sz="4" w:space="0"/>
+        <w:insideH w:val="single" w:color="000000" w:themeColor="text1" w:sz="4" w:space="0"/>
+        <w:insideV w:val="single" w:color="000000" w:themeColor="text1" w:sz="4" w:space="0"/>
       </w:tblBorders>
     </w:tblPr>
   </w:style>
@@ -3066,7 +3241,7 @@
 </file>
 
 <file path=word/theme/theme1.xml><?xml version="1.0" encoding="utf-8"?>
-<a:theme xmlns:a="http://schemas.openxmlformats.org/drawingml/2006/main" name="Office Theme">
+<a:theme xmlns:a="http://schemas.openxmlformats.org/drawingml/2006/main" xmlns:thm15="http://schemas.microsoft.com/office/thememl/2012/main" name="Office Theme">
   <a:themeElements>
     <a:clrScheme name="Office">
       <a:dk1>

</xml_diff>